<commit_message>
Raporun PDF sürümünü ekle
Co-Authored-By: Claude Opus 5.5 <noreply@anthropic.com>
Claude-Session: https://claude.ai/code/session_01NzVg54L4fp96hcTvwLWbKq
</commit_message>
<xml_diff>
--- a/lab-raporu/RAPOR.docx
+++ b/lab-raporu/RAPOR.docx
@@ -147,7 +147,7 @@
         <w:t xml:space="preserve">MAK 4097 – Ölçüm ve Analiz Laboratuvarı</w:t>
       </w:r>
       <w:r>
-        <w:t xml:space="preserve"> </w:t>
+        <w:br/>
       </w:r>
       <w:r>
         <w:rPr>
@@ -163,7 +163,7 @@
         <w:t xml:space="preserve">Dokuz Eylül Üniversitesi, Makina Mühendisliği</w:t>
       </w:r>
       <w:r>
-        <w:t xml:space="preserve"> </w:t>
+        <w:br/>
       </w:r>
       <w:r>
         <w:rPr>

</xml_diff>

<commit_message>
Debi hesaplarını adım adım genişlet, PDF'i güncelle
Co-Authored-By: Claude Opus 5.5 <noreply@anthropic.com>
Claude-Session: https://claude.ai/code/session_01NzVg54L4fp96hcTvwLWbKq
</commit_message>
<xml_diff>
--- a/lab-raporu/RAPOR.docx
+++ b/lab-raporu/RAPOR.docx
@@ -5029,7 +5029,7 @@
               <w:jc w:val="left"/>
             </w:pPr>
             <w:r>
-              <w:t xml:space="preserve">0,00819 kg/s (hesap)</w:t>
+              <w:t xml:space="preserve">0,00819 kg/s (hesap, bkz. 6.2)</w:t>
             </w:r>
           </w:p>
         </w:tc>
@@ -5074,7 +5074,7 @@
               <w:jc w:val="left"/>
             </w:pPr>
             <w:r>
-              <w:t xml:space="preserve">0,1884 kg/s (hesap)</w:t>
+              <w:t xml:space="preserve">0,1884 kg/s (hesap, bkz. 6.3)</w:t>
             </w:r>
           </w:p>
         </w:tc>
@@ -7116,13 +7116,49 @@
       </w:r>
     </w:p>
     <w:bookmarkEnd w:id="32"/>
-    <w:bookmarkStart w:id="33" w:name="hava-debisinin-hesabı"/>
+    <w:bookmarkStart w:id="33" w:name="Xef78abcac2e2db079dce3ff2891186fce4df034"/>
     <w:p>
       <w:pPr>
         <w:pStyle w:val="Heading3"/>
       </w:pPr>
       <w:r>
-        <w:t xml:space="preserve">6.2 Hava debisinin hesabı</w:t>
+        <w:t xml:space="preserve">6.2 Hava debisinin hesabı (Tablo 1’deki</w:t>
+      </w:r>
+      <w:r>
+        <w:t xml:space="preserve"> </w:t>
+      </w:r>
+      <m:oMath>
+        <m:sSub>
+          <m:e>
+            <m:acc>
+              <m:accPr>
+                <m:chr m:val="̇"/>
+              </m:accPr>
+              <m:e>
+                <m:r>
+                  <m:t>m</m:t>
+                </m:r>
+              </m:e>
+            </m:acc>
+          </m:e>
+          <m:sub>
+            <m:r>
+              <m:t>h</m:t>
+            </m:r>
+            <m:r>
+              <m:t>a</m:t>
+            </m:r>
+            <m:r>
+              <m:t>v</m:t>
+            </m:r>
+            <m:r>
+              <m:t>a</m:t>
+            </m:r>
+          </m:sub>
+        </m:sSub>
+      </m:oMath>
+      <w:r>
+        <w:t xml:space="preserve">)</w:t>
       </w:r>
     </w:p>
     <w:p>
@@ -7130,57 +7166,7 @@
         <w:pStyle w:val="FirstParagraph"/>
       </w:pPr>
       <w:r>
-        <w:t xml:space="preserve">Venturi giriş sıcaklığında (</w:t>
-      </w:r>
-      <m:oMath>
-        <m:r>
-          <m:t>76</m:t>
-        </m:r>
-        <m:r>
-          <m:rPr>
-            <m:sty m:val="p"/>
-          </m:rPr>
-          <m:t>,</m:t>
-        </m:r>
-        <m:r>
-          <m:t>5</m:t>
-        </m:r>
-        <m:r>
-          <m:t> </m:t>
-        </m:r>
-        <m:r>
-          <m:rPr>
-            <m:sty m:val="p"/>
-          </m:rPr>
-          <m:t>°</m:t>
-        </m:r>
-        <m:r>
-          <m:t>C</m:t>
-        </m:r>
-        <m:r>
-          <m:rPr>
-            <m:sty m:val="p"/>
-          </m:rPr>
-          <m:t>=</m:t>
-        </m:r>
-        <m:r>
-          <m:t>349</m:t>
-        </m:r>
-        <m:r>
-          <m:rPr>
-            <m:sty m:val="p"/>
-          </m:rPr>
-          <m:t>,</m:t>
-        </m:r>
-        <m:r>
-          <m:t>65</m:t>
-        </m:r>
-      </m:oMath>
-      <w:r>
-        <w:t xml:space="preserve"> </w:t>
-      </w:r>
-      <w:r>
-        <w:t xml:space="preserve">K) hava yoğunluğu ideal gaz bağıntısından bulunur:</w:t>
+        <w:t xml:space="preserve">Debiler, föyün 5. bölümündeki venturi bağıntısıyla hesaplanmıştır:</w:t>
       </w:r>
     </w:p>
     <w:p>
@@ -7195,21 +7181,12 @@
           <m:sSub>
             <m:e>
               <m:r>
-                <m:t>ρ</m:t>
+                <m:t>V</m:t>
               </m:r>
             </m:e>
             <m:sub>
               <m:r>
-                <m:t>h</m:t>
-              </m:r>
-              <m:r>
-                <m:t>a</m:t>
-              </m:r>
-              <m:r>
-                <m:t>v</m:t>
-              </m:r>
-              <m:r>
-                <m:t>a</m:t>
+                <m:t>B</m:t>
               </m:r>
             </m:sub>
           </m:sSub>
@@ -7219,311 +7196,18 @@
             </m:rPr>
             <m:t>=</m:t>
           </m:r>
-          <m:f>
-            <m:fPr>
-              <m:type m:val="bar"/>
-            </m:fPr>
-            <m:num>
-              <m:sSub>
-                <m:e>
-                  <m:r>
-                    <m:t>P</m:t>
-                  </m:r>
-                </m:e>
-                <m:sub>
-                  <m:r>
-                    <m:t>a</m:t>
-                  </m:r>
-                  <m:r>
-                    <m:t>t</m:t>
-                  </m:r>
-                  <m:r>
-                    <m:t>m</m:t>
-                  </m:r>
-                </m:sub>
-              </m:sSub>
-            </m:num>
-            <m:den>
-              <m:r>
-                <m:t>R</m:t>
-              </m:r>
-              <m:r>
-                <m:t> </m:t>
-              </m:r>
-              <m:r>
-                <m:t>T</m:t>
-              </m:r>
-            </m:den>
-          </m:f>
-          <m:r>
-            <m:rPr>
-              <m:sty m:val="p"/>
-            </m:rPr>
-            <m:t>=</m:t>
-          </m:r>
-          <m:f>
-            <m:fPr>
-              <m:type m:val="bar"/>
-            </m:fPr>
-            <m:num>
-              <m:r>
-                <m:t>101325</m:t>
-              </m:r>
-            </m:num>
-            <m:den>
-              <m:r>
-                <m:t>287</m:t>
-              </m:r>
-              <m:r>
-                <m:rPr>
-                  <m:sty m:val="p"/>
-                </m:rPr>
-                <m:t>×</m:t>
-              </m:r>
-              <m:r>
-                <m:t>349</m:t>
-              </m:r>
-              <m:r>
-                <m:rPr>
-                  <m:sty m:val="p"/>
-                </m:rPr>
-                <m:t>,</m:t>
-              </m:r>
-              <m:r>
-                <m:t>65</m:t>
-              </m:r>
-            </m:den>
-          </m:f>
-          <m:r>
-            <m:rPr>
-              <m:sty m:val="p"/>
-            </m:rPr>
-            <m:t>=</m:t>
-          </m:r>
-          <m:r>
-            <m:t>1</m:t>
-          </m:r>
-          <m:r>
-            <m:rPr>
-              <m:sty m:val="p"/>
-            </m:rPr>
-            <m:t>,</m:t>
-          </m:r>
-          <m:r>
-            <m:t>0097</m:t>
-          </m:r>
-          <m:r>
-            <m:t> </m:t>
-          </m:r>
-          <m:sSup>
-            <m:e>
-              <m:r>
-                <m:rPr>
-                  <m:nor/>
-                  <m:sty m:val="p"/>
-                </m:rPr>
-                <m:t>kg/m</m:t>
-              </m:r>
-            </m:e>
-            <m:sup>
-              <m:r>
-                <m:t>3</m:t>
-              </m:r>
-            </m:sup>
-          </m:sSup>
-        </m:oMath>
-      </m:oMathPara>
-    </w:p>
-    <w:p>
-      <w:pPr>
-        <w:pStyle w:val="FirstParagraph"/>
-      </w:pPr>
-      <w:r>
-        <w:t xml:space="preserve">Çap oranı:</w:t>
-      </w:r>
-    </w:p>
-    <w:p>
-      <w:pPr>
-        <w:pStyle w:val="BodyText"/>
-      </w:pPr>
-      <m:oMathPara>
-        <m:oMathParaPr>
-          <m:jc m:val="center"/>
-        </m:oMathParaPr>
-        <m:oMath>
-          <m:r>
-            <m:t>β</m:t>
-          </m:r>
-          <m:r>
-            <m:rPr>
-              <m:sty m:val="p"/>
-            </m:rPr>
-            <m:t>=</m:t>
-          </m:r>
-          <m:f>
-            <m:fPr>
-              <m:type m:val="bar"/>
-            </m:fPr>
-            <m:num>
-              <m:sSub>
-                <m:e>
-                  <m:r>
-                    <m:t>D</m:t>
-                  </m:r>
-                </m:e>
-                <m:sub>
-                  <m:r>
-                    <m:t>B</m:t>
-                  </m:r>
-                </m:sub>
-              </m:sSub>
-            </m:num>
-            <m:den>
-              <m:sSub>
-                <m:e>
-                  <m:r>
-                    <m:t>D</m:t>
-                  </m:r>
-                </m:e>
-                <m:sub>
-                  <m:r>
-                    <m:t>A</m:t>
-                  </m:r>
-                </m:sub>
-              </m:sSub>
-            </m:den>
-          </m:f>
-          <m:r>
-            <m:rPr>
-              <m:sty m:val="p"/>
-            </m:rPr>
-            <m:t>=</m:t>
-          </m:r>
-          <m:f>
-            <m:fPr>
-              <m:type m:val="bar"/>
-            </m:fPr>
-            <m:num>
-              <m:r>
-                <m:t>20</m:t>
-              </m:r>
-            </m:num>
-            <m:den>
-              <m:r>
-                <m:t>40</m:t>
-              </m:r>
-            </m:den>
-          </m:f>
-          <m:r>
-            <m:rPr>
-              <m:sty m:val="p"/>
-            </m:rPr>
-            <m:t>=</m:t>
-          </m:r>
-          <m:r>
-            <m:t>0</m:t>
-          </m:r>
-          <m:r>
-            <m:rPr>
-              <m:sty m:val="p"/>
-            </m:rPr>
-            <m:t>,</m:t>
-          </m:r>
-          <m:r>
-            <m:t>5</m:t>
-          </m:r>
-          <m:r>
-            <m:t> </m:t>
-          </m:r>
-          <m:r>
-            <m:rPr>
-              <m:sty m:val="p"/>
-            </m:rPr>
-            <m:t>⇒</m:t>
-          </m:r>
-          <m:r>
-            <m:t> </m:t>
-          </m:r>
-          <m:sSup>
-            <m:e>
-              <m:r>
-                <m:t>β</m:t>
-              </m:r>
-            </m:e>
-            <m:sup>
-              <m:r>
-                <m:t>4</m:t>
-              </m:r>
-            </m:sup>
-          </m:sSup>
-          <m:r>
-            <m:rPr>
-              <m:sty m:val="p"/>
-            </m:rPr>
-            <m:t>=</m:t>
-          </m:r>
-          <m:r>
-            <m:t>0</m:t>
-          </m:r>
-          <m:r>
-            <m:rPr>
-              <m:sty m:val="p"/>
-            </m:rPr>
-            <m:t>,</m:t>
-          </m:r>
-          <m:r>
-            <m:t>0625</m:t>
-          </m:r>
-        </m:oMath>
-      </m:oMathPara>
-    </w:p>
-    <w:p>
-      <w:pPr>
-        <w:pStyle w:val="FirstParagraph"/>
-      </w:pPr>
-      <w:r>
-        <w:t xml:space="preserve">Boğaz hızı, Denklem (5) ile:</w:t>
-      </w:r>
-    </w:p>
-    <w:p>
-      <w:pPr>
-        <w:pStyle w:val="BodyText"/>
-      </w:pPr>
-      <m:oMathPara>
-        <m:oMathParaPr>
-          <m:jc m:val="center"/>
-        </m:oMathParaPr>
-        <m:oMath>
           <m:sSub>
             <m:e>
               <m:r>
-                <m:t>V</m:t>
+                <m:t>C</m:t>
               </m:r>
             </m:e>
             <m:sub>
               <m:r>
-                <m:t>B</m:t>
+                <m:t>D</m:t>
               </m:r>
             </m:sub>
           </m:sSub>
-          <m:r>
-            <m:rPr>
-              <m:sty m:val="p"/>
-            </m:rPr>
-            <m:t>=</m:t>
-          </m:r>
-          <m:r>
-            <m:t>0</m:t>
-          </m:r>
-          <m:r>
-            <m:rPr>
-              <m:sty m:val="p"/>
-            </m:rPr>
-            <m:t>,</m:t>
-          </m:r>
-          <m:r>
-            <m:t>98</m:t>
-          </m:r>
           <m:rad>
             <m:radPr>
               <m:degHide m:val="on"/>
@@ -7539,42 +7223,21 @@
                     <m:t>2</m:t>
                   </m:r>
                   <m:r>
-                    <m:rPr>
-                      <m:sty m:val="p"/>
-                    </m:rPr>
-                    <m:t>×</m:t>
-                  </m:r>
-                  <m:r>
-                    <m:t>328</m:t>
-                  </m:r>
-                  <m:r>
-                    <m:rPr>
-                      <m:sty m:val="p"/>
-                    </m:rPr>
-                    <m:t>,</m:t>
-                  </m:r>
-                  <m:r>
-                    <m:t>7</m:t>
+                    <m:t> </m:t>
+                  </m:r>
+                  <m:r>
+                    <m:t>Δ</m:t>
+                  </m:r>
+                  <m:r>
+                    <m:t>p</m:t>
                   </m:r>
                 </m:num>
                 <m:den>
                   <m:r>
-                    <m:t>1</m:t>
-                  </m:r>
-                  <m:r>
-                    <m:rPr>
-                      <m:sty m:val="p"/>
-                    </m:rPr>
-                    <m:t>,</m:t>
-                  </m:r>
-                  <m:r>
-                    <m:t>0097</m:t>
-                  </m:r>
-                  <m:r>
-                    <m:rPr>
-                      <m:sty m:val="p"/>
-                    </m:rPr>
-                    <m:t>×</m:t>
+                    <m:t>ρ</m:t>
+                  </m:r>
+                  <m:r>
+                    <m:t> </m:t>
                   </m:r>
                   <m:d>
                     <m:dPr>
@@ -7593,18 +7256,18 @@
                         </m:rPr>
                         <m:t>−</m:t>
                       </m:r>
-                      <m:r>
-                        <m:t>0</m:t>
-                      </m:r>
-                      <m:r>
-                        <m:rPr>
-                          <m:sty m:val="p"/>
-                        </m:rPr>
-                        <m:t>,</m:t>
-                      </m:r>
-                      <m:r>
-                        <m:t>0625</m:t>
-                      </m:r>
+                      <m:sSup>
+                        <m:e>
+                          <m:r>
+                            <m:t>β</m:t>
+                          </m:r>
+                        </m:e>
+                        <m:sup>
+                          <m:r>
+                            <m:t>4</m:t>
+                          </m:r>
+                        </m:sup>
+                      </m:sSup>
                     </m:e>
                   </m:d>
                 </m:den>
@@ -7615,6 +7278,895 @@
             <m:rPr>
               <m:sty m:val="p"/>
             </m:rPr>
+            <m:t>,</m:t>
+          </m:r>
+          <m:r>
+            <m:t>  </m:t>
+          </m:r>
+          <m:r>
+            <m:t>β</m:t>
+          </m:r>
+          <m:r>
+            <m:rPr>
+              <m:sty m:val="p"/>
+            </m:rPr>
+            <m:t>=</m:t>
+          </m:r>
+          <m:f>
+            <m:fPr>
+              <m:type m:val="bar"/>
+            </m:fPr>
+            <m:num>
+              <m:sSub>
+                <m:e>
+                  <m:r>
+                    <m:t>D</m:t>
+                  </m:r>
+                </m:e>
+                <m:sub>
+                  <m:r>
+                    <m:t>B</m:t>
+                  </m:r>
+                </m:sub>
+              </m:sSub>
+            </m:num>
+            <m:den>
+              <m:sSub>
+                <m:e>
+                  <m:r>
+                    <m:t>D</m:t>
+                  </m:r>
+                </m:e>
+                <m:sub>
+                  <m:r>
+                    <m:t>A</m:t>
+                  </m:r>
+                </m:sub>
+              </m:sSub>
+            </m:den>
+          </m:f>
+          <m:r>
+            <m:rPr>
+              <m:sty m:val="p"/>
+            </m:rPr>
+            <m:t>,</m:t>
+          </m:r>
+          <m:r>
+            <m:t>  </m:t>
+          </m:r>
+          <m:sSub>
+            <m:e>
+              <m:r>
+                <m:t>A</m:t>
+              </m:r>
+            </m:e>
+            <m:sub>
+              <m:r>
+                <m:t>B</m:t>
+              </m:r>
+            </m:sub>
+          </m:sSub>
+          <m:r>
+            <m:rPr>
+              <m:sty m:val="p"/>
+            </m:rPr>
+            <m:t>=</m:t>
+          </m:r>
+          <m:f>
+            <m:fPr>
+              <m:type m:val="bar"/>
+            </m:fPr>
+            <m:num>
+              <m:r>
+                <m:t>π</m:t>
+              </m:r>
+              <m:sSubSup>
+                <m:e>
+                  <m:r>
+                    <m:t>D</m:t>
+                  </m:r>
+                </m:e>
+                <m:sub>
+                  <m:r>
+                    <m:t>B</m:t>
+                  </m:r>
+                </m:sub>
+                <m:sup>
+                  <m:r>
+                    <m:t>2</m:t>
+                  </m:r>
+                </m:sup>
+              </m:sSubSup>
+            </m:num>
+            <m:den>
+              <m:r>
+                <m:t>4</m:t>
+              </m:r>
+            </m:den>
+          </m:f>
+          <m:r>
+            <m:rPr>
+              <m:sty m:val="p"/>
+            </m:rPr>
+            <m:t>,</m:t>
+          </m:r>
+          <m:r>
+            <m:t>  </m:t>
+          </m:r>
+          <m:acc>
+            <m:accPr>
+              <m:chr m:val="̇"/>
+            </m:accPr>
+            <m:e>
+              <m:r>
+                <m:t>m</m:t>
+              </m:r>
+            </m:e>
+          </m:acc>
+          <m:r>
+            <m:rPr>
+              <m:sty m:val="p"/>
+            </m:rPr>
+            <m:t>=</m:t>
+          </m:r>
+          <m:r>
+            <m:t>ρ</m:t>
+          </m:r>
+          <m:r>
+            <m:t> </m:t>
+          </m:r>
+          <m:sSub>
+            <m:e>
+              <m:r>
+                <m:t>A</m:t>
+              </m:r>
+            </m:e>
+            <m:sub>
+              <m:r>
+                <m:t>B</m:t>
+              </m:r>
+            </m:sub>
+          </m:sSub>
+          <m:r>
+            <m:t> </m:t>
+          </m:r>
+          <m:sSub>
+            <m:e>
+              <m:r>
+                <m:t>V</m:t>
+              </m:r>
+            </m:e>
+            <m:sub>
+              <m:r>
+                <m:t>B</m:t>
+              </m:r>
+            </m:sub>
+          </m:sSub>
+        </m:oMath>
+      </m:oMathPara>
+    </w:p>
+    <w:p>
+      <w:pPr>
+        <w:pStyle w:val="FirstParagraph"/>
+      </w:pPr>
+      <w:r>
+        <w:rPr>
+          <w:bCs/>
+          <w:b/>
+        </w:rPr>
+        <w:t xml:space="preserve">Veriler:</w:t>
+      </w:r>
+      <w:r>
+        <w:t xml:space="preserve"> </w:t>
+      </w:r>
+      <m:oMath>
+        <m:r>
+          <m:t>Δ</m:t>
+        </m:r>
+        <m:sSub>
+          <m:e>
+            <m:r>
+              <m:t>p</m:t>
+            </m:r>
+          </m:e>
+          <m:sub>
+            <m:r>
+              <m:t>h</m:t>
+            </m:r>
+            <m:r>
+              <m:t>a</m:t>
+            </m:r>
+            <m:r>
+              <m:t>v</m:t>
+            </m:r>
+            <m:r>
+              <m:t>a</m:t>
+            </m:r>
+          </m:sub>
+        </m:sSub>
+        <m:r>
+          <m:rPr>
+            <m:sty m:val="p"/>
+          </m:rPr>
+          <m:t>=</m:t>
+        </m:r>
+        <m:r>
+          <m:t>328</m:t>
+        </m:r>
+        <m:r>
+          <m:rPr>
+            <m:sty m:val="p"/>
+          </m:rPr>
+          <m:t>,</m:t>
+        </m:r>
+        <m:r>
+          <m:t>7</m:t>
+        </m:r>
+      </m:oMath>
+      <w:r>
+        <w:t xml:space="preserve"> </w:t>
+      </w:r>
+      <w:r>
+        <w:t xml:space="preserve">Pa (elektronik ölçerden doğrudan Pa olarak okunduğu için birim çevirmeye gerek yok),</w:t>
+      </w:r>
+      <w:r>
+        <w:t xml:space="preserve"> </w:t>
+      </w:r>
+      <m:oMath>
+        <m:sSub>
+          <m:e>
+            <m:r>
+              <m:t>T</m:t>
+            </m:r>
+          </m:e>
+          <m:sub>
+            <m:r>
+              <m:t>h</m:t>
+            </m:r>
+            <m:r>
+              <m:t>a</m:t>
+            </m:r>
+            <m:r>
+              <m:t>v</m:t>
+            </m:r>
+            <m:r>
+              <m:t>a</m:t>
+            </m:r>
+            <m:r>
+              <m:rPr>
+                <m:sty m:val="p"/>
+              </m:rPr>
+              <m:t>,</m:t>
+            </m:r>
+            <m:r>
+              <m:t>g</m:t>
+            </m:r>
+            <m:r>
+              <m:t>i</m:t>
+            </m:r>
+            <m:r>
+              <m:t>r</m:t>
+            </m:r>
+            <m:r>
+              <m:t>i</m:t>
+            </m:r>
+            <m:r>
+              <m:t>ş</m:t>
+            </m:r>
+          </m:sub>
+        </m:sSub>
+        <m:r>
+          <m:rPr>
+            <m:sty m:val="p"/>
+          </m:rPr>
+          <m:t>=</m:t>
+        </m:r>
+        <m:r>
+          <m:t>76</m:t>
+        </m:r>
+        <m:r>
+          <m:rPr>
+            <m:sty m:val="p"/>
+          </m:rPr>
+          <m:t>,</m:t>
+        </m:r>
+        <m:r>
+          <m:t>5</m:t>
+        </m:r>
+      </m:oMath>
+      <w:r>
+        <w:t xml:space="preserve"> </w:t>
+      </w:r>
+      <w:r>
+        <w:t xml:space="preserve">°C,</w:t>
+      </w:r>
+      <w:r>
+        <w:t xml:space="preserve"> </w:t>
+      </w:r>
+      <m:oMath>
+        <m:sSub>
+          <m:e>
+            <m:r>
+              <m:t>C</m:t>
+            </m:r>
+          </m:e>
+          <m:sub>
+            <m:r>
+              <m:t>D</m:t>
+            </m:r>
+          </m:sub>
+        </m:sSub>
+        <m:r>
+          <m:rPr>
+            <m:sty m:val="p"/>
+          </m:rPr>
+          <m:t>=</m:t>
+        </m:r>
+        <m:r>
+          <m:t>0</m:t>
+        </m:r>
+        <m:r>
+          <m:rPr>
+            <m:sty m:val="p"/>
+          </m:rPr>
+          <m:t>,</m:t>
+        </m:r>
+        <m:r>
+          <m:t>98</m:t>
+        </m:r>
+      </m:oMath>
+      <w:r>
+        <w:t xml:space="preserve">. Hava venturisinin çapları için</w:t>
+      </w:r>
+      <w:r>
+        <w:t xml:space="preserve"> </w:t>
+      </w:r>
+      <m:oMath>
+        <m:sSub>
+          <m:e>
+            <m:r>
+              <m:t>D</m:t>
+            </m:r>
+          </m:e>
+          <m:sub>
+            <m:r>
+              <m:t>A</m:t>
+            </m:r>
+          </m:sub>
+        </m:sSub>
+        <m:r>
+          <m:rPr>
+            <m:sty m:val="p"/>
+          </m:rPr>
+          <m:t>=</m:t>
+        </m:r>
+        <m:r>
+          <m:t>40</m:t>
+        </m:r>
+      </m:oMath>
+      <w:r>
+        <w:t xml:space="preserve"> </w:t>
+      </w:r>
+      <w:r>
+        <w:t xml:space="preserve">mm ve</w:t>
+      </w:r>
+      <w:r>
+        <w:t xml:space="preserve"> </w:t>
+      </w:r>
+      <m:oMath>
+        <m:sSub>
+          <m:e>
+            <m:r>
+              <m:t>D</m:t>
+            </m:r>
+          </m:e>
+          <m:sub>
+            <m:r>
+              <m:t>B</m:t>
+            </m:r>
+          </m:sub>
+        </m:sSub>
+        <m:r>
+          <m:rPr>
+            <m:sty m:val="p"/>
+          </m:rPr>
+          <m:t>=</m:t>
+        </m:r>
+        <m:r>
+          <m:t>20</m:t>
+        </m:r>
+      </m:oMath>
+      <w:r>
+        <w:t xml:space="preserve"> </w:t>
+      </w:r>
+      <w:r>
+        <w:t xml:space="preserve">mm</w:t>
+      </w:r>
+      <w:r>
+        <w:t xml:space="preserve"> </w:t>
+      </w:r>
+      <w:r>
+        <w:rPr>
+          <w:bCs/>
+          <w:b/>
+        </w:rPr>
+        <w:t xml:space="preserve">kabul edilmiştir</w:t>
+      </w:r>
+      <w:r>
+        <w:t xml:space="preserve">; gerçek değerler föyün Şekil 1’inden alınmalıdır.</w:t>
+      </w:r>
+    </w:p>
+    <w:p>
+      <w:pPr>
+        <w:pStyle w:val="BodyText"/>
+      </w:pPr>
+      <w:r>
+        <w:rPr>
+          <w:bCs/>
+          <w:b/>
+        </w:rPr>
+        <w:t xml:space="preserve">a) Havanın yoğunluğu.</w:t>
+      </w:r>
+      <w:r>
+        <w:t xml:space="preserve"> </w:t>
+      </w:r>
+      <w:r>
+        <w:t xml:space="preserve">Föydeki nota göre venturi giriş sıcaklığında ve standart atmosfer basıncında, ideal gaz bağıntısıyla:</w:t>
+      </w:r>
+    </w:p>
+    <w:p>
+      <w:pPr>
+        <w:pStyle w:val="BodyText"/>
+      </w:pPr>
+      <m:oMathPara>
+        <m:oMathParaPr>
+          <m:jc m:val="center"/>
+        </m:oMathParaPr>
+        <m:oMath>
+          <m:sSub>
+            <m:e>
+              <m:r>
+                <m:t>ρ</m:t>
+              </m:r>
+            </m:e>
+            <m:sub>
+              <m:r>
+                <m:t>h</m:t>
+              </m:r>
+              <m:r>
+                <m:t>a</m:t>
+              </m:r>
+              <m:r>
+                <m:t>v</m:t>
+              </m:r>
+              <m:r>
+                <m:t>a</m:t>
+              </m:r>
+            </m:sub>
+          </m:sSub>
+          <m:r>
+            <m:rPr>
+              <m:sty m:val="p"/>
+            </m:rPr>
+            <m:t>=</m:t>
+          </m:r>
+          <m:f>
+            <m:fPr>
+              <m:type m:val="bar"/>
+            </m:fPr>
+            <m:num>
+              <m:sSub>
+                <m:e>
+                  <m:r>
+                    <m:t>P</m:t>
+                  </m:r>
+                </m:e>
+                <m:sub>
+                  <m:r>
+                    <m:t>a</m:t>
+                  </m:r>
+                  <m:r>
+                    <m:t>t</m:t>
+                  </m:r>
+                  <m:r>
+                    <m:t>m</m:t>
+                  </m:r>
+                </m:sub>
+              </m:sSub>
+            </m:num>
+            <m:den>
+              <m:r>
+                <m:t>R</m:t>
+              </m:r>
+              <m:r>
+                <m:t> </m:t>
+              </m:r>
+              <m:r>
+                <m:t>T</m:t>
+              </m:r>
+            </m:den>
+          </m:f>
+          <m:r>
+            <m:rPr>
+              <m:sty m:val="p"/>
+            </m:rPr>
+            <m:t>=</m:t>
+          </m:r>
+          <m:f>
+            <m:fPr>
+              <m:type m:val="bar"/>
+            </m:fPr>
+            <m:num>
+              <m:r>
+                <m:t>101325</m:t>
+              </m:r>
+            </m:num>
+            <m:den>
+              <m:r>
+                <m:t>287</m:t>
+              </m:r>
+              <m:r>
+                <m:rPr>
+                  <m:sty m:val="p"/>
+                </m:rPr>
+                <m:t>×</m:t>
+              </m:r>
+              <m:d>
+                <m:dPr>
+                  <m:begChr m:val="("/>
+                  <m:endChr m:val=")"/>
+                  <m:sepChr m:val=""/>
+                  <m:grow/>
+                </m:dPr>
+                <m:e>
+                  <m:r>
+                    <m:t>76</m:t>
+                  </m:r>
+                  <m:r>
+                    <m:rPr>
+                      <m:sty m:val="p"/>
+                    </m:rPr>
+                    <m:t>,</m:t>
+                  </m:r>
+                  <m:r>
+                    <m:t>5</m:t>
+                  </m:r>
+                  <m:r>
+                    <m:rPr>
+                      <m:sty m:val="p"/>
+                    </m:rPr>
+                    <m:t>+</m:t>
+                  </m:r>
+                  <m:r>
+                    <m:t>273</m:t>
+                  </m:r>
+                  <m:r>
+                    <m:rPr>
+                      <m:sty m:val="p"/>
+                    </m:rPr>
+                    <m:t>,</m:t>
+                  </m:r>
+                  <m:r>
+                    <m:t>15</m:t>
+                  </m:r>
+                </m:e>
+              </m:d>
+            </m:den>
+          </m:f>
+          <m:r>
+            <m:rPr>
+              <m:sty m:val="p"/>
+            </m:rPr>
+            <m:t>=</m:t>
+          </m:r>
+          <m:f>
+            <m:fPr>
+              <m:type m:val="bar"/>
+            </m:fPr>
+            <m:num>
+              <m:r>
+                <m:t>101325</m:t>
+              </m:r>
+            </m:num>
+            <m:den>
+              <m:r>
+                <m:t>287</m:t>
+              </m:r>
+              <m:r>
+                <m:rPr>
+                  <m:sty m:val="p"/>
+                </m:rPr>
+                <m:t>×</m:t>
+              </m:r>
+              <m:r>
+                <m:t>349</m:t>
+              </m:r>
+              <m:r>
+                <m:rPr>
+                  <m:sty m:val="p"/>
+                </m:rPr>
+                <m:t>,</m:t>
+              </m:r>
+              <m:r>
+                <m:t>65</m:t>
+              </m:r>
+            </m:den>
+          </m:f>
+          <m:r>
+            <m:rPr>
+              <m:sty m:val="p"/>
+            </m:rPr>
+            <m:t>=</m:t>
+          </m:r>
+          <m:r>
+            <m:t>1</m:t>
+          </m:r>
+          <m:r>
+            <m:rPr>
+              <m:sty m:val="p"/>
+            </m:rPr>
+            <m:t>,</m:t>
+          </m:r>
+          <m:r>
+            <m:t>0097</m:t>
+          </m:r>
+          <m:r>
+            <m:t> </m:t>
+          </m:r>
+          <m:sSup>
+            <m:e>
+              <m:r>
+                <m:rPr>
+                  <m:nor/>
+                  <m:sty m:val="p"/>
+                </m:rPr>
+                <m:t>kg/m</m:t>
+              </m:r>
+            </m:e>
+            <m:sup>
+              <m:r>
+                <m:t>3</m:t>
+              </m:r>
+            </m:sup>
+          </m:sSup>
+        </m:oMath>
+      </m:oMathPara>
+    </w:p>
+    <w:p>
+      <w:pPr>
+        <w:pStyle w:val="FirstParagraph"/>
+      </w:pPr>
+      <w:r>
+        <w:rPr>
+          <w:bCs/>
+          <w:b/>
+        </w:rPr>
+        <w:t xml:space="preserve">b) Çap oranı:</w:t>
+      </w:r>
+    </w:p>
+    <w:p>
+      <w:pPr>
+        <w:pStyle w:val="BodyText"/>
+      </w:pPr>
+      <m:oMathPara>
+        <m:oMathParaPr>
+          <m:jc m:val="center"/>
+        </m:oMathParaPr>
+        <m:oMath>
+          <m:r>
+            <m:t>β</m:t>
+          </m:r>
+          <m:r>
+            <m:rPr>
+              <m:sty m:val="p"/>
+            </m:rPr>
+            <m:t>=</m:t>
+          </m:r>
+          <m:f>
+            <m:fPr>
+              <m:type m:val="bar"/>
+            </m:fPr>
+            <m:num>
+              <m:sSub>
+                <m:e>
+                  <m:r>
+                    <m:t>D</m:t>
+                  </m:r>
+                </m:e>
+                <m:sub>
+                  <m:r>
+                    <m:t>B</m:t>
+                  </m:r>
+                </m:sub>
+              </m:sSub>
+            </m:num>
+            <m:den>
+              <m:sSub>
+                <m:e>
+                  <m:r>
+                    <m:t>D</m:t>
+                  </m:r>
+                </m:e>
+                <m:sub>
+                  <m:r>
+                    <m:t>A</m:t>
+                  </m:r>
+                </m:sub>
+              </m:sSub>
+            </m:den>
+          </m:f>
+          <m:r>
+            <m:rPr>
+              <m:sty m:val="p"/>
+            </m:rPr>
+            <m:t>=</m:t>
+          </m:r>
+          <m:f>
+            <m:fPr>
+              <m:type m:val="bar"/>
+            </m:fPr>
+            <m:num>
+              <m:r>
+                <m:t>20</m:t>
+              </m:r>
+            </m:num>
+            <m:den>
+              <m:r>
+                <m:t>40</m:t>
+              </m:r>
+            </m:den>
+          </m:f>
+          <m:r>
+            <m:rPr>
+              <m:sty m:val="p"/>
+            </m:rPr>
+            <m:t>=</m:t>
+          </m:r>
+          <m:r>
+            <m:t>0</m:t>
+          </m:r>
+          <m:r>
+            <m:rPr>
+              <m:sty m:val="p"/>
+            </m:rPr>
+            <m:t>,</m:t>
+          </m:r>
+          <m:r>
+            <m:t>5</m:t>
+          </m:r>
+          <m:r>
+            <m:t> </m:t>
+          </m:r>
+          <m:r>
+            <m:rPr>
+              <m:sty m:val="p"/>
+            </m:rPr>
+            <m:t>⇒</m:t>
+          </m:r>
+          <m:r>
+            <m:t> </m:t>
+          </m:r>
+          <m:sSup>
+            <m:e>
+              <m:r>
+                <m:t>β</m:t>
+              </m:r>
+            </m:e>
+            <m:sup>
+              <m:r>
+                <m:t>4</m:t>
+              </m:r>
+            </m:sup>
+          </m:sSup>
+          <m:r>
+            <m:rPr>
+              <m:sty m:val="p"/>
+            </m:rPr>
+            <m:t>=</m:t>
+          </m:r>
+          <m:r>
+            <m:t>0</m:t>
+          </m:r>
+          <m:r>
+            <m:rPr>
+              <m:sty m:val="p"/>
+            </m:rPr>
+            <m:t>,</m:t>
+          </m:r>
+          <m:r>
+            <m:t>0625</m:t>
+          </m:r>
+          <m:r>
+            <m:t> </m:t>
+          </m:r>
+          <m:r>
+            <m:rPr>
+              <m:sty m:val="p"/>
+            </m:rPr>
+            <m:t>⇒</m:t>
+          </m:r>
+          <m:r>
+            <m:t> </m:t>
+          </m:r>
+          <m:r>
+            <m:t>1</m:t>
+          </m:r>
+          <m:r>
+            <m:rPr>
+              <m:sty m:val="p"/>
+            </m:rPr>
+            <m:t>−</m:t>
+          </m:r>
+          <m:sSup>
+            <m:e>
+              <m:r>
+                <m:t>β</m:t>
+              </m:r>
+            </m:e>
+            <m:sup>
+              <m:r>
+                <m:t>4</m:t>
+              </m:r>
+            </m:sup>
+          </m:sSup>
+          <m:r>
+            <m:rPr>
+              <m:sty m:val="p"/>
+            </m:rPr>
+            <m:t>=</m:t>
+          </m:r>
+          <m:r>
+            <m:t>0</m:t>
+          </m:r>
+          <m:r>
+            <m:rPr>
+              <m:sty m:val="p"/>
+            </m:rPr>
+            <m:t>,</m:t>
+          </m:r>
+          <m:r>
+            <m:t>9375</m:t>
+          </m:r>
+        </m:oMath>
+      </m:oMathPara>
+    </w:p>
+    <w:p>
+      <w:pPr>
+        <w:pStyle w:val="FirstParagraph"/>
+      </w:pPr>
+      <w:r>
+        <w:rPr>
+          <w:bCs/>
+          <w:b/>
+        </w:rPr>
+        <w:t xml:space="preserve">c) Boğaz hızı:</w:t>
+      </w:r>
+    </w:p>
+    <w:p>
+      <w:pPr>
+        <w:pStyle w:val="BodyText"/>
+      </w:pPr>
+      <m:oMathPara>
+        <m:oMathParaPr>
+          <m:jc m:val="center"/>
+        </m:oMathParaPr>
+        <m:oMath>
+          <m:sSub>
+            <m:e>
+              <m:r>
+                <m:t>V</m:t>
+              </m:r>
+            </m:e>
+            <m:sub>
+              <m:r>
+                <m:t>B</m:t>
+              </m:r>
+            </m:sub>
+          </m:sSub>
+          <m:r>
+            <m:rPr>
+              <m:sty m:val="p"/>
+            </m:rPr>
             <m:t>=</m:t>
           </m:r>
           <m:r>
@@ -7635,6 +8187,151 @@
             </m:radPr>
             <m:deg/>
             <m:e>
+              <m:f>
+                <m:fPr>
+                  <m:type m:val="bar"/>
+                </m:fPr>
+                <m:num>
+                  <m:r>
+                    <m:t>2</m:t>
+                  </m:r>
+                  <m:r>
+                    <m:rPr>
+                      <m:sty m:val="p"/>
+                    </m:rPr>
+                    <m:t>×</m:t>
+                  </m:r>
+                  <m:r>
+                    <m:t>328</m:t>
+                  </m:r>
+                  <m:r>
+                    <m:rPr>
+                      <m:sty m:val="p"/>
+                    </m:rPr>
+                    <m:t>,</m:t>
+                  </m:r>
+                  <m:r>
+                    <m:t>7</m:t>
+                  </m:r>
+                </m:num>
+                <m:den>
+                  <m:r>
+                    <m:t>1</m:t>
+                  </m:r>
+                  <m:r>
+                    <m:rPr>
+                      <m:sty m:val="p"/>
+                    </m:rPr>
+                    <m:t>,</m:t>
+                  </m:r>
+                  <m:r>
+                    <m:t>0097</m:t>
+                  </m:r>
+                  <m:r>
+                    <m:rPr>
+                      <m:sty m:val="p"/>
+                    </m:rPr>
+                    <m:t>×</m:t>
+                  </m:r>
+                  <m:r>
+                    <m:t>0</m:t>
+                  </m:r>
+                  <m:r>
+                    <m:rPr>
+                      <m:sty m:val="p"/>
+                    </m:rPr>
+                    <m:t>,</m:t>
+                  </m:r>
+                  <m:r>
+                    <m:t>9375</m:t>
+                  </m:r>
+                </m:den>
+              </m:f>
+            </m:e>
+          </m:rad>
+          <m:r>
+            <m:rPr>
+              <m:sty m:val="p"/>
+            </m:rPr>
+            <m:t>=</m:t>
+          </m:r>
+          <m:r>
+            <m:t>0</m:t>
+          </m:r>
+          <m:r>
+            <m:rPr>
+              <m:sty m:val="p"/>
+            </m:rPr>
+            <m:t>,</m:t>
+          </m:r>
+          <m:r>
+            <m:t>98</m:t>
+          </m:r>
+          <m:rad>
+            <m:radPr>
+              <m:degHide m:val="on"/>
+            </m:radPr>
+            <m:deg/>
+            <m:e>
+              <m:f>
+                <m:fPr>
+                  <m:type m:val="bar"/>
+                </m:fPr>
+                <m:num>
+                  <m:r>
+                    <m:t>657</m:t>
+                  </m:r>
+                  <m:r>
+                    <m:rPr>
+                      <m:sty m:val="p"/>
+                    </m:rPr>
+                    <m:t>,</m:t>
+                  </m:r>
+                  <m:r>
+                    <m:t>4</m:t>
+                  </m:r>
+                </m:num>
+                <m:den>
+                  <m:r>
+                    <m:t>0</m:t>
+                  </m:r>
+                  <m:r>
+                    <m:rPr>
+                      <m:sty m:val="p"/>
+                    </m:rPr>
+                    <m:t>,</m:t>
+                  </m:r>
+                  <m:r>
+                    <m:t>9466</m:t>
+                  </m:r>
+                </m:den>
+              </m:f>
+            </m:e>
+          </m:rad>
+          <m:r>
+            <m:rPr>
+              <m:sty m:val="p"/>
+            </m:rPr>
+            <m:t>=</m:t>
+          </m:r>
+          <m:r>
+            <m:t>0</m:t>
+          </m:r>
+          <m:r>
+            <m:rPr>
+              <m:sty m:val="p"/>
+            </m:rPr>
+            <m:t>,</m:t>
+          </m:r>
+          <m:r>
+            <m:t>98</m:t>
+          </m:r>
+          <m:rad>
+            <m:radPr>
+              <m:degHide m:val="on"/>
+            </m:radPr>
+            <m:deg/>
+            <m:e>
               <m:r>
                 <m:t>694</m:t>
               </m:r>
@@ -7721,7 +8418,11 @@
         <w:pStyle w:val="FirstParagraph"/>
       </w:pPr>
       <w:r>
-        <w:t xml:space="preserve">Boğaz kesit alanı:</w:t>
+        <w:rPr>
+          <w:bCs/>
+          <w:b/>
+        </w:rPr>
+        <w:t xml:space="preserve">d) Boğaz kesit alanı:</w:t>
       </w:r>
     </w:p>
     <w:p>
@@ -7907,7 +8608,11 @@
         <w:pStyle w:val="FirstParagraph"/>
       </w:pPr>
       <w:r>
-        <w:t xml:space="preserve">Kütlesel debi:</w:t>
+        <w:rPr>
+          <w:bCs/>
+          <w:b/>
+        </w:rPr>
+        <w:t xml:space="preserve">e) Kütlesel debi:</w:t>
       </w:r>
     </w:p>
     <w:p>
@@ -7956,6 +8661,9 @@
           <m:r>
             <m:t>ρ</m:t>
           </m:r>
+          <m:r>
+            <m:t> </m:t>
+          </m:r>
           <m:sSub>
             <m:e>
               <m:r>
@@ -7968,6 +8676,9 @@
               </m:r>
             </m:sub>
           </m:sSub>
+          <m:r>
+            <m:t> </m:t>
+          </m:r>
           <m:sSub>
             <m:e>
               <m:r>
@@ -8146,13 +8857,43 @@
       </m:oMathPara>
     </w:p>
     <w:bookmarkEnd w:id="33"/>
-    <w:bookmarkStart w:id="34" w:name="su-debisinin-hesabı"/>
+    <w:bookmarkStart w:id="34" w:name="su-debisinin-hesabı-tablo-1deki-dot-m_su"/>
     <w:p>
       <w:pPr>
         <w:pStyle w:val="Heading3"/>
       </w:pPr>
       <w:r>
-        <w:t xml:space="preserve">6.3 Su debisinin hesabı</w:t>
+        <w:t xml:space="preserve">6.3 Su debisinin hesabı (Tablo 1’deki</w:t>
+      </w:r>
+      <w:r>
+        <w:t xml:space="preserve"> </w:t>
+      </w:r>
+      <m:oMath>
+        <m:sSub>
+          <m:e>
+            <m:acc>
+              <m:accPr>
+                <m:chr m:val="̇"/>
+              </m:accPr>
+              <m:e>
+                <m:r>
+                  <m:t>m</m:t>
+                </m:r>
+              </m:e>
+            </m:acc>
+          </m:e>
+          <m:sub>
+            <m:r>
+              <m:t>s</m:t>
+            </m:r>
+            <m:r>
+              <m:t>u</m:t>
+            </m:r>
+          </m:sub>
+        </m:sSub>
+      </m:oMath>
+      <w:r>
+        <w:t xml:space="preserve">)</w:t>
       </w:r>
     </w:p>
     <w:p>
@@ -8160,7 +8901,198 @@
         <w:pStyle w:val="FirstParagraph"/>
       </w:pPr>
       <w:r>
-        <w:t xml:space="preserve">Manometre okuması Pa’ya çevrilir (</w:t>
+        <w:rPr>
+          <w:bCs/>
+          <w:b/>
+        </w:rPr>
+        <w:t xml:space="preserve">Veriler:</w:t>
+      </w:r>
+      <w:r>
+        <w:t xml:space="preserve"> </w:t>
+      </w:r>
+      <m:oMath>
+        <m:r>
+          <m:t>Δ</m:t>
+        </m:r>
+        <m:sSub>
+          <m:e>
+            <m:r>
+              <m:t>p</m:t>
+            </m:r>
+          </m:e>
+          <m:sub>
+            <m:r>
+              <m:t>s</m:t>
+            </m:r>
+            <m:r>
+              <m:t>u</m:t>
+            </m:r>
+          </m:sub>
+        </m:sSub>
+        <m:r>
+          <m:rPr>
+            <m:sty m:val="p"/>
+          </m:rPr>
+          <m:t>=</m:t>
+        </m:r>
+        <m:r>
+          <m:t>40</m:t>
+        </m:r>
+      </m:oMath>
+      <w:r>
+        <w:t xml:space="preserve"> </w:t>
+      </w:r>
+      <w:r>
+        <w:t xml:space="preserve">mmSS,</w:t>
+      </w:r>
+      <w:r>
+        <w:t xml:space="preserve"> </w:t>
+      </w:r>
+      <m:oMath>
+        <m:sSub>
+          <m:e>
+            <m:r>
+              <m:t>D</m:t>
+            </m:r>
+          </m:e>
+          <m:sub>
+            <m:r>
+              <m:t>A</m:t>
+            </m:r>
+          </m:sub>
+        </m:sSub>
+        <m:r>
+          <m:rPr>
+            <m:sty m:val="p"/>
+          </m:rPr>
+          <m:t>=</m:t>
+        </m:r>
+        <m:r>
+          <m:t>26</m:t>
+        </m:r>
+      </m:oMath>
+      <w:r>
+        <w:t xml:space="preserve"> </w:t>
+      </w:r>
+      <w:r>
+        <w:t xml:space="preserve">mm,</w:t>
+      </w:r>
+      <w:r>
+        <w:t xml:space="preserve"> </w:t>
+      </w:r>
+      <m:oMath>
+        <m:sSub>
+          <m:e>
+            <m:r>
+              <m:t>D</m:t>
+            </m:r>
+          </m:e>
+          <m:sub>
+            <m:r>
+              <m:t>B</m:t>
+            </m:r>
+          </m:sub>
+        </m:sSub>
+        <m:r>
+          <m:rPr>
+            <m:sty m:val="p"/>
+          </m:rPr>
+          <m:t>=</m:t>
+        </m:r>
+        <m:r>
+          <m:t>16</m:t>
+        </m:r>
+      </m:oMath>
+      <w:r>
+        <w:t xml:space="preserve"> </w:t>
+      </w:r>
+      <w:r>
+        <w:t xml:space="preserve">mm,</w:t>
+      </w:r>
+      <w:r>
+        <w:t xml:space="preserve"> </w:t>
+      </w:r>
+      <m:oMath>
+        <m:sSub>
+          <m:e>
+            <m:r>
+              <m:t>C</m:t>
+            </m:r>
+          </m:e>
+          <m:sub>
+            <m:r>
+              <m:t>D</m:t>
+            </m:r>
+          </m:sub>
+        </m:sSub>
+        <m:r>
+          <m:rPr>
+            <m:sty m:val="p"/>
+          </m:rPr>
+          <m:t>=</m:t>
+        </m:r>
+        <m:r>
+          <m:t>0</m:t>
+        </m:r>
+        <m:r>
+          <m:rPr>
+            <m:sty m:val="p"/>
+          </m:rPr>
+          <m:t>,</m:t>
+        </m:r>
+        <m:r>
+          <m:t>98</m:t>
+        </m:r>
+      </m:oMath>
+      <w:r>
+        <w:t xml:space="preserve">. Suyun yoğunluğu giriş sıcaklığında (22,1 °C)</w:t>
+      </w:r>
+      <w:r>
+        <w:t xml:space="preserve"> </w:t>
+      </w:r>
+      <m:oMath>
+        <m:r>
+          <m:t>ρ</m:t>
+        </m:r>
+        <m:r>
+          <m:rPr>
+            <m:sty m:val="p"/>
+          </m:rPr>
+          <m:t>=</m:t>
+        </m:r>
+        <m:r>
+          <m:t>997</m:t>
+        </m:r>
+        <m:r>
+          <m:rPr>
+            <m:sty m:val="p"/>
+          </m:rPr>
+          <m:t>,</m:t>
+        </m:r>
+        <m:r>
+          <m:t>8</m:t>
+        </m:r>
+      </m:oMath>
+      <w:r>
+        <w:t xml:space="preserve"> </w:t>
+      </w:r>
+      <w:r>
+        <w:t xml:space="preserve">kg/m³ alınmıştır.</w:t>
+      </w:r>
+    </w:p>
+    <w:p>
+      <w:pPr>
+        <w:pStyle w:val="BodyText"/>
+      </w:pPr>
+      <w:r>
+        <w:rPr>
+          <w:bCs/>
+          <w:b/>
+        </w:rPr>
+        <w:t xml:space="preserve">a) Basınç farkının Pa’ya çevrilmesi.</w:t>
+      </w:r>
+      <w:r>
+        <w:t xml:space="preserve"> </w:t>
       </w:r>
       <m:oMath>
         <m:r>
@@ -8182,21 +9114,9 @@
           </m:rPr>
           <m:t>=</m:t>
         </m:r>
-        <m:sSub>
-          <m:e>
-            <m:r>
-              <m:t>ρ</m:t>
-            </m:r>
-          </m:e>
-          <m:sub>
-            <m:r>
-              <m:t>s</m:t>
-            </m:r>
-            <m:r>
-              <m:t>u</m:t>
-            </m:r>
-          </m:sub>
-        </m:sSub>
+        <m:r>
+          <m:t>ρ</m:t>
+        </m:r>
         <m:r>
           <m:t>g</m:t>
         </m:r>
@@ -8271,7 +9191,7 @@
         <w:t xml:space="preserve"> </w:t>
       </w:r>
       <w:r>
-        <w:t xml:space="preserve">Pa):</w:t>
+        <w:t xml:space="preserve">Pa olduğundan:</w:t>
       </w:r>
     </w:p>
     <w:p>
@@ -8364,7 +9284,11 @@
         <w:pStyle w:val="FirstParagraph"/>
       </w:pPr>
       <w:r>
-        <w:t xml:space="preserve">Çap oranı:</w:t>
+        <w:rPr>
+          <w:bCs/>
+          <w:b/>
+        </w:rPr>
+        <w:t xml:space="preserve">b) Çap oranı:</w:t>
       </w:r>
     </w:p>
     <w:p>
@@ -8390,14 +9314,32 @@
               <m:type m:val="bar"/>
             </m:fPr>
             <m:num>
-              <m:r>
-                <m:t>16</m:t>
-              </m:r>
+              <m:sSub>
+                <m:e>
+                  <m:r>
+                    <m:t>D</m:t>
+                  </m:r>
+                </m:e>
+                <m:sub>
+                  <m:r>
+                    <m:t>B</m:t>
+                  </m:r>
+                </m:sub>
+              </m:sSub>
             </m:num>
             <m:den>
-              <m:r>
-                <m:t>26</m:t>
-              </m:r>
+              <m:sSub>
+                <m:e>
+                  <m:r>
+                    <m:t>D</m:t>
+                  </m:r>
+                </m:e>
+                <m:sub>
+                  <m:r>
+                    <m:t>A</m:t>
+                  </m:r>
+                </m:sub>
+              </m:sSub>
             </m:den>
           </m:f>
           <m:r>
@@ -8406,6 +9348,27 @@
             </m:rPr>
             <m:t>=</m:t>
           </m:r>
+          <m:f>
+            <m:fPr>
+              <m:type m:val="bar"/>
+            </m:fPr>
+            <m:num>
+              <m:r>
+                <m:t>16</m:t>
+              </m:r>
+            </m:num>
+            <m:den>
+              <m:r>
+                <m:t>26</m:t>
+              </m:r>
+            </m:den>
+          </m:f>
+          <m:r>
+            <m:rPr>
+              <m:sty m:val="p"/>
+            </m:rPr>
+            <m:t>=</m:t>
+          </m:r>
           <m:r>
             <m:t>0</m:t>
           </m:r>
@@ -8457,8 +9420,86 @@
             </m:rPr>
             <m:t>,</m:t>
           </m:r>
+          <m:sSup>
+            <m:e>
+              <m:r>
+                <m:t>6154</m:t>
+              </m:r>
+            </m:e>
+            <m:sup>
+              <m:r>
+                <m:t>4</m:t>
+              </m:r>
+            </m:sup>
+          </m:sSup>
+          <m:r>
+            <m:rPr>
+              <m:sty m:val="p"/>
+            </m:rPr>
+            <m:t>=</m:t>
+          </m:r>
+          <m:r>
+            <m:t>0</m:t>
+          </m:r>
+          <m:r>
+            <m:rPr>
+              <m:sty m:val="p"/>
+            </m:rPr>
+            <m:t>,</m:t>
+          </m:r>
           <m:r>
             <m:t>1434</m:t>
+          </m:r>
+          <m:r>
+            <m:t> </m:t>
+          </m:r>
+          <m:r>
+            <m:rPr>
+              <m:sty m:val="p"/>
+            </m:rPr>
+            <m:t>⇒</m:t>
+          </m:r>
+          <m:r>
+            <m:t> </m:t>
+          </m:r>
+          <m:r>
+            <m:t>1</m:t>
+          </m:r>
+          <m:r>
+            <m:rPr>
+              <m:sty m:val="p"/>
+            </m:rPr>
+            <m:t>−</m:t>
+          </m:r>
+          <m:sSup>
+            <m:e>
+              <m:r>
+                <m:t>β</m:t>
+              </m:r>
+            </m:e>
+            <m:sup>
+              <m:r>
+                <m:t>4</m:t>
+              </m:r>
+            </m:sup>
+          </m:sSup>
+          <m:r>
+            <m:rPr>
+              <m:sty m:val="p"/>
+            </m:rPr>
+            <m:t>=</m:t>
+          </m:r>
+          <m:r>
+            <m:t>0</m:t>
+          </m:r>
+          <m:r>
+            <m:rPr>
+              <m:sty m:val="p"/>
+            </m:rPr>
+            <m:t>,</m:t>
+          </m:r>
+          <m:r>
+            <m:t>8566</m:t>
           </m:r>
         </m:oMath>
       </m:oMathPara>
@@ -8468,30 +9509,11 @@
         <w:pStyle w:val="FirstParagraph"/>
       </w:pPr>
       <w:r>
-        <w:t xml:space="preserve">Boğaz hızı (</w:t>
-      </w:r>
-      <m:oMath>
-        <m:sSub>
-          <m:e>
-            <m:r>
-              <m:t>ρ</m:t>
-            </m:r>
-          </m:e>
-          <m:sub>
-            <m:r>
-              <m:t>s</m:t>
-            </m:r>
-            <m:r>
-              <m:t>u</m:t>
-            </m:r>
-          </m:sub>
-        </m:sSub>
-      </m:oMath>
-      <w:r>
-        <w:t xml:space="preserve"> </w:t>
-      </w:r>
-      <w:r>
-        <w:t xml:space="preserve">= 997,8 kg/m³, 22,1 °C’de):</w:t>
+        <w:rPr>
+          <w:bCs/>
+          <w:b/>
+        </w:rPr>
+        <w:t xml:space="preserve">c) Boğaz hızı:</w:t>
       </w:r>
     </w:p>
     <w:p>
@@ -8585,37 +9607,18 @@
                     </m:rPr>
                     <m:t>×</m:t>
                   </m:r>
-                  <m:d>
-                    <m:dPr>
-                      <m:begChr m:val="("/>
-                      <m:endChr m:val=")"/>
-                      <m:sepChr m:val=""/>
-                      <m:grow/>
-                    </m:dPr>
-                    <m:e>
-                      <m:r>
-                        <m:t>1</m:t>
-                      </m:r>
-                      <m:r>
-                        <m:rPr>
-                          <m:sty m:val="p"/>
-                        </m:rPr>
-                        <m:t>−</m:t>
-                      </m:r>
-                      <m:r>
-                        <m:t>0</m:t>
-                      </m:r>
-                      <m:r>
-                        <m:rPr>
-                          <m:sty m:val="p"/>
-                        </m:rPr>
-                        <m:t>,</m:t>
-                      </m:r>
-                      <m:r>
-                        <m:t>1434</m:t>
-                      </m:r>
-                    </m:e>
-                  </m:d>
+                  <m:r>
+                    <m:t>0</m:t>
+                  </m:r>
+                  <m:r>
+                    <m:rPr>
+                      <m:sty m:val="p"/>
+                    </m:rPr>
+                    <m:t>,</m:t>
+                  </m:r>
+                  <m:r>
+                    <m:t>8566</m:t>
+                  </m:r>
                 </m:den>
               </m:f>
             </m:e>
@@ -8644,6 +9647,65 @@
             </m:radPr>
             <m:deg/>
             <m:e>
+              <m:f>
+                <m:fPr>
+                  <m:type m:val="bar"/>
+                </m:fPr>
+                <m:num>
+                  <m:r>
+                    <m:t>784</m:t>
+                  </m:r>
+                  <m:r>
+                    <m:rPr>
+                      <m:sty m:val="p"/>
+                    </m:rPr>
+                    <m:t>,</m:t>
+                  </m:r>
+                  <m:r>
+                    <m:t>8</m:t>
+                  </m:r>
+                </m:num>
+                <m:den>
+                  <m:r>
+                    <m:t>854</m:t>
+                  </m:r>
+                  <m:r>
+                    <m:rPr>
+                      <m:sty m:val="p"/>
+                    </m:rPr>
+                    <m:t>,</m:t>
+                  </m:r>
+                  <m:r>
+                    <m:t>7</m:t>
+                  </m:r>
+                </m:den>
+              </m:f>
+            </m:e>
+          </m:rad>
+          <m:r>
+            <m:rPr>
+              <m:sty m:val="p"/>
+            </m:rPr>
+            <m:t>=</m:t>
+          </m:r>
+          <m:r>
+            <m:t>0</m:t>
+          </m:r>
+          <m:r>
+            <m:rPr>
+              <m:sty m:val="p"/>
+            </m:rPr>
+            <m:t>,</m:t>
+          </m:r>
+          <m:r>
+            <m:t>98</m:t>
+          </m:r>
+          <m:rad>
+            <m:radPr>
+              <m:degHide m:val="on"/>
+            </m:radPr>
+            <m:deg/>
+            <m:e>
               <m:r>
                 <m:t>0</m:t>
               </m:r>
@@ -8674,6 +9736,42 @@
             <m:t>,</m:t>
           </m:r>
           <m:r>
+            <m:t>98</m:t>
+          </m:r>
+          <m:r>
+            <m:rPr>
+              <m:sty m:val="p"/>
+            </m:rPr>
+            <m:t>×</m:t>
+          </m:r>
+          <m:r>
+            <m:t>0</m:t>
+          </m:r>
+          <m:r>
+            <m:rPr>
+              <m:sty m:val="p"/>
+            </m:rPr>
+            <m:t>,</m:t>
+          </m:r>
+          <m:r>
+            <m:t>9582</m:t>
+          </m:r>
+          <m:r>
+            <m:rPr>
+              <m:sty m:val="p"/>
+            </m:rPr>
+            <m:t>=</m:t>
+          </m:r>
+          <m:r>
+            <m:t>0</m:t>
+          </m:r>
+          <m:r>
+            <m:rPr>
+              <m:sty m:val="p"/>
+            </m:rPr>
+            <m:t>,</m:t>
+          </m:r>
+          <m:r>
             <m:t>9391</m:t>
           </m:r>
           <m:r>
@@ -8694,7 +9792,11 @@
         <w:pStyle w:val="FirstParagraph"/>
       </w:pPr>
       <w:r>
-        <w:t xml:space="preserve">Boğaz kesit alanı:</w:t>
+        <w:rPr>
+          <w:bCs/>
+          <w:b/>
+        </w:rPr>
+        <w:t xml:space="preserve">d) Boğaz kesit alanı:</w:t>
       </w:r>
     </w:p>
     <w:p>
@@ -8718,6 +9820,44 @@
               </m:r>
             </m:sub>
           </m:sSub>
+          <m:r>
+            <m:rPr>
+              <m:sty m:val="p"/>
+            </m:rPr>
+            <m:t>=</m:t>
+          </m:r>
+          <m:f>
+            <m:fPr>
+              <m:type m:val="bar"/>
+            </m:fPr>
+            <m:num>
+              <m:r>
+                <m:t>π</m:t>
+              </m:r>
+              <m:sSubSup>
+                <m:e>
+                  <m:r>
+                    <m:t>D</m:t>
+                  </m:r>
+                </m:e>
+                <m:sub>
+                  <m:r>
+                    <m:t>B</m:t>
+                  </m:r>
+                </m:sub>
+                <m:sup>
+                  <m:r>
+                    <m:t>2</m:t>
+                  </m:r>
+                </m:sup>
+              </m:sSubSup>
+            </m:num>
+            <m:den>
+              <m:r>
+                <m:t>4</m:t>
+              </m:r>
+            </m:den>
+          </m:f>
           <m:r>
             <m:rPr>
               <m:sty m:val="p"/>
@@ -8842,7 +9982,11 @@
         <w:pStyle w:val="FirstParagraph"/>
       </w:pPr>
       <w:r>
-        <w:t xml:space="preserve">Kütlesel debi:</w:t>
+        <w:rPr>
+          <w:bCs/>
+          <w:b/>
+        </w:rPr>
+        <w:t xml:space="preserve">e) Kütlesel debi:</w:t>
       </w:r>
     </w:p>
     <w:p>
@@ -8883,6 +10027,45 @@
             <m:t>=</m:t>
           </m:r>
           <m:r>
+            <m:t>ρ</m:t>
+          </m:r>
+          <m:r>
+            <m:t> </m:t>
+          </m:r>
+          <m:sSub>
+            <m:e>
+              <m:r>
+                <m:t>A</m:t>
+              </m:r>
+            </m:e>
+            <m:sub>
+              <m:r>
+                <m:t>B</m:t>
+              </m:r>
+            </m:sub>
+          </m:sSub>
+          <m:r>
+            <m:t> </m:t>
+          </m:r>
+          <m:sSub>
+            <m:e>
+              <m:r>
+                <m:t>V</m:t>
+              </m:r>
+            </m:e>
+            <m:sub>
+              <m:r>
+                <m:t>B</m:t>
+              </m:r>
+            </m:sub>
+          </m:sSub>
+          <m:r>
+            <m:rPr>
+              <m:sty m:val="p"/>
+            </m:rPr>
+            <m:t>=</m:t>
+          </m:r>
+          <m:r>
             <m:t>997</m:t>
           </m:r>
           <m:r>
@@ -9022,6 +10205,31 @@
         <w:t xml:space="preserve"> </w:t>
       </w:r>
       <m:oMath>
+        <m:acc>
+          <m:accPr>
+            <m:chr m:val="̇"/>
+          </m:accPr>
+          <m:e>
+            <m:r>
+              <m:t>m</m:t>
+            </m:r>
+          </m:e>
+        </m:acc>
+        <m:r>
+          <m:rPr>
+            <m:sty m:val="p"/>
+          </m:rPr>
+          <m:t>/</m:t>
+        </m:r>
+        <m:r>
+          <m:t>ρ</m:t>
+        </m:r>
+        <m:r>
+          <m:rPr>
+            <m:sty m:val="p"/>
+          </m:rPr>
+          <m:t>=</m:t>
+        </m:r>
         <m:r>
           <m:t>1</m:t>
         </m:r>
@@ -9063,7 +10271,71 @@
         <w:t xml:space="preserve"> </w:t>
       </w:r>
       <w:r>
-        <w:t xml:space="preserve">m³/s ≈ 11,3 L/dk eder.</w:t>
+        <w:t xml:space="preserve">m³/s, yani yaklaşık 11,3 L/dk eder.</w:t>
+      </w:r>
+    </w:p>
+    <w:p>
+      <w:pPr>
+        <w:pStyle w:val="BodyText"/>
+      </w:pPr>
+      <w:r>
+        <w:rPr>
+          <w:bCs/>
+          <w:b/>
+        </w:rPr>
+        <w:t xml:space="preserve">Not:</w:t>
+      </w:r>
+      <w:r>
+        <w:t xml:space="preserve"> </w:t>
+      </w:r>
+      <w:r>
+        <w:t xml:space="preserve">Su debisi tamamen ölçülen değerlerle hesaplandığı için kesindir. Hava debisi ise kabul edilen venturi çaplarına bağlıdır; gerçek</w:t>
+      </w:r>
+      <w:r>
+        <w:t xml:space="preserve"> </w:t>
+      </w:r>
+      <m:oMath>
+        <m:sSub>
+          <m:e>
+            <m:r>
+              <m:t>D</m:t>
+            </m:r>
+          </m:e>
+          <m:sub>
+            <m:r>
+              <m:t>A</m:t>
+            </m:r>
+          </m:sub>
+        </m:sSub>
+      </m:oMath>
+      <w:r>
+        <w:t xml:space="preserve"> </w:t>
+      </w:r>
+      <w:r>
+        <w:t xml:space="preserve">ve</w:t>
+      </w:r>
+      <w:r>
+        <w:t xml:space="preserve"> </w:t>
+      </w:r>
+      <m:oMath>
+        <m:sSub>
+          <m:e>
+            <m:r>
+              <m:t>D</m:t>
+            </m:r>
+          </m:e>
+          <m:sub>
+            <m:r>
+              <m:t>B</m:t>
+            </m:r>
+          </m:sub>
+        </m:sSub>
+      </m:oMath>
+      <w:r>
+        <w:t xml:space="preserve"> </w:t>
+      </w:r>
+      <w:r>
+        <w:t xml:space="preserve">ile yeniden hesaplanmalıdır.</w:t>
       </w:r>
     </w:p>
     <w:bookmarkEnd w:id="34"/>

</xml_diff>

<commit_message>
Isı değiştirici ölçülerini düzenekteki değerlerle güncelle
D1=36,2 mm, D2=42 mm, D3=70 mm, D4=76 mm, L=1650 mm. Su tarafı
laminer-geçiş sınırında olduğu için laminer halka Nu kontrolü eklendi.

Co-Authored-By: Claude Opus 5.5 <noreply@anthropic.com>
Claude-Session: https://claude.ai/code/session_01NzVg54L4fp96hcTvwLWbKq
</commit_message>
<xml_diff>
--- a/lab-raporu/RAPOR.docx
+++ b/lab-raporu/RAPOR.docx
@@ -188,13 +188,266 @@
           <w:bCs/>
           <w:b/>
         </w:rPr>
-        <w:t xml:space="preserve">Önce okuyun: varsayılan değerler.</w:t>
-      </w:r>
-      <w:r>
-        <w:t xml:space="preserve"> </w:t>
-      </w:r>
-      <w:r>
-        <w:t xml:space="preserve">Föyün fotoğraflanan sayfalarında üç geometrik değer yok. Raporda bunlar için aşağıdaki değerler kabul edildi. Gerçek değerleri föyün Şekil 1’inden veya düzenek üzerinden alıp</w:t>
+        <w:t xml:space="preserve">Önce okuyun: varsayılan değer.</w:t>
+      </w:r>
+      <w:r>
+        <w:t xml:space="preserve"> </w:t>
+      </w:r>
+      <w:r>
+        <w:t xml:space="preserve">Isı değiştiricisinin ölçüleri düzenekten alınmıştır:</w:t>
+      </w:r>
+      <w:r>
+        <w:t xml:space="preserve"> </w:t>
+      </w:r>
+      <m:oMath>
+        <m:sSub>
+          <m:e>
+            <m:r>
+              <m:t>D</m:t>
+            </m:r>
+          </m:e>
+          <m:sub>
+            <m:r>
+              <m:t>1</m:t>
+            </m:r>
+          </m:sub>
+        </m:sSub>
+        <m:r>
+          <m:rPr>
+            <m:sty m:val="p"/>
+          </m:rPr>
+          <m:t>=</m:t>
+        </m:r>
+        <m:r>
+          <m:t>36</m:t>
+        </m:r>
+        <m:r>
+          <m:rPr>
+            <m:sty m:val="p"/>
+          </m:rPr>
+          <m:t>,</m:t>
+        </m:r>
+        <m:r>
+          <m:t>2</m:t>
+        </m:r>
+      </m:oMath>
+      <w:r>
+        <w:t xml:space="preserve"> </w:t>
+      </w:r>
+      <w:r>
+        <w:t xml:space="preserve">mm,</w:t>
+      </w:r>
+      <w:r>
+        <w:t xml:space="preserve"> </w:t>
+      </w:r>
+      <m:oMath>
+        <m:sSub>
+          <m:e>
+            <m:r>
+              <m:t>D</m:t>
+            </m:r>
+          </m:e>
+          <m:sub>
+            <m:r>
+              <m:t>2</m:t>
+            </m:r>
+          </m:sub>
+        </m:sSub>
+        <m:r>
+          <m:rPr>
+            <m:sty m:val="p"/>
+          </m:rPr>
+          <m:t>=</m:t>
+        </m:r>
+        <m:r>
+          <m:t>42</m:t>
+        </m:r>
+      </m:oMath>
+      <w:r>
+        <w:t xml:space="preserve"> </w:t>
+      </w:r>
+      <w:r>
+        <w:t xml:space="preserve">mm,</w:t>
+      </w:r>
+      <w:r>
+        <w:t xml:space="preserve"> </w:t>
+      </w:r>
+      <m:oMath>
+        <m:sSub>
+          <m:e>
+            <m:r>
+              <m:t>D</m:t>
+            </m:r>
+          </m:e>
+          <m:sub>
+            <m:r>
+              <m:t>3</m:t>
+            </m:r>
+          </m:sub>
+        </m:sSub>
+        <m:r>
+          <m:rPr>
+            <m:sty m:val="p"/>
+          </m:rPr>
+          <m:t>=</m:t>
+        </m:r>
+        <m:r>
+          <m:t>70</m:t>
+        </m:r>
+      </m:oMath>
+      <w:r>
+        <w:t xml:space="preserve"> </w:t>
+      </w:r>
+      <w:r>
+        <w:t xml:space="preserve">mm,</w:t>
+      </w:r>
+      <w:r>
+        <w:t xml:space="preserve"> </w:t>
+      </w:r>
+      <m:oMath>
+        <m:sSub>
+          <m:e>
+            <m:r>
+              <m:t>D</m:t>
+            </m:r>
+          </m:e>
+          <m:sub>
+            <m:r>
+              <m:t>4</m:t>
+            </m:r>
+          </m:sub>
+        </m:sSub>
+        <m:r>
+          <m:rPr>
+            <m:sty m:val="p"/>
+          </m:rPr>
+          <m:t>=</m:t>
+        </m:r>
+        <m:r>
+          <m:t>76</m:t>
+        </m:r>
+      </m:oMath>
+      <w:r>
+        <w:t xml:space="preserve"> </w:t>
+      </w:r>
+      <w:r>
+        <w:t xml:space="preserve">mm,</w:t>
+      </w:r>
+      <w:r>
+        <w:t xml:space="preserve"> </w:t>
+      </w:r>
+      <m:oMath>
+        <m:r>
+          <m:t>L</m:t>
+        </m:r>
+        <m:r>
+          <m:rPr>
+            <m:sty m:val="p"/>
+          </m:rPr>
+          <m:t>=</m:t>
+        </m:r>
+        <m:r>
+          <m:t>1650</m:t>
+        </m:r>
+      </m:oMath>
+      <w:r>
+        <w:t xml:space="preserve"> </w:t>
+      </w:r>
+      <w:r>
+        <w:t xml:space="preserve">mm. Föyün fotoğraflanan sayfalarında yalnızca</w:t>
+      </w:r>
+      <w:r>
+        <w:t xml:space="preserve"> </w:t>
+      </w:r>
+      <w:r>
+        <w:rPr>
+          <w:bCs/>
+          <w:b/>
+        </w:rPr>
+        <w:t xml:space="preserve">hava venturisinin çapları</w:t>
+      </w:r>
+      <w:r>
+        <w:t xml:space="preserve"> </w:t>
+      </w:r>
+      <w:r>
+        <w:t xml:space="preserve">yoktur; bunlar için</w:t>
+      </w:r>
+      <w:r>
+        <w:t xml:space="preserve"> </w:t>
+      </w:r>
+      <m:oMath>
+        <m:sSub>
+          <m:e>
+            <m:r>
+              <m:t>D</m:t>
+            </m:r>
+          </m:e>
+          <m:sub>
+            <m:r>
+              <m:t>A</m:t>
+            </m:r>
+          </m:sub>
+        </m:sSub>
+        <m:r>
+          <m:rPr>
+            <m:sty m:val="p"/>
+          </m:rPr>
+          <m:t>=</m:t>
+        </m:r>
+        <m:r>
+          <m:t>40</m:t>
+        </m:r>
+      </m:oMath>
+      <w:r>
+        <w:t xml:space="preserve"> </w:t>
+      </w:r>
+      <w:r>
+        <w:t xml:space="preserve">mm,</w:t>
+      </w:r>
+      <w:r>
+        <w:t xml:space="preserve"> </w:t>
+      </w:r>
+      <m:oMath>
+        <m:sSub>
+          <m:e>
+            <m:r>
+              <m:t>D</m:t>
+            </m:r>
+          </m:e>
+          <m:sub>
+            <m:r>
+              <m:t>B</m:t>
+            </m:r>
+          </m:sub>
+        </m:sSub>
+        <m:r>
+          <m:rPr>
+            <m:sty m:val="p"/>
+          </m:rPr>
+          <m:t>=</m:t>
+        </m:r>
+        <m:r>
+          <m:t>20</m:t>
+        </m:r>
+      </m:oMath>
+      <w:r>
+        <w:t xml:space="preserve"> </w:t>
+      </w:r>
+      <w:r>
+        <w:t xml:space="preserve">mm</w:t>
+      </w:r>
+      <w:r>
+        <w:t xml:space="preserve"> </w:t>
+      </w:r>
+      <w:r>
+        <w:rPr>
+          <w:bCs/>
+          <w:b/>
+        </w:rPr>
+        <w:t xml:space="preserve">kabul edilmiştir</w:t>
+      </w:r>
+      <w:r>
+        <w:t xml:space="preserve">. Gerçek değerleri föyün Şekil 1’inden alıp</w:t>
       </w:r>
       <w:r>
         <w:t xml:space="preserve"> </w:t>
@@ -209,407 +462,7 @@
         <w:t xml:space="preserve"> </w:t>
       </w:r>
       <w:r>
-        <w:t xml:space="preserve">dosyasının başındaki satırlara yazarsanız tüm sonuçlar aynı yöntemle yeniden hesaplanır:</w:t>
-      </w:r>
-    </w:p>
-    <w:tbl>
-      <w:tblPr>
-        <w:tblStyle w:val="Table"/>
-        <w:tblW w:type="pct" w:w="5000"/>
-        <w:tblLook w:firstRow="1" w:lastRow="0" w:firstColumn="0" w:lastColumn="0" w:noHBand="0" w:noVBand="0" w:val="0020"/>
-        <w:jc w:val="start"/>
-      </w:tblPr>
-      <w:tblGrid>
-        <w:gridCol w:w="2640"/>
-        <w:gridCol w:w="2640"/>
-        <w:gridCol w:w="2640"/>
-      </w:tblGrid>
-      <w:tr>
-        <w:trPr>
-          <w:tblHeader w:val="true"/>
-        </w:trPr>
-        <w:tc>
-          <w:tcPr/>
-          <w:p>
-            <w:pPr>
-              <w:pStyle w:val="Compact"/>
-              <w:jc w:val="left"/>
-            </w:pPr>
-            <w:r>
-              <w:t xml:space="preserve">Büyüklük</w:t>
-            </w:r>
-          </w:p>
-        </w:tc>
-        <w:tc>
-          <w:tcPr/>
-          <w:p>
-            <w:pPr>
-              <w:pStyle w:val="Compact"/>
-              <w:jc w:val="left"/>
-            </w:pPr>
-            <w:r>
-              <w:t xml:space="preserve">Kabul edilen değer</w:t>
-            </w:r>
-          </w:p>
-        </w:tc>
-        <w:tc>
-          <w:tcPr/>
-          <w:p>
-            <w:pPr>
-              <w:pStyle w:val="Compact"/>
-              <w:jc w:val="left"/>
-            </w:pPr>
-            <w:r>
-              <w:t xml:space="preserve">Not</w:t>
-            </w:r>
-          </w:p>
-        </w:tc>
-      </w:tr>
-      <w:tr>
-        <w:tc>
-          <w:tcPr/>
-          <w:p>
-            <w:pPr>
-              <w:pStyle w:val="Compact"/>
-              <w:jc w:val="left"/>
-            </w:pPr>
-            <w:r>
-              <w:t xml:space="preserve">Hava venturisi giriş/boğaz çapı</w:t>
-            </w:r>
-            <w:r>
-              <w:t xml:space="preserve"> </w:t>
-            </w:r>
-            <m:oMath>
-              <m:sSub>
-                <m:e>
-                  <m:r>
-                    <m:t>D</m:t>
-                  </m:r>
-                </m:e>
-                <m:sub>
-                  <m:r>
-                    <m:t>A</m:t>
-                  </m:r>
-                </m:sub>
-              </m:sSub>
-              <m:r>
-                <m:rPr>
-                  <m:sty m:val="p"/>
-                </m:rPr>
-                <m:t>/</m:t>
-              </m:r>
-              <m:sSub>
-                <m:e>
-                  <m:r>
-                    <m:t>D</m:t>
-                  </m:r>
-                </m:e>
-                <m:sub>
-                  <m:r>
-                    <m:t>B</m:t>
-                  </m:r>
-                </m:sub>
-              </m:sSub>
-            </m:oMath>
-          </w:p>
-        </w:tc>
-        <w:tc>
-          <w:tcPr/>
-          <w:p>
-            <w:pPr>
-              <w:pStyle w:val="Compact"/>
-              <w:jc w:val="left"/>
-            </w:pPr>
-            <w:r>
-              <w:t xml:space="preserve">40 mm / 20 mm</w:t>
-            </w:r>
-          </w:p>
-        </w:tc>
-        <w:tc>
-          <w:tcPr/>
-          <w:p>
-            <w:pPr>
-              <w:pStyle w:val="Compact"/>
-              <w:jc w:val="left"/>
-            </w:pPr>
-            <w:r>
-              <w:t xml:space="preserve">Föy Şekil 1’den alınmalı</w:t>
-            </w:r>
-          </w:p>
-        </w:tc>
-      </w:tr>
-      <w:tr>
-        <w:tc>
-          <w:tcPr/>
-          <w:p>
-            <w:pPr>
-              <w:pStyle w:val="Compact"/>
-              <w:jc w:val="left"/>
-            </w:pPr>
-            <w:r>
-              <w:t xml:space="preserve">Isı değiştirici boyu</w:t>
-            </w:r>
-            <w:r>
-              <w:t xml:space="preserve"> </w:t>
-            </w:r>
-            <m:oMath>
-              <m:r>
-                <m:t>L</m:t>
-              </m:r>
-            </m:oMath>
-          </w:p>
-        </w:tc>
-        <w:tc>
-          <w:tcPr/>
-          <w:p>
-            <w:pPr>
-              <w:pStyle w:val="Compact"/>
-              <w:jc w:val="left"/>
-            </w:pPr>
-            <w:r>
-              <w:t xml:space="preserve">1,0 m</w:t>
-            </w:r>
-          </w:p>
-        </w:tc>
-        <w:tc>
-          <w:tcPr/>
-          <w:p>
-            <w:pPr>
-              <w:pStyle w:val="Compact"/>
-              <w:jc w:val="left"/>
-            </w:pPr>
-            <w:r>
-              <w:t xml:space="preserve">Düzenekten ölçülmeli</w:t>
-            </w:r>
-          </w:p>
-        </w:tc>
-      </w:tr>
-      <w:tr>
-        <w:tc>
-          <w:tcPr/>
-          <w:p>
-            <w:pPr>
-              <w:pStyle w:val="Compact"/>
-              <w:jc w:val="left"/>
-            </w:pPr>
-            <w:r>
-              <w:t xml:space="preserve">İç boru et kalınlığı</w:t>
-            </w:r>
-            <w:r>
-              <w:t xml:space="preserve"> </w:t>
-            </w:r>
-            <m:oMath>
-              <m:r>
-                <m:t>t</m:t>
-              </m:r>
-            </m:oMath>
-          </w:p>
-        </w:tc>
-        <w:tc>
-          <w:tcPr/>
-          <w:p>
-            <w:pPr>
-              <w:pStyle w:val="Compact"/>
-              <w:jc w:val="left"/>
-            </w:pPr>
-            <w:r>
-              <w:t xml:space="preserve">1 mm</w:t>
-            </w:r>
-          </w:p>
-        </w:tc>
-        <w:tc>
-          <w:tcPr/>
-          <w:p>
-            <w:pPr>
-              <w:pStyle w:val="Compact"/>
-              <w:jc w:val="left"/>
-            </w:pPr>
-            <m:oMath>
-              <m:sSub>
-                <m:e>
-                  <m:r>
-                    <m:t>D</m:t>
-                  </m:r>
-                </m:e>
-                <m:sub>
-                  <m:r>
-                    <m:t>1</m:t>
-                  </m:r>
-                </m:sub>
-              </m:sSub>
-              <m:r>
-                <m:rPr>
-                  <m:sty m:val="p"/>
-                </m:rPr>
-                <m:t>=</m:t>
-              </m:r>
-              <m:r>
-                <m:t>16</m:t>
-              </m:r>
-              <m:r>
-                <m:rPr>
-                  <m:sty m:val="p"/>
-                </m:rPr>
-                <m:t>−</m:t>
-              </m:r>
-              <m:r>
-                <m:t>2</m:t>
-              </m:r>
-              <m:r>
-                <m:rPr>
-                  <m:sty m:val="p"/>
-                </m:rPr>
-                <m:t>⋅</m:t>
-              </m:r>
-              <m:r>
-                <m:t>1</m:t>
-              </m:r>
-              <m:r>
-                <m:rPr>
-                  <m:sty m:val="p"/>
-                </m:rPr>
-                <m:t>=</m:t>
-              </m:r>
-              <m:r>
-                <m:t>14</m:t>
-              </m:r>
-            </m:oMath>
-            <w:r>
-              <w:t xml:space="preserve"> </w:t>
-            </w:r>
-            <w:r>
-              <w:t xml:space="preserve">mm</w:t>
-            </w:r>
-          </w:p>
-        </w:tc>
-      </w:tr>
-    </w:tbl>
-    <w:p>
-      <w:pPr>
-        <w:pStyle w:val="BlockText"/>
-      </w:pPr>
-      <w:r>
-        <w:t xml:space="preserve">Hocanın notuna göre ısı değiştiricisinde</w:t>
-      </w:r>
-      <w:r>
-        <w:t xml:space="preserve"> </w:t>
-      </w:r>
-      <w:r>
-        <w:rPr>
-          <w:bCs/>
-          <w:b/>
-        </w:rPr>
-        <w:t xml:space="preserve">kovan iç çapı</w:t>
-      </w:r>
-      <w:r>
-        <w:rPr>
-          <w:bCs/>
-          <w:b/>
-        </w:rPr>
-        <w:t xml:space="preserve"> </w:t>
-      </w:r>
-      <m:oMath>
-        <m:sSub>
-          <m:e>
-            <m:r>
-              <m:t>D</m:t>
-            </m:r>
-          </m:e>
-          <m:sub>
-            <m:r>
-              <m:t>3</m:t>
-            </m:r>
-          </m:sub>
-        </m:sSub>
-        <m:r>
-          <m:rPr>
-            <m:sty m:val="p"/>
-          </m:rPr>
-          <m:t>=</m:t>
-        </m:r>
-        <m:r>
-          <m:t>26</m:t>
-        </m:r>
-      </m:oMath>
-      <w:r>
-        <w:rPr>
-          <w:bCs/>
-          <w:b/>
-        </w:rPr>
-        <w:t xml:space="preserve"> </w:t>
-      </w:r>
-      <w:r>
-        <w:rPr>
-          <w:bCs/>
-          <w:b/>
-        </w:rPr>
-        <w:t xml:space="preserve">mm</w:t>
-      </w:r>
-      <w:r>
-        <w:t xml:space="preserve"> </w:t>
-      </w:r>
-      <w:r>
-        <w:t xml:space="preserve">ve</w:t>
-      </w:r>
-      <w:r>
-        <w:t xml:space="preserve"> </w:t>
-      </w:r>
-      <w:r>
-        <w:rPr>
-          <w:bCs/>
-          <w:b/>
-        </w:rPr>
-        <w:t xml:space="preserve">iç boru dış çapı</w:t>
-      </w:r>
-      <w:r>
-        <w:rPr>
-          <w:bCs/>
-          <w:b/>
-        </w:rPr>
-        <w:t xml:space="preserve"> </w:t>
-      </w:r>
-      <m:oMath>
-        <m:sSub>
-          <m:e>
-            <m:r>
-              <m:t>D</m:t>
-            </m:r>
-          </m:e>
-          <m:sub>
-            <m:r>
-              <m:t>2</m:t>
-            </m:r>
-          </m:sub>
-        </m:sSub>
-        <m:r>
-          <m:rPr>
-            <m:sty m:val="p"/>
-          </m:rPr>
-          <m:t>=</m:t>
-        </m:r>
-        <m:r>
-          <m:t>16</m:t>
-        </m:r>
-      </m:oMath>
-      <w:r>
-        <w:rPr>
-          <w:bCs/>
-          <w:b/>
-        </w:rPr>
-        <w:t xml:space="preserve"> </w:t>
-      </w:r>
-      <w:r>
-        <w:rPr>
-          <w:bCs/>
-          <w:b/>
-        </w:rPr>
-        <w:t xml:space="preserve">mm</w:t>
-      </w:r>
-      <w:r>
-        <w:t xml:space="preserve"> </w:t>
-      </w:r>
-      <w:r>
-        <w:t xml:space="preserve">alınmıştır.</w:t>
+        <w:t xml:space="preserve">dosyasının başına yazarsanız tüm sonuçlar aynı yöntemle yeniden hesaplanır.</w:t>
       </w:r>
     </w:p>
     <w:p>
@@ -5189,7 +5042,7 @@
               <w:jc w:val="left"/>
             </w:pPr>
             <w:r>
-              <w:t xml:space="preserve">14 mm</w:t>
+              <w:t xml:space="preserve">36,2 mm</w:t>
             </w:r>
           </w:p>
         </w:tc>
@@ -5200,57 +5053,8 @@
               <w:pStyle w:val="Compact"/>
               <w:jc w:val="left"/>
             </w:pPr>
-            <m:oMath>
-              <m:sSub>
-                <m:e>
-                  <m:r>
-                    <m:t>D</m:t>
-                  </m:r>
-                </m:e>
-                <m:sub>
-                  <m:r>
-                    <m:t>2</m:t>
-                  </m:r>
-                </m:sub>
-              </m:sSub>
-              <m:r>
-                <m:rPr>
-                  <m:sty m:val="p"/>
-                </m:rPr>
-                <m:t>−</m:t>
-              </m:r>
-              <m:r>
-                <m:t>2</m:t>
-              </m:r>
-              <m:r>
-                <m:t>t</m:t>
-              </m:r>
-            </m:oMath>
             <w:r>
-              <w:t xml:space="preserve">,</w:t>
-            </w:r>
-            <w:r>
-              <w:t xml:space="preserve"> </w:t>
-            </w:r>
-            <m:oMath>
-              <m:r>
-                <m:t>t</m:t>
-              </m:r>
-              <m:r>
-                <m:rPr>
-                  <m:sty m:val="p"/>
-                </m:rPr>
-                <m:t>=</m:t>
-              </m:r>
-              <m:r>
-                <m:t>1</m:t>
-              </m:r>
-            </m:oMath>
-            <w:r>
-              <w:t xml:space="preserve"> </w:t>
-            </w:r>
-            <w:r>
-              <w:t xml:space="preserve">mm kabul</w:t>
+              <w:t xml:space="preserve">Düzenek</w:t>
             </w:r>
           </w:p>
         </w:tc>
@@ -5293,7 +5097,7 @@
               <w:jc w:val="left"/>
             </w:pPr>
             <w:r>
-              <w:t xml:space="preserve">16 mm</w:t>
+              <w:t xml:space="preserve">42 mm</w:t>
             </w:r>
           </w:p>
         </w:tc>
@@ -5305,7 +5109,7 @@
               <w:jc w:val="left"/>
             </w:pPr>
             <w:r>
-              <w:t xml:space="preserve">Hoca notu</w:t>
+              <w:t xml:space="preserve">Düzenek</w:t>
             </w:r>
           </w:p>
         </w:tc>
@@ -5348,7 +5152,7 @@
               <w:jc w:val="left"/>
             </w:pPr>
             <w:r>
-              <w:t xml:space="preserve">26 mm</w:t>
+              <w:t xml:space="preserve">70 mm</w:t>
             </w:r>
           </w:p>
         </w:tc>
@@ -5360,7 +5164,7 @@
               <w:jc w:val="left"/>
             </w:pPr>
             <w:r>
-              <w:t xml:space="preserve">Hoca notu</w:t>
+              <w:t xml:space="preserve">Düzenek</w:t>
             </w:r>
           </w:p>
         </w:tc>
@@ -5374,6 +5178,61 @@
               <w:jc w:val="left"/>
             </w:pPr>
             <m:oMath>
+              <m:sSub>
+                <m:e>
+                  <m:r>
+                    <m:t>D</m:t>
+                  </m:r>
+                </m:e>
+                <m:sub>
+                  <m:r>
+                    <m:t>4</m:t>
+                  </m:r>
+                </m:sub>
+              </m:sSub>
+            </m:oMath>
+            <w:r>
+              <w:t xml:space="preserve"> </w:t>
+            </w:r>
+            <w:r>
+              <w:t xml:space="preserve">(kovan dış çapı)</w:t>
+            </w:r>
+          </w:p>
+        </w:tc>
+        <w:tc>
+          <w:tcPr/>
+          <w:p>
+            <w:pPr>
+              <w:pStyle w:val="Compact"/>
+              <w:jc w:val="left"/>
+            </w:pPr>
+            <w:r>
+              <w:t xml:space="preserve">76 mm</w:t>
+            </w:r>
+          </w:p>
+        </w:tc>
+        <w:tc>
+          <w:tcPr/>
+          <w:p>
+            <w:pPr>
+              <w:pStyle w:val="Compact"/>
+              <w:jc w:val="left"/>
+            </w:pPr>
+            <w:r>
+              <w:t xml:space="preserve">Düzenek (hesapta kullanılmaz)</w:t>
+            </w:r>
+          </w:p>
+        </w:tc>
+      </w:tr>
+      <w:tr>
+        <w:tc>
+          <w:tcPr/>
+          <w:p>
+            <w:pPr>
+              <w:pStyle w:val="Compact"/>
+              <w:jc w:val="left"/>
+            </w:pPr>
+            <m:oMath>
               <m:r>
                 <m:t>L</m:t>
               </m:r>
@@ -5388,7 +5247,80 @@
               <w:jc w:val="left"/>
             </w:pPr>
             <w:r>
-              <w:t xml:space="preserve">1,0 m</w:t>
+              <w:t xml:space="preserve">1650 mm</w:t>
+            </w:r>
+          </w:p>
+        </w:tc>
+        <w:tc>
+          <w:tcPr/>
+          <w:p>
+            <w:pPr>
+              <w:pStyle w:val="Compact"/>
+              <w:jc w:val="left"/>
+            </w:pPr>
+            <w:r>
+              <w:t xml:space="preserve">Düzenek</w:t>
+            </w:r>
+          </w:p>
+        </w:tc>
+      </w:tr>
+      <w:tr>
+        <w:tc>
+          <w:tcPr/>
+          <w:p>
+            <w:pPr>
+              <w:pStyle w:val="Compact"/>
+              <w:jc w:val="left"/>
+            </w:pPr>
+            <w:r>
+              <w:t xml:space="preserve">Hava venturisi</w:t>
+            </w:r>
+            <w:r>
+              <w:t xml:space="preserve"> </w:t>
+            </w:r>
+            <m:oMath>
+              <m:sSub>
+                <m:e>
+                  <m:r>
+                    <m:t>D</m:t>
+                  </m:r>
+                </m:e>
+                <m:sub>
+                  <m:r>
+                    <m:t>A</m:t>
+                  </m:r>
+                </m:sub>
+              </m:sSub>
+              <m:r>
+                <m:rPr>
+                  <m:sty m:val="p"/>
+                </m:rPr>
+                <m:t>/</m:t>
+              </m:r>
+              <m:sSub>
+                <m:e>
+                  <m:r>
+                    <m:t>D</m:t>
+                  </m:r>
+                </m:e>
+                <m:sub>
+                  <m:r>
+                    <m:t>B</m:t>
+                  </m:r>
+                </m:sub>
+              </m:sSub>
+            </m:oMath>
+          </w:p>
+        </w:tc>
+        <w:tc>
+          <w:tcPr/>
+          <w:p>
+            <w:pPr>
+              <w:pStyle w:val="Compact"/>
+              <w:jc w:val="left"/>
+            </w:pPr>
+            <w:r>
+              <w:t xml:space="preserve">40 / 20 mm</w:t>
             </w:r>
           </w:p>
         </w:tc>
@@ -12270,7 +12202,7 @@
             <m:t>,</m:t>
           </m:r>
           <m:r>
-            <m:t>016</m:t>
+            <m:t>042</m:t>
           </m:r>
           <m:r>
             <m:rPr>
@@ -12288,25 +12220,25 @@
             <m:t>,</m:t>
           </m:r>
           <m:r>
+            <m:t>65</m:t>
+          </m:r>
+          <m:r>
+            <m:rPr>
+              <m:sty m:val="p"/>
+            </m:rPr>
+            <m:t>=</m:t>
+          </m:r>
+          <m:r>
             <m:t>0</m:t>
           </m:r>
           <m:r>
             <m:rPr>
               <m:sty m:val="p"/>
             </m:rPr>
-            <m:t>=</m:t>
-          </m:r>
-          <m:r>
-            <m:t>0</m:t>
-          </m:r>
-          <m:r>
-            <m:rPr>
-              <m:sty m:val="p"/>
-            </m:rPr>
             <m:t>,</m:t>
           </m:r>
           <m:r>
-            <m:t>05027</m:t>
+            <m:t>2177</m:t>
           </m:r>
           <m:r>
             <m:t> </m:t>
@@ -12484,7 +12416,7 @@
                 <m:t>,</m:t>
               </m:r>
               <m:r>
-                <m:t>05027</m:t>
+                <m:t>2177</m:t>
               </m:r>
               <m:r>
                 <m:rPr>
@@ -12512,11 +12444,50 @@
             </m:rPr>
             <m:t>=</m:t>
           </m:r>
+          <m:f>
+            <m:fPr>
+              <m:type m:val="bar"/>
+            </m:fPr>
+            <m:num>
+              <m:r>
+                <m:t>217</m:t>
+              </m:r>
+              <m:r>
+                <m:rPr>
+                  <m:sty m:val="p"/>
+                </m:rPr>
+                <m:t>,</m:t>
+              </m:r>
+              <m:r>
+                <m:t>3</m:t>
+              </m:r>
+            </m:num>
+            <m:den>
+              <m:r>
+                <m:t>8</m:t>
+              </m:r>
+              <m:r>
+                <m:rPr>
+                  <m:sty m:val="p"/>
+                </m:rPr>
+                <m:t>,</m:t>
+              </m:r>
+              <m:r>
+                <m:t>436</m:t>
+              </m:r>
+            </m:den>
+          </m:f>
+          <m:r>
+            <m:rPr>
+              <m:sty m:val="p"/>
+            </m:rPr>
+            <m:t>=</m:t>
+          </m:r>
           <m:r>
             <m:rPr>
               <m:sty m:val="b"/>
             </m:rPr>
-            <m:t>111</m:t>
+            <m:t>25</m:t>
           </m:r>
           <m:r>
             <m:rPr>
@@ -12528,7 +12499,7 @@
             <m:rPr>
               <m:sty m:val="b"/>
             </m:rPr>
-            <m:t>6</m:t>
+            <m:t>8</m:t>
           </m:r>
           <m:r>
             <m:rPr>
@@ -12639,46 +12610,18 @@
           </m:rPr>
           <m:t>/</m:t>
         </m:r>
-        <m:d>
-          <m:dPr>
-            <m:begChr m:val="("/>
-            <m:endChr m:val=")"/>
-            <m:sepChr m:val=""/>
-            <m:grow/>
-          </m:dPr>
-          <m:e>
-            <m:r>
-              <m:t>0</m:t>
-            </m:r>
-            <m:r>
-              <m:rPr>
-                <m:sty m:val="p"/>
-              </m:rPr>
-              <m:t>,</m:t>
-            </m:r>
-            <m:r>
-              <m:t>05027</m:t>
-            </m:r>
-            <m:r>
-              <m:rPr>
-                <m:sty m:val="p"/>
-              </m:rPr>
-              <m:t>×</m:t>
-            </m:r>
-            <m:r>
-              <m:t>38</m:t>
-            </m:r>
-            <m:r>
-              <m:rPr>
-                <m:sty m:val="p"/>
-              </m:rPr>
-              <m:t>,</m:t>
-            </m:r>
-            <m:r>
-              <m:t>75</m:t>
-            </m:r>
-          </m:e>
-        </m:d>
+        <m:r>
+          <m:t>8</m:t>
+        </m:r>
+        <m:r>
+          <m:rPr>
+            <m:sty m:val="p"/>
+          </m:rPr>
+          <m:t>,</m:t>
+        </m:r>
+        <m:r>
+          <m:t>436</m:t>
+        </m:r>
         <m:r>
           <m:rPr>
             <m:sty m:val="p"/>
@@ -12686,25 +12629,37 @@
           <m:t>≈</m:t>
         </m:r>
         <m:r>
-          <m:t>1051</m:t>
+          <m:t>243</m:t>
         </m:r>
       </m:oMath>
       <w:r>
         <w:t xml:space="preserve"> </w:t>
       </w:r>
       <w:r>
-        <w:t xml:space="preserve">W/m²K çıkardı. Bu değer, hava-su ısı değiştiricisi için fiziksel olarak mümkün değildir, çünkü hava tarafı direnci</w:t>
-      </w:r>
-      <w:r>
-        <w:t xml:space="preserve"> </w:t>
+        <w:t xml:space="preserve">W/m²K çıkardı. Bu değer, teorik hesaptaki hava tarafı direncinin izin verdiği üst sınırın (</w:t>
       </w:r>
       <m:oMath>
-        <m:r>
-          <m:t>U</m:t>
-        </m:r>
+        <m:sSub>
+          <m:e>
+            <m:r>
+              <m:t>h</m:t>
+            </m:r>
+          </m:e>
+          <m:sub>
+            <m:r>
+              <m:t>i</m:t>
+            </m:r>
+            <m:r>
+              <m:t>ç</m:t>
+            </m:r>
+          </m:sub>
+        </m:sSub>
       </m:oMath>
       <w:r>
-        <w:t xml:space="preserve">’yu sınırlar (bkz. 6.9). Bu da hava tarafının esas alınmasının doğru olduğunu gösterir.</w:t>
+        <w:t xml:space="preserve"> </w:t>
+      </w:r>
+      <w:r>
+        <w:t xml:space="preserve">≈ 35 W/m²K, bkz. 6.8) çok üzerindedir; fiziksel olarak mümkün değildir. Bu da hava tarafının esas alınmasının doğru olduğunu gösterir.</w:t>
       </w:r>
     </w:p>
     <w:bookmarkEnd w:id="37"/>
@@ -12773,7 +12728,16 @@
           <m:t>=</m:t>
         </m:r>
         <m:r>
-          <m:t>14</m:t>
+          <m:t>36</m:t>
+        </m:r>
+        <m:r>
+          <m:rPr>
+            <m:sty m:val="p"/>
+          </m:rPr>
+          <m:t>,</m:t>
+        </m:r>
+        <m:r>
+          <m:t>2</m:t>
         </m:r>
       </m:oMath>
       <w:r>
@@ -12895,7 +12859,7 @@
                         <m:t>,</m:t>
                       </m:r>
                       <m:r>
-                        <m:t>014</m:t>
+                        <m:t>0362</m:t>
                       </m:r>
                     </m:e>
                   </m:d>
@@ -12929,7 +12893,7 @@
             <m:t>,</m:t>
           </m:r>
           <m:r>
-            <m:t>539</m:t>
+            <m:t>029</m:t>
           </m:r>
           <m:r>
             <m:rPr>
@@ -12951,7 +12915,7 @@
                 <m:t>−</m:t>
               </m:r>
               <m:r>
-                <m:t>4</m:t>
+                <m:t>3</m:t>
               </m:r>
             </m:sup>
           </m:sSup>
@@ -12982,7 +12946,7 @@
         <w:pStyle w:val="FirstParagraph"/>
       </w:pPr>
       <w:r>
-        <w:t xml:space="preserve">Ortalama hız:</w:t>
+        <w:t xml:space="preserve">Ortalama hız (ortalama sıcaklıktaki yoğunlukla):</w:t>
       </w:r>
     </w:p>
     <w:p>
@@ -13141,7 +13105,7 @@
                 <m:t>,</m:t>
               </m:r>
               <m:r>
-                <m:t>539</m:t>
+                <m:t>029</m:t>
               </m:r>
               <m:r>
                 <m:rPr>
@@ -13163,7 +13127,7 @@
                     <m:t>−</m:t>
                   </m:r>
                   <m:r>
-                    <m:t>4</m:t>
+                    <m:t>3</m:t>
                   </m:r>
                 </m:sup>
               </m:sSup>
@@ -13176,7 +13140,7 @@
             <m:t>=</m:t>
           </m:r>
           <m:r>
-            <m:t>50</m:t>
+            <m:t>7</m:t>
           </m:r>
           <m:r>
             <m:rPr>
@@ -13185,7 +13149,7 @@
             <m:t>,</m:t>
           </m:r>
           <m:r>
-            <m:t>7</m:t>
+            <m:t>59</m:t>
           </m:r>
           <m:r>
             <m:t> </m:t>
@@ -13289,6 +13253,105 @@
             </m:fPr>
             <m:num>
               <m:r>
+                <m:t>1</m:t>
+              </m:r>
+              <m:r>
+                <m:rPr>
+                  <m:sty m:val="p"/>
+                </m:rPr>
+                <m:t>,</m:t>
+              </m:r>
+              <m:r>
+                <m:t>049</m:t>
+              </m:r>
+              <m:r>
+                <m:rPr>
+                  <m:sty m:val="p"/>
+                </m:rPr>
+                <m:t>×</m:t>
+              </m:r>
+              <m:r>
+                <m:t>7</m:t>
+              </m:r>
+              <m:r>
+                <m:rPr>
+                  <m:sty m:val="p"/>
+                </m:rPr>
+                <m:t>,</m:t>
+              </m:r>
+              <m:r>
+                <m:t>59</m:t>
+              </m:r>
+              <m:r>
+                <m:rPr>
+                  <m:sty m:val="p"/>
+                </m:rPr>
+                <m:t>×</m:t>
+              </m:r>
+              <m:r>
+                <m:t>0</m:t>
+              </m:r>
+              <m:r>
+                <m:rPr>
+                  <m:sty m:val="p"/>
+                </m:rPr>
+                <m:t>,</m:t>
+              </m:r>
+              <m:r>
+                <m:t>0362</m:t>
+              </m:r>
+            </m:num>
+            <m:den>
+              <m:r>
+                <m:t>201</m:t>
+              </m:r>
+              <m:r>
+                <m:rPr>
+                  <m:sty m:val="p"/>
+                </m:rPr>
+                <m:t>,</m:t>
+              </m:r>
+              <m:r>
+                <m:t>8</m:t>
+              </m:r>
+              <m:r>
+                <m:rPr>
+                  <m:sty m:val="p"/>
+                </m:rPr>
+                <m:t>×</m:t>
+              </m:r>
+              <m:sSup>
+                <m:e>
+                  <m:r>
+                    <m:t>10</m:t>
+                  </m:r>
+                </m:e>
+                <m:sup>
+                  <m:r>
+                    <m:rPr>
+                      <m:sty m:val="p"/>
+                    </m:rPr>
+                    <m:t>−</m:t>
+                  </m:r>
+                  <m:r>
+                    <m:t>7</m:t>
+                  </m:r>
+                </m:sup>
+              </m:sSup>
+            </m:den>
+          </m:f>
+          <m:r>
+            <m:rPr>
+              <m:sty m:val="p"/>
+            </m:rPr>
+            <m:t>=</m:t>
+          </m:r>
+          <m:f>
+            <m:fPr>
+              <m:type m:val="bar"/>
+            </m:fPr>
+            <m:num>
+              <m:r>
                 <m:t>4</m:t>
               </m:r>
               <m:acc>
@@ -13400,7 +13463,7 @@
                 <m:t>,</m:t>
               </m:r>
               <m:r>
-                <m:t>014</m:t>
+                <m:t>0362</m:t>
               </m:r>
               <m:r>
                 <m:rPr>
@@ -13456,7 +13519,7 @@
             <m:rPr>
               <m:sty m:val="b"/>
             </m:rPr>
-            <m:t>36</m:t>
+            <m:t>14</m:t>
           </m:r>
           <m:r>
             <m:rPr>
@@ -13468,7 +13531,7 @@
             <m:rPr>
               <m:sty m:val="b"/>
             </m:rPr>
-            <m:t>900</m:t>
+            <m:t>280</m:t>
           </m:r>
         </m:oMath>
       </m:oMathPara>
@@ -13477,8 +13540,34 @@
       <w:pPr>
         <w:pStyle w:val="FirstParagraph"/>
       </w:pPr>
-      <w:r>
-        <w:t xml:space="preserve">Akış türbülanslıdır.</w:t>
+      <m:oMath>
+        <m:r>
+          <m:t>R</m:t>
+        </m:r>
+        <m:r>
+          <m:t>e</m:t>
+        </m:r>
+        <m:r>
+          <m:rPr>
+            <m:sty m:val="p"/>
+          </m:rPr>
+          <m:t>&gt;</m:t>
+        </m:r>
+        <m:r>
+          <m:t>10</m:t>
+        </m:r>
+        <m:r>
+          <m:t> </m:t>
+        </m:r>
+        <m:r>
+          <m:t>000</m:t>
+        </m:r>
+      </m:oMath>
+      <w:r>
+        <w:t xml:space="preserve"> </w:t>
+      </w:r>
+      <w:r>
+        <w:t xml:space="preserve">olduğundan akış türbülanslıdır.</w:t>
       </w:r>
     </w:p>
     <w:p>
@@ -13563,7 +13652,7 @@
             <m:t>=</m:t>
           </m:r>
           <m:r>
-            <m:t>26</m:t>
+            <m:t>70</m:t>
           </m:r>
           <m:r>
             <m:rPr>
@@ -13572,7 +13661,7 @@
             <m:t>−</m:t>
           </m:r>
           <m:r>
-            <m:t>16</m:t>
+            <m:t>42</m:t>
           </m:r>
           <m:r>
             <m:rPr>
@@ -13581,7 +13670,7 @@
             <m:t>=</m:t>
           </m:r>
           <m:r>
-            <m:t>10</m:t>
+            <m:t>28</m:t>
           </m:r>
           <m:r>
             <m:t> </m:t>
@@ -13741,7 +13830,7 @@
               <m:sSup>
                 <m:e>
                   <m:r>
-                    <m:t>026</m:t>
+                    <m:t>070</m:t>
                   </m:r>
                 </m:e>
                 <m:sup>
@@ -13768,7 +13857,7 @@
               <m:sSup>
                 <m:e>
                   <m:r>
-                    <m:t>016</m:t>
+                    <m:t>042</m:t>
                   </m:r>
                 </m:e>
                 <m:sup>
@@ -13785,6 +13874,27 @@
             </m:rPr>
             <m:t>=</m:t>
           </m:r>
+          <m:f>
+            <m:fPr>
+              <m:type m:val="bar"/>
+            </m:fPr>
+            <m:num>
+              <m:r>
+                <m:t>π</m:t>
+              </m:r>
+            </m:num>
+            <m:den>
+              <m:r>
+                <m:t>4</m:t>
+              </m:r>
+            </m:den>
+          </m:f>
+          <m:r>
+            <m:rPr>
+              <m:sty m:val="p"/>
+            </m:rPr>
+            <m:t>×</m:t>
+          </m:r>
           <m:r>
             <m:t>3</m:t>
           </m:r>
@@ -13795,7 +13905,7 @@
             <m:t>,</m:t>
           </m:r>
           <m:r>
-            <m:t>299</m:t>
+            <m:t>136</m:t>
           </m:r>
           <m:r>
             <m:rPr>
@@ -13817,7 +13927,49 @@
                 <m:t>−</m:t>
               </m:r>
               <m:r>
-                <m:t>4</m:t>
+                <m:t>3</m:t>
+              </m:r>
+            </m:sup>
+          </m:sSup>
+          <m:r>
+            <m:rPr>
+              <m:sty m:val="p"/>
+            </m:rPr>
+            <m:t>=</m:t>
+          </m:r>
+          <m:r>
+            <m:t>2</m:t>
+          </m:r>
+          <m:r>
+            <m:rPr>
+              <m:sty m:val="p"/>
+            </m:rPr>
+            <m:t>,</m:t>
+          </m:r>
+          <m:r>
+            <m:t>463</m:t>
+          </m:r>
+          <m:r>
+            <m:rPr>
+              <m:sty m:val="p"/>
+            </m:rPr>
+            <m:t>×</m:t>
+          </m:r>
+          <m:sSup>
+            <m:e>
+              <m:r>
+                <m:t>10</m:t>
+              </m:r>
+            </m:e>
+            <m:sup>
+              <m:r>
+                <m:rPr>
+                  <m:sty m:val="p"/>
+                </m:rPr>
+                <m:t>−</m:t>
+              </m:r>
+              <m:r>
+                <m:t>3</m:t>
               </m:r>
             </m:sup>
           </m:sSup>
@@ -13886,6 +14038,70 @@
               <m:type m:val="bar"/>
             </m:fPr>
             <m:num>
+              <m:sSub>
+                <m:e>
+                  <m:acc>
+                    <m:accPr>
+                      <m:chr m:val="̇"/>
+                    </m:accPr>
+                    <m:e>
+                      <m:r>
+                        <m:t>m</m:t>
+                      </m:r>
+                    </m:e>
+                  </m:acc>
+                </m:e>
+                <m:sub>
+                  <m:r>
+                    <m:t>s</m:t>
+                  </m:r>
+                  <m:r>
+                    <m:t>u</m:t>
+                  </m:r>
+                </m:sub>
+              </m:sSub>
+            </m:num>
+            <m:den>
+              <m:r>
+                <m:t>ρ</m:t>
+              </m:r>
+              <m:sSub>
+                <m:e>
+                  <m:r>
+                    <m:t>A</m:t>
+                  </m:r>
+                </m:e>
+                <m:sub>
+                  <m:r>
+                    <m:t>h</m:t>
+                  </m:r>
+                  <m:r>
+                    <m:t>a</m:t>
+                  </m:r>
+                  <m:r>
+                    <m:t>l</m:t>
+                  </m:r>
+                  <m:r>
+                    <m:t>k</m:t>
+                  </m:r>
+                  <m:r>
+                    <m:t>a</m:t>
+                  </m:r>
+                </m:sub>
+              </m:sSub>
+            </m:den>
+          </m:f>
+          <m:r>
+            <m:rPr>
+              <m:sty m:val="p"/>
+            </m:rPr>
+            <m:t>=</m:t>
+          </m:r>
+          <m:f>
+            <m:fPr>
+              <m:type m:val="bar"/>
+            </m:fPr>
+            <m:num>
               <m:r>
                 <m:t>0</m:t>
               </m:r>
@@ -13919,7 +14135,7 @@
                 <m:t>×</m:t>
               </m:r>
               <m:r>
-                <m:t>3</m:t>
+                <m:t>2</m:t>
               </m:r>
               <m:r>
                 <m:rPr>
@@ -13928,7 +14144,7 @@
                 <m:t>,</m:t>
               </m:r>
               <m:r>
-                <m:t>299</m:t>
+                <m:t>463</m:t>
               </m:r>
               <m:r>
                 <m:rPr>
@@ -13950,7 +14166,7 @@
                     <m:t>−</m:t>
                   </m:r>
                   <m:r>
-                    <m:t>4</m:t>
+                    <m:t>3</m:t>
                   </m:r>
                 </m:sup>
               </m:sSup>
@@ -13972,7 +14188,7 @@
             <m:t>,</m:t>
           </m:r>
           <m:r>
-            <m:t>572</m:t>
+            <m:t>0767</m:t>
           </m:r>
           <m:r>
             <m:t> </m:t>
@@ -14034,6 +14250,42 @@
             </m:fPr>
             <m:num>
               <m:r>
+                <m:t>ρ</m:t>
+              </m:r>
+              <m:r>
+                <m:t>V</m:t>
+              </m:r>
+              <m:sSub>
+                <m:e>
+                  <m:r>
+                    <m:t>D</m:t>
+                  </m:r>
+                </m:e>
+                <m:sub>
+                  <m:r>
+                    <m:t>h</m:t>
+                  </m:r>
+                </m:sub>
+              </m:sSub>
+            </m:num>
+            <m:den>
+              <m:r>
+                <m:t>μ</m:t>
+              </m:r>
+            </m:den>
+          </m:f>
+          <m:r>
+            <m:rPr>
+              <m:sty m:val="p"/>
+            </m:rPr>
+            <m:t>=</m:t>
+          </m:r>
+          <m:f>
+            <m:fPr>
+              <m:type m:val="bar"/>
+            </m:fPr>
+            <m:num>
+              <m:r>
                 <m:t>997</m:t>
               </m:r>
               <m:r>
@@ -14061,7 +14313,7 @@
                 <m:t>,</m:t>
               </m:r>
               <m:r>
-                <m:t>572</m:t>
+                <m:t>0767</m:t>
               </m:r>
               <m:r>
                 <m:rPr>
@@ -14079,7 +14331,7 @@
                 <m:t>,</m:t>
               </m:r>
               <m:r>
-                <m:t>010</m:t>
+                <m:t>028</m:t>
               </m:r>
             </m:num>
             <m:den>
@@ -14131,7 +14383,7 @@
             <m:rPr>
               <m:sty m:val="b"/>
             </m:rPr>
-            <m:t>6</m:t>
+            <m:t>2</m:t>
           </m:r>
           <m:r>
             <m:rPr>
@@ -14143,7 +14395,7 @@
             <m:rPr>
               <m:sty m:val="b"/>
             </m:rPr>
-            <m:t>160</m:t>
+            <m:t>310</m:t>
           </m:r>
         </m:oMath>
       </m:oMathPara>
@@ -14154,41 +14406,26 @@
       </w:pPr>
       <m:oMath>
         <m:r>
-          <m:t>2300</m:t>
+          <m:t>R</m:t>
+        </m:r>
+        <m:r>
+          <m:t>e</m:t>
         </m:r>
         <m:r>
           <m:rPr>
             <m:sty m:val="p"/>
           </m:rPr>
-          <m:t>&lt;</m:t>
-        </m:r>
-        <m:r>
-          <m:t>R</m:t>
-        </m:r>
-        <m:r>
-          <m:t>e</m:t>
-        </m:r>
-        <m:r>
-          <m:rPr>
-            <m:sty m:val="p"/>
-          </m:rPr>
-          <m:t>&lt;</m:t>
-        </m:r>
-        <m:r>
-          <m:t>10</m:t>
-        </m:r>
-        <m:r>
-          <m:t> </m:t>
-        </m:r>
-        <m:r>
-          <m:t>000</m:t>
+          <m:t>≈</m:t>
+        </m:r>
+        <m:r>
+          <m:t>2300</m:t>
         </m:r>
       </m:oMath>
       <w:r>
         <w:t xml:space="preserve"> </w:t>
       </w:r>
       <w:r>
-        <w:t xml:space="preserve">olduğundan akış</w:t>
+        <w:t xml:space="preserve">olduğundan su akışı</w:t>
       </w:r>
       <w:r>
         <w:t xml:space="preserve"> </w:t>
@@ -14198,10 +14435,10 @@
           <w:bCs/>
           <w:b/>
         </w:rPr>
-        <w:t xml:space="preserve">geçiş bölgesindedir</w:t>
-      </w:r>
-      <w:r>
-        <w:t xml:space="preserve">.</w:t>
+        <w:t xml:space="preserve">laminer–geçiş sınırındadır</w:t>
+      </w:r>
+      <w:r>
+        <w:t xml:space="preserve">. Halkanın kesiti geniş olduğu için su çok yavaş (≈ 7,7 cm/s) akmaktadır.</w:t>
       </w:r>
     </w:p>
     <w:bookmarkEnd w:id="38"/>
@@ -14328,13 +14565,13 @@
                 </m:dPr>
                 <m:e>
                   <m:r>
-                    <m:t>36</m:t>
+                    <m:t>14</m:t>
                   </m:r>
                   <m:r>
                     <m:t> </m:t>
                   </m:r>
                   <m:r>
-                    <m:t>900</m:t>
+                    <m:t>280</m:t>
                   </m:r>
                 </m:e>
               </m:d>
@@ -14419,7 +14656,7 @@
             <m:t>×</m:t>
           </m:r>
           <m:r>
-            <m:t>4506</m:t>
+            <m:t>2107</m:t>
           </m:r>
           <m:r>
             <m:rPr>
@@ -14437,7 +14674,7 @@
             <m:t>,</m:t>
           </m:r>
           <m:r>
-            <m:t>8995</m:t>
+            <m:t>8994</m:t>
           </m:r>
           <m:r>
             <m:rPr>
@@ -14449,7 +14686,7 @@
             <m:rPr>
               <m:sty m:val="b"/>
             </m:rPr>
-            <m:t>93</m:t>
+            <m:t>43</m:t>
           </m:r>
           <m:r>
             <m:rPr>
@@ -14461,7 +14698,7 @@
             <m:rPr>
               <m:sty m:val="b"/>
             </m:rPr>
-            <m:t>2</m:t>
+            <m:t>6</m:t>
           </m:r>
         </m:oMath>
       </m:oMathPara>
@@ -14541,7 +14778,7 @@
             </m:fPr>
             <m:num>
               <m:r>
-                <m:t>93</m:t>
+                <m:t>43</m:t>
               </m:r>
               <m:r>
                 <m:rPr>
@@ -14550,7 +14787,7 @@
                 <m:t>,</m:t>
               </m:r>
               <m:r>
-                <m:t>2</m:t>
+                <m:t>6</m:t>
               </m:r>
               <m:r>
                 <m:rPr>
@@ -14582,7 +14819,7 @@
                 <m:t>,</m:t>
               </m:r>
               <m:r>
-                <m:t>014</m:t>
+                <m:t>0362</m:t>
               </m:r>
             </m:den>
           </m:f>
@@ -14596,7 +14833,19 @@
             <m:rPr>
               <m:sty m:val="b"/>
             </m:rPr>
-            <m:t>193</m:t>
+            <m:t>34</m:t>
+          </m:r>
+          <m:r>
+            <m:rPr>
+              <m:sty m:val="b"/>
+            </m:rPr>
+            <m:t>,</m:t>
+          </m:r>
+          <m:r>
+            <m:rPr>
+              <m:sty m:val="b"/>
+            </m:rPr>
+            <m:t>9</m:t>
           </m:r>
           <m:r>
             <m:rPr>
@@ -14689,7 +14938,14 @@
           <w:bCs/>
           <w:b/>
         </w:rPr>
-        <w:t xml:space="preserve">:</w:t>
+        <w:t xml:space="preserve"> </w:t>
+      </w:r>
+      <w:r>
+        <w:rPr>
+          <w:bCs/>
+          <w:b/>
+        </w:rPr>
+        <w:t xml:space="preserve">(föydeki Dittus–Boelter bağıntısı):</w:t>
       </w:r>
     </w:p>
     <w:p>
@@ -14751,13 +15007,13 @@
                 </m:dPr>
                 <m:e>
                   <m:r>
-                    <m:t>6</m:t>
+                    <m:t>2</m:t>
                   </m:r>
                   <m:r>
                     <m:t> </m:t>
                   </m:r>
                   <m:r>
-                    <m:t>160</m:t>
+                    <m:t>310</m:t>
                   </m:r>
                 </m:e>
               </m:d>
@@ -14842,7 +15098,16 @@
             <m:t>×</m:t>
           </m:r>
           <m:r>
-            <m:t>1076</m:t>
+            <m:t>490</m:t>
+          </m:r>
+          <m:r>
+            <m:rPr>
+              <m:sty m:val="p"/>
+            </m:rPr>
+            <m:t>,</m:t>
+          </m:r>
+          <m:r>
+            <m:t>7</m:t>
           </m:r>
           <m:r>
             <m:rPr>
@@ -14872,7 +15137,7 @@
             <m:rPr>
               <m:sty m:val="b"/>
             </m:rPr>
-            <m:t>51</m:t>
+            <m:t>23</m:t>
           </m:r>
           <m:r>
             <m:rPr>
@@ -14884,7 +15149,7 @@
             <m:rPr>
               <m:sty m:val="b"/>
             </m:rPr>
-            <m:t>9</m:t>
+            <m:t>7</m:t>
           </m:r>
         </m:oMath>
       </m:oMathPara>
@@ -14967,7 +15232,7 @@
             </m:fPr>
             <m:num>
               <m:r>
-                <m:t>51</m:t>
+                <m:t>23</m:t>
               </m:r>
               <m:r>
                 <m:rPr>
@@ -14976,7 +15241,7 @@
                 <m:t>,</m:t>
               </m:r>
               <m:r>
-                <m:t>9</m:t>
+                <m:t>7</m:t>
               </m:r>
               <m:r>
                 <m:rPr>
@@ -15008,7 +15273,7 @@
                 <m:t>,</m:t>
               </m:r>
               <m:r>
-                <m:t>010</m:t>
+                <m:t>028</m:t>
               </m:r>
             </m:den>
           </m:f>
@@ -15022,7 +15287,7 @@
             <m:rPr>
               <m:sty m:val="b"/>
             </m:rPr>
-            <m:t>3158</m:t>
+            <m:t>514</m:t>
           </m:r>
           <m:r>
             <m:rPr>
@@ -15090,70 +15355,136 @@
           <m:rPr>
             <m:sty m:val="p"/>
           </m:rPr>
-          <m:t>&lt;</m:t>
-        </m:r>
-        <m:r>
-          <m:t>10</m:t>
-        </m:r>
-        <m:r>
-          <m:t> </m:t>
-        </m:r>
-        <m:r>
-          <m:t>000</m:t>
+          <m:t>≈</m:t>
+        </m:r>
+        <m:r>
+          <m:t>2300</m:t>
         </m:r>
       </m:oMath>
       <w:r>
         <w:t xml:space="preserve"> </w:t>
       </w:r>
       <w:r>
-        <w:t xml:space="preserve">olduğu için, kontrol amacıyla geçiş bölgesinde de geçerli olan Gnielinski bağıntısı da uygulanmıştır (</w:t>
+        <w:t xml:space="preserve">olduğu için Dittus–Boelter’in geçerlilik aralığının çok dışındayız (Gnielinski bağıntısı da ancak</w:t>
+      </w:r>
+      <w:r>
+        <w:t xml:space="preserve"> </w:t>
       </w:r>
       <m:oMath>
         <m:r>
-          <m:t>3000</m:t>
+          <m:t>R</m:t>
+        </m:r>
+        <m:r>
+          <m:t>e</m:t>
         </m:r>
         <m:r>
           <m:rPr>
             <m:sty m:val="p"/>
           </m:rPr>
-          <m:t>≤</m:t>
-        </m:r>
-        <m:r>
-          <m:t>R</m:t>
-        </m:r>
-        <m:r>
-          <m:t>e</m:t>
-        </m:r>
+          <m:t>≥</m:t>
+        </m:r>
+        <m:r>
+          <m:t>3000</m:t>
+        </m:r>
+      </m:oMath>
+      <w:r>
+        <w:t xml:space="preserve"> </w:t>
+      </w:r>
+      <w:r>
+        <w:t xml:space="preserve">için geçerlidir). Bu nedenle kontrol amacıyla</w:t>
+      </w:r>
+      <w:r>
+        <w:t xml:space="preserve"> </w:t>
+      </w:r>
+      <w:r>
+        <w:rPr>
+          <w:bCs/>
+          <w:b/>
+        </w:rPr>
+        <w:t xml:space="preserve">laminer, tam gelişmiş halkasal akış</w:t>
+      </w:r>
+      <w:r>
+        <w:t xml:space="preserve"> </w:t>
+      </w:r>
+      <w:r>
+        <w:t xml:space="preserve">için de hesap yapılmıştır. İç yüzeyden ısıtılan, dış yüzeyi yalıtılmış halka için Nusselt sayısı [1, Tablo 8.2]’den</w:t>
+      </w:r>
+      <w:r>
+        <w:t xml:space="preserve"> </w:t>
+      </w:r>
+      <m:oMath>
+        <m:sSub>
+          <m:e>
+            <m:r>
+              <m:t>D</m:t>
+            </m:r>
+          </m:e>
+          <m:sub>
+            <m:r>
+              <m:t>i</m:t>
+            </m:r>
+          </m:sub>
+        </m:sSub>
         <m:r>
           <m:rPr>
             <m:sty m:val="p"/>
           </m:rPr>
-          <m:t>≤</m:t>
-        </m:r>
-        <m:r>
-          <m:t>5</m:t>
-        </m:r>
+          <m:t>/</m:t>
+        </m:r>
+        <m:sSub>
+          <m:e>
+            <m:r>
+              <m:t>D</m:t>
+            </m:r>
+          </m:e>
+          <m:sub>
+            <m:r>
+              <m:t>o</m:t>
+            </m:r>
+          </m:sub>
+        </m:sSub>
         <m:r>
           <m:rPr>
             <m:sty m:val="p"/>
           </m:rPr>
-          <m:t>×</m:t>
-        </m:r>
-        <m:sSup>
-          <m:e>
-            <m:r>
-              <m:t>10</m:t>
-            </m:r>
-          </m:e>
-          <m:sup>
-            <m:r>
-              <m:t>6</m:t>
-            </m:r>
-          </m:sup>
-        </m:sSup>
+          <m:t>=</m:t>
+        </m:r>
+        <m:r>
+          <m:t>42</m:t>
+        </m:r>
+        <m:r>
+          <m:rPr>
+            <m:sty m:val="p"/>
+          </m:rPr>
+          <m:t>/</m:t>
+        </m:r>
+        <m:r>
+          <m:t>70</m:t>
+        </m:r>
+        <m:r>
+          <m:rPr>
+            <m:sty m:val="p"/>
+          </m:rPr>
+          <m:t>=</m:t>
+        </m:r>
+        <m:r>
+          <m:t>0</m:t>
+        </m:r>
+        <m:r>
+          <m:rPr>
+            <m:sty m:val="p"/>
+          </m:rPr>
+          <m:t>,</m:t>
+        </m:r>
+        <m:r>
+          <m:t>60</m:t>
+        </m:r>
       </m:oMath>
       <w:r>
-        <w:t xml:space="preserve">) [1, Denk. 8.62]. Sürtünme faktörü:</w:t>
+        <w:t xml:space="preserve"> </w:t>
+      </w:r>
+      <w:r>
+        <w:t xml:space="preserve">değerinde enterpolasyonla alınır:</w:t>
       </w:r>
     </w:p>
     <w:p>
@@ -15166,70 +15497,61 @@
         </m:oMathParaPr>
         <m:oMath>
           <m:r>
-            <m:t>f</m:t>
-          </m:r>
+            <m:t>N</m:t>
+          </m:r>
+          <m:sSub>
+            <m:e>
+              <m:r>
+                <m:t>u</m:t>
+              </m:r>
+            </m:e>
+            <m:sub>
+              <m:r>
+                <m:t>i</m:t>
+              </m:r>
+            </m:sub>
+          </m:sSub>
           <m:r>
             <m:rPr>
               <m:sty m:val="p"/>
             </m:rPr>
             <m:t>=</m:t>
           </m:r>
-          <m:sSup>
-            <m:e>
-              <m:d>
-                <m:dPr>
-                  <m:begChr m:val="("/>
-                  <m:endChr m:val=")"/>
-                  <m:sepChr m:val=""/>
-                  <m:grow/>
-                </m:dPr>
-                <m:e>
-                  <m:r>
-                    <m:t>0</m:t>
-                  </m:r>
-                  <m:r>
-                    <m:rPr>
-                      <m:sty m:val="p"/>
-                    </m:rPr>
-                    <m:t>,</m:t>
-                  </m:r>
-                  <m:r>
-                    <m:t>790</m:t>
-                  </m:r>
-                  <m:r>
-                    <m:rPr>
-                      <m:sty m:val="p"/>
-                    </m:rPr>
-                    <m:t>ln</m:t>
-                  </m:r>
-                  <m:r>
-                    <m:t>R</m:t>
-                  </m:r>
-                  <m:r>
-                    <m:t>e</m:t>
-                  </m:r>
-                  <m:r>
-                    <m:rPr>
-                      <m:sty m:val="p"/>
-                    </m:rPr>
-                    <m:t>−</m:t>
-                  </m:r>
-                  <m:r>
-                    <m:t>1</m:t>
-                  </m:r>
-                  <m:r>
-                    <m:rPr>
-                      <m:sty m:val="p"/>
-                    </m:rPr>
-                    <m:t>,</m:t>
-                  </m:r>
-                  <m:r>
-                    <m:t>64</m:t>
-                  </m:r>
-                </m:e>
-              </m:d>
-            </m:e>
-            <m:sup>
+          <m:r>
+            <m:t>5</m:t>
+          </m:r>
+          <m:r>
+            <m:rPr>
+              <m:sty m:val="p"/>
+            </m:rPr>
+            <m:t>,</m:t>
+          </m:r>
+          <m:r>
+            <m:t>74</m:t>
+          </m:r>
+          <m:r>
+            <m:rPr>
+              <m:sty m:val="p"/>
+            </m:rPr>
+            <m:t>+</m:t>
+          </m:r>
+          <m:f>
+            <m:fPr>
+              <m:type m:val="bar"/>
+            </m:fPr>
+            <m:num>
+              <m:r>
+                <m:t>0</m:t>
+              </m:r>
+              <m:r>
+                <m:rPr>
+                  <m:sty m:val="p"/>
+                </m:rPr>
+                <m:t>,</m:t>
+              </m:r>
+              <m:r>
+                <m:t>60</m:t>
+              </m:r>
               <m:r>
                 <m:rPr>
                   <m:sty m:val="p"/>
@@ -15237,10 +15559,94 @@
                 <m:t>−</m:t>
               </m:r>
               <m:r>
-                <m:t>2</m:t>
-              </m:r>
-            </m:sup>
-          </m:sSup>
+                <m:t>0</m:t>
+              </m:r>
+              <m:r>
+                <m:rPr>
+                  <m:sty m:val="p"/>
+                </m:rPr>
+                <m:t>,</m:t>
+              </m:r>
+              <m:r>
+                <m:t>50</m:t>
+              </m:r>
+            </m:num>
+            <m:den>
+              <m:r>
+                <m:t>1</m:t>
+              </m:r>
+              <m:r>
+                <m:rPr>
+                  <m:sty m:val="p"/>
+                </m:rPr>
+                <m:t>,</m:t>
+              </m:r>
+              <m:r>
+                <m:t>00</m:t>
+              </m:r>
+              <m:r>
+                <m:rPr>
+                  <m:sty m:val="p"/>
+                </m:rPr>
+                <m:t>−</m:t>
+              </m:r>
+              <m:r>
+                <m:t>0</m:t>
+              </m:r>
+              <m:r>
+                <m:rPr>
+                  <m:sty m:val="p"/>
+                </m:rPr>
+                <m:t>,</m:t>
+              </m:r>
+              <m:r>
+                <m:t>50</m:t>
+              </m:r>
+            </m:den>
+          </m:f>
+          <m:r>
+            <m:t> </m:t>
+          </m:r>
+          <m:d>
+            <m:dPr>
+              <m:begChr m:val="("/>
+              <m:endChr m:val=")"/>
+              <m:sepChr m:val=""/>
+              <m:grow/>
+            </m:dPr>
+            <m:e>
+              <m:r>
+                <m:t>4</m:t>
+              </m:r>
+              <m:r>
+                <m:rPr>
+                  <m:sty m:val="p"/>
+                </m:rPr>
+                <m:t>,</m:t>
+              </m:r>
+              <m:r>
+                <m:t>86</m:t>
+              </m:r>
+              <m:r>
+                <m:rPr>
+                  <m:sty m:val="p"/>
+                </m:rPr>
+                <m:t>−</m:t>
+              </m:r>
+              <m:r>
+                <m:t>5</m:t>
+              </m:r>
+              <m:r>
+                <m:rPr>
+                  <m:sty m:val="p"/>
+                </m:rPr>
+                <m:t>,</m:t>
+              </m:r>
+              <m:r>
+                <m:t>74</m:t>
+              </m:r>
+            </m:e>
+          </m:d>
           <m:r>
             <m:rPr>
               <m:sty m:val="p"/>
@@ -15248,7 +15654,7 @@
             <m:t>=</m:t>
           </m:r>
           <m:r>
-            <m:t>0</m:t>
+            <m:t>5</m:t>
           </m:r>
           <m:r>
             <m:rPr>
@@ -15257,7 +15663,7 @@
             <m:t>,</m:t>
           </m:r>
           <m:r>
-            <m:t>0362</m:t>
+            <m:t>56</m:t>
           </m:r>
         </m:oMath>
       </m:oMathPara>
@@ -15265,26 +15671,45 @@
     <w:p>
       <w:pPr>
         <w:pStyle w:val="FirstParagraph"/>
-      </w:pPr>
-      <w:r>
-        <w:t xml:space="preserve">Nusselt sayısı:</w:t>
-      </w:r>
-    </w:p>
-    <w:p>
-      <w:pPr>
-        <w:pStyle w:val="BodyText"/>
       </w:pPr>
       <m:oMathPara>
         <m:oMathParaPr>
           <m:jc m:val="center"/>
         </m:oMathParaPr>
         <m:oMath>
-          <m:r>
-            <m:t>N</m:t>
-          </m:r>
-          <m:r>
-            <m:t>u</m:t>
-          </m:r>
+          <m:sSub>
+            <m:e>
+              <m:r>
+                <m:t>h</m:t>
+              </m:r>
+            </m:e>
+            <m:sub>
+              <m:r>
+                <m:t>d</m:t>
+              </m:r>
+              <m:r>
+                <m:t>ı</m:t>
+              </m:r>
+              <m:r>
+                <m:t>ş</m:t>
+              </m:r>
+              <m:r>
+                <m:rPr>
+                  <m:sty m:val="p"/>
+                </m:rPr>
+                <m:t>,</m:t>
+              </m:r>
+              <m:r>
+                <m:t>l</m:t>
+              </m:r>
+              <m:r>
+                <m:t>a</m:t>
+              </m:r>
+              <m:r>
+                <m:t>m</m:t>
+              </m:r>
+            </m:sub>
+          </m:sSub>
           <m:r>
             <m:rPr>
               <m:sty m:val="p"/>
@@ -15296,72 +15721,8 @@
               <m:type m:val="bar"/>
             </m:fPr>
             <m:num>
-              <m:d>
-                <m:dPr>
-                  <m:begChr m:val="("/>
-                  <m:endChr m:val=")"/>
-                  <m:sepChr m:val=""/>
-                  <m:grow/>
-                </m:dPr>
-                <m:e>
-                  <m:r>
-                    <m:t>f</m:t>
-                  </m:r>
-                  <m:r>
-                    <m:rPr>
-                      <m:sty m:val="p"/>
-                    </m:rPr>
-                    <m:t>/</m:t>
-                  </m:r>
-                  <m:r>
-                    <m:t>8</m:t>
-                  </m:r>
-                </m:e>
-              </m:d>
-              <m:d>
-                <m:dPr>
-                  <m:begChr m:val="("/>
-                  <m:endChr m:val=")"/>
-                  <m:sepChr m:val=""/>
-                  <m:grow/>
-                </m:dPr>
-                <m:e>
-                  <m:r>
-                    <m:t>R</m:t>
-                  </m:r>
-                  <m:r>
-                    <m:t>e</m:t>
-                  </m:r>
-                  <m:r>
-                    <m:rPr>
-                      <m:sty m:val="p"/>
-                    </m:rPr>
-                    <m:t>−</m:t>
-                  </m:r>
-                  <m:r>
-                    <m:t>1000</m:t>
-                  </m:r>
-                </m:e>
-              </m:d>
-              <m:r>
-                <m:t>P</m:t>
-              </m:r>
-              <m:r>
-                <m:t>r</m:t>
-              </m:r>
-            </m:num>
-            <m:den>
-              <m:r>
-                <m:t>1</m:t>
-              </m:r>
-              <m:r>
-                <m:rPr>
-                  <m:sty m:val="p"/>
-                </m:rPr>
-                <m:t>+</m:t>
-              </m:r>
-              <m:r>
-                <m:t>12</m:t>
+              <m:r>
+                <m:t>5</m:t>
               </m:r>
               <m:r>
                 <m:rPr>
@@ -15370,74 +15731,40 @@
                 <m:t>,</m:t>
               </m:r>
               <m:r>
-                <m:t>7</m:t>
-              </m:r>
-              <m:rad>
-                <m:radPr>
-                  <m:degHide m:val="on"/>
-                </m:radPr>
-                <m:deg/>
-                <m:e>
-                  <m:r>
-                    <m:t>f</m:t>
-                  </m:r>
-                  <m:r>
-                    <m:rPr>
-                      <m:sty m:val="p"/>
-                    </m:rPr>
-                    <m:t>/</m:t>
-                  </m:r>
-                  <m:r>
-                    <m:t>8</m:t>
-                  </m:r>
-                </m:e>
-              </m:rad>
-              <m:r>
-                <m:t> </m:t>
-              </m:r>
-              <m:d>
-                <m:dPr>
-                  <m:begChr m:val="("/>
-                  <m:endChr m:val=")"/>
-                  <m:sepChr m:val=""/>
-                  <m:grow/>
-                </m:dPr>
-                <m:e>
-                  <m:r>
-                    <m:t>P</m:t>
-                  </m:r>
-                  <m:sSup>
-                    <m:e>
-                      <m:r>
-                        <m:t>r</m:t>
-                      </m:r>
-                    </m:e>
-                    <m:sup>
-                      <m:r>
-                        <m:t>2</m:t>
-                      </m:r>
-                      <m:r>
-                        <m:rPr>
-                          <m:sty m:val="p"/>
-                        </m:rPr>
-                        <m:t>/</m:t>
-                      </m:r>
-                      <m:r>
-                        <m:t>3</m:t>
-                      </m:r>
-                    </m:sup>
-                  </m:sSup>
-                  <m:r>
-                    <m:rPr>
-                      <m:sty m:val="p"/>
-                    </m:rPr>
-                    <m:t>−</m:t>
-                  </m:r>
-                  <m:r>
-                    <m:t>1</m:t>
-                  </m:r>
-                </m:e>
-              </m:d>
+                <m:t>56</m:t>
+              </m:r>
+              <m:r>
+                <m:rPr>
+                  <m:sty m:val="p"/>
+                </m:rPr>
+                <m:t>×</m:t>
+              </m:r>
+              <m:r>
+                <m:t>0</m:t>
+              </m:r>
+              <m:r>
+                <m:rPr>
+                  <m:sty m:val="p"/>
+                </m:rPr>
+                <m:t>,</m:t>
+              </m:r>
+              <m:r>
+                <m:t>608</m:t>
+              </m:r>
+            </m:num>
+            <m:den>
+              <m:r>
+                <m:t>0</m:t>
+              </m:r>
+              <m:r>
+                <m:rPr>
+                  <m:sty m:val="p"/>
+                </m:rPr>
+                <m:t>,</m:t>
+              </m:r>
+              <m:r>
+                <m:t>028</m:t>
+              </m:r>
             </m:den>
           </m:f>
           <m:r>
@@ -15447,16 +15774,33 @@
             <m:t>=</m:t>
           </m:r>
           <m:r>
-            <m:t>48</m:t>
-          </m:r>
-          <m:r>
-            <m:rPr>
-              <m:sty m:val="p"/>
-            </m:rPr>
-            <m:t>,</m:t>
-          </m:r>
-          <m:r>
-            <m:t>3</m:t>
+            <m:t>121</m:t>
+          </m:r>
+          <m:r>
+            <m:t> </m:t>
+          </m:r>
+          <m:sSup>
+            <m:e>
+              <m:r>
+                <m:rPr>
+                  <m:nor/>
+                  <m:sty m:val="p"/>
+                </m:rPr>
+                <m:t>W/m</m:t>
+              </m:r>
+            </m:e>
+            <m:sup>
+              <m:r>
+                <m:t>2</m:t>
+              </m:r>
+            </m:sup>
+          </m:sSup>
+          <m:r>
+            <m:rPr>
+              <m:nor/>
+              <m:sty m:val="p"/>
+            </m:rPr>
+            <m:t>K</m:t>
           </m:r>
         </m:oMath>
       </m:oMathPara>
@@ -15466,7 +15810,36 @@
         <w:pStyle w:val="FirstParagraph"/>
       </w:pPr>
       <w:r>
-        <w:t xml:space="preserve">Buradan</w:t>
+        <w:t xml:space="preserve">Gerçek değer bu iki sınır (121–514 W/m²K) arasındadır. Geçiş bölgesindeki akışta Dittus–Boelter</w:t>
+      </w:r>
+      <w:r>
+        <w:t xml:space="preserve"> </w:t>
+      </w:r>
+      <m:oMath>
+        <m:r>
+          <m:t>h</m:t>
+        </m:r>
+      </m:oMath>
+      <w:r>
+        <w:t xml:space="preserve">’yi olduğundan büyük tahmin eder.</w:t>
+      </w:r>
+    </w:p>
+    <w:bookmarkEnd w:id="39"/>
+    <w:bookmarkStart w:id="40" w:name="X17e05d0840def9d84ceeaa6ec3be800a9b45fa0"/>
+    <w:p>
+      <w:pPr>
+        <w:pStyle w:val="Heading3"/>
+      </w:pPr>
+      <w:r>
+        <w:t xml:space="preserve">6.9 Teorik toplam ısı geçiş katsayısı (İstenen 7)</w:t>
+      </w:r>
+    </w:p>
+    <w:p>
+      <w:pPr>
+        <w:pStyle w:val="FirstParagraph"/>
+      </w:pPr>
+      <w:r>
+        <w:t xml:space="preserve">Yarıçaplar:</w:t>
       </w:r>
       <w:r>
         <w:t xml:space="preserve"> </w:t>
@@ -15475,18 +15848,12 @@
         <m:sSub>
           <m:e>
             <m:r>
-              <m:t>h</m:t>
+              <m:t>r</m:t>
             </m:r>
           </m:e>
           <m:sub>
             <m:r>
-              <m:t>d</m:t>
-            </m:r>
-            <m:r>
-              <m:t>ı</m:t>
-            </m:r>
-            <m:r>
-              <m:t>ş</m:t>
+              <m:t>1</m:t>
             </m:r>
           </m:sub>
         </m:sSub>
@@ -15497,32 +15864,23 @@
           <m:t>=</m:t>
         </m:r>
         <m:r>
-          <m:t>2940</m:t>
+          <m:t>18</m:t>
+        </m:r>
+        <m:r>
+          <m:rPr>
+            <m:sty m:val="p"/>
+          </m:rPr>
+          <m:t>,</m:t>
+        </m:r>
+        <m:r>
+          <m:t>1</m:t>
         </m:r>
       </m:oMath>
       <w:r>
         <w:t xml:space="preserve"> </w:t>
       </w:r>
       <w:r>
-        <w:t xml:space="preserve">W/m²K bulunur. Bu değer Dittus–Boelter sonucundan yalnızca ~%7 farklıdır.</w:t>
-      </w:r>
-    </w:p>
-    <w:bookmarkEnd w:id="39"/>
-    <w:bookmarkStart w:id="40" w:name="X17e05d0840def9d84ceeaa6ec3be800a9b45fa0"/>
-    <w:p>
-      <w:pPr>
-        <w:pStyle w:val="Heading3"/>
-      </w:pPr>
-      <w:r>
-        <w:t xml:space="preserve">6.9 Teorik toplam ısı geçiş katsayısı (İstenen 7)</w:t>
-      </w:r>
-    </w:p>
-    <w:p>
-      <w:pPr>
-        <w:pStyle w:val="FirstParagraph"/>
-      </w:pPr>
-      <w:r>
-        <w:t xml:space="preserve">Yarıçaplar:</w:t>
+        <w:t xml:space="preserve">mm,</w:t>
       </w:r>
       <w:r>
         <w:t xml:space="preserve"> </w:t>
@@ -15536,7 +15894,7 @@
           </m:e>
           <m:sub>
             <m:r>
-              <m:t>1</m:t>
+              <m:t>2</m:t>
             </m:r>
           </m:sub>
         </m:sSub>
@@ -15547,14 +15905,14 @@
           <m:t>=</m:t>
         </m:r>
         <m:r>
-          <m:t>7</m:t>
+          <m:t>21</m:t>
         </m:r>
       </m:oMath>
       <w:r>
         <w:t xml:space="preserve"> </w:t>
       </w:r>
       <w:r>
-        <w:t xml:space="preserve">mm,</w:t>
+        <w:t xml:space="preserve">mm. Denklem (17)’deki terimler (iç borunun dış yüzeyine göre, m²K/W,</w:t>
       </w:r>
       <w:r>
         <w:t xml:space="preserve"> </w:t>
@@ -15563,30 +15921,27 @@
         <m:sSub>
           <m:e>
             <m:r>
-              <m:t>r</m:t>
+              <m:t>h</m:t>
             </m:r>
           </m:e>
           <m:sub>
             <m:r>
-              <m:t>2</m:t>
+              <m:t>d</m:t>
+            </m:r>
+            <m:r>
+              <m:t>ı</m:t>
+            </m:r>
+            <m:r>
+              <m:t>ş</m:t>
             </m:r>
           </m:sub>
         </m:sSub>
-        <m:r>
-          <m:rPr>
-            <m:sty m:val="p"/>
-          </m:rPr>
-          <m:t>=</m:t>
-        </m:r>
-        <m:r>
-          <m:t>8</m:t>
-        </m:r>
       </m:oMath>
       <w:r>
         <w:t xml:space="preserve"> </w:t>
       </w:r>
       <w:r>
-        <w:t xml:space="preserve">mm. Denklem (17)’deki terimler (iç borunun dış yüzeyine göre, m²K/W):</w:t>
+        <w:t xml:space="preserve">Dittus–Boelter ile):</w:t>
       </w:r>
     </w:p>
     <w:tbl>
@@ -15744,7 +16099,7 @@
                     <m:t>,</m:t>
                   </m:r>
                   <m:r>
-                    <m:t>008</m:t>
+                    <m:t>021</m:t>
                   </m:r>
                 </m:num>
                 <m:den>
@@ -15758,7 +16113,7 @@
                     <m:t>,</m:t>
                   </m:r>
                   <m:r>
-                    <m:t>007</m:t>
+                    <m:t>0181</m:t>
                   </m:r>
                   <m:r>
                     <m:rPr>
@@ -15767,7 +16122,16 @@
                     <m:t>×</m:t>
                   </m:r>
                   <m:r>
-                    <m:t>193</m:t>
+                    <m:t>34</m:t>
+                  </m:r>
+                  <m:r>
+                    <m:rPr>
+                      <m:sty m:val="p"/>
+                    </m:rPr>
+                    <m:t>,</m:t>
+                  </m:r>
+                  <m:r>
+                    <m:t>9</m:t>
                   </m:r>
                 </m:den>
               </m:f>
@@ -15783,7 +16147,7 @@
             </w:pPr>
             <m:oMath>
               <m:r>
-                <m:t>5</m:t>
+                <m:t>3</m:t>
               </m:r>
               <m:r>
                 <m:rPr>
@@ -15792,7 +16156,7 @@
                 <m:t>,</m:t>
               </m:r>
               <m:r>
-                <m:t>920</m:t>
+                <m:t>323</m:t>
               </m:r>
               <m:r>
                 <m:rPr>
@@ -15814,7 +16178,7 @@
                     <m:t>−</m:t>
                   </m:r>
                   <m:r>
-                    <m:t>3</m:t>
+                    <m:t>2</m:t>
                   </m:r>
                 </m:sup>
               </m:sSup>
@@ -15829,7 +16193,7 @@
               <w:jc w:val="left"/>
             </w:pPr>
             <w:r>
-              <w:t xml:space="preserve">%94,7</w:t>
+              <w:t xml:space="preserve">%94,3</w:t>
             </w:r>
           </w:p>
         </w:tc>
@@ -15938,7 +16302,7 @@
                     <m:t>,</m:t>
                   </m:r>
                   <m:r>
-                    <m:t>008</m:t>
+                    <m:t>021</m:t>
                   </m:r>
                 </m:num>
                 <m:den>
@@ -15968,12 +16332,21 @@
                 </m:fPr>
                 <m:num>
                   <m:r>
-                    <m:t>8</m:t>
+                    <m:t>21</m:t>
                   </m:r>
                 </m:num>
                 <m:den>
                   <m:r>
-                    <m:t>7</m:t>
+                    <m:t>18</m:t>
+                  </m:r>
+                  <m:r>
+                    <m:rPr>
+                      <m:sty m:val="p"/>
+                    </m:rPr>
+                    <m:t>,</m:t>
+                  </m:r>
+                  <m:r>
+                    <m:t>1</m:t>
                   </m:r>
                 </m:den>
               </m:f>
@@ -15989,7 +16362,7 @@
             </w:pPr>
             <m:oMath>
               <m:r>
-                <m:t>1</m:t>
+                <m:t>5</m:t>
               </m:r>
               <m:r>
                 <m:rPr>
@@ -15998,7 +16371,7 @@
                 <m:t>,</m:t>
               </m:r>
               <m:r>
-                <m:t>77</m:t>
+                <m:t>16</m:t>
               </m:r>
               <m:r>
                 <m:rPr>
@@ -16035,7 +16408,7 @@
               <w:jc w:val="left"/>
             </w:pPr>
             <w:r>
-              <w:t xml:space="preserve">%0,3</w:t>
+              <w:t xml:space="preserve">%0,15</w:t>
             </w:r>
           </w:p>
         </w:tc>
@@ -16107,7 +16480,7 @@
                 </m:num>
                 <m:den>
                   <m:r>
-                    <m:t>3158</m:t>
+                    <m:t>514</m:t>
                   </m:r>
                 </m:den>
               </m:f>
@@ -16123,7 +16496,7 @@
             </w:pPr>
             <m:oMath>
               <m:r>
-                <m:t>3</m:t>
+                <m:t>1</m:t>
               </m:r>
               <m:r>
                 <m:rPr>
@@ -16132,7 +16505,7 @@
                 <m:t>,</m:t>
               </m:r>
               <m:r>
-                <m:t>167</m:t>
+                <m:t>944</m:t>
               </m:r>
               <m:r>
                 <m:rPr>
@@ -16154,7 +16527,7 @@
                     <m:t>−</m:t>
                   </m:r>
                   <m:r>
-                    <m:t>4</m:t>
+                    <m:t>3</m:t>
                   </m:r>
                 </m:sup>
               </m:sSup>
@@ -16169,7 +16542,7 @@
               <w:jc w:val="left"/>
             </w:pPr>
             <w:r>
-              <w:t xml:space="preserve">%5,1</w:t>
+              <w:t xml:space="preserve">%5,5</w:t>
             </w:r>
           </w:p>
         </w:tc>
@@ -16208,7 +16581,7 @@
             </w:pPr>
             <m:oMath>
               <m:r>
-                <m:t>6</m:t>
+                <m:t>3</m:t>
               </m:r>
               <m:r>
                 <m:rPr>
@@ -16217,7 +16590,7 @@
                 <m:t>,</m:t>
               </m:r>
               <m:r>
-                <m:t>254</m:t>
+                <m:t>523</m:t>
               </m:r>
               <m:r>
                 <m:rPr>
@@ -16239,7 +16612,7 @@
                     <m:t>−</m:t>
                   </m:r>
                   <m:r>
-                    <m:t>3</m:t>
+                    <m:t>2</m:t>
                   </m:r>
                 </m:sup>
               </m:sSup>
@@ -16309,7 +16682,7 @@
             </m:num>
             <m:den>
               <m:r>
-                <m:t>6</m:t>
+                <m:t>3</m:t>
               </m:r>
               <m:r>
                 <m:rPr>
@@ -16318,7 +16691,7 @@
                 <m:t>,</m:t>
               </m:r>
               <m:r>
-                <m:t>254</m:t>
+                <m:t>523</m:t>
               </m:r>
               <m:r>
                 <m:rPr>
@@ -16340,7 +16713,7 @@
                     <m:t>−</m:t>
                   </m:r>
                   <m:r>
-                    <m:t>3</m:t>
+                    <m:t>2</m:t>
                   </m:r>
                 </m:sup>
               </m:sSup>
@@ -16356,7 +16729,7 @@
             <m:rPr>
               <m:sty m:val="b"/>
             </m:rPr>
-            <m:t>159</m:t>
+            <m:t>28</m:t>
           </m:r>
           <m:r>
             <m:rPr>
@@ -16368,7 +16741,7 @@
             <m:rPr>
               <m:sty m:val="b"/>
             </m:rPr>
-            <m:t>9</m:t>
+            <m:t>4</m:t>
           </m:r>
           <m:r>
             <m:rPr>
@@ -16420,63 +16793,7 @@
         <w:pStyle w:val="FirstParagraph"/>
       </w:pPr>
       <w:r>
-        <w:t xml:space="preserve">Su tarafında Gnielinski kullanılırsa</w:t>
-      </w:r>
-      <w:r>
-        <w:t xml:space="preserve"> </w:t>
-      </w:r>
-      <m:oMath>
-        <m:sSub>
-          <m:e>
-            <m:r>
-              <m:t>U</m:t>
-            </m:r>
-          </m:e>
-          <m:sub>
-            <m:r>
-              <m:t>t</m:t>
-            </m:r>
-            <m:r>
-              <m:t>e</m:t>
-            </m:r>
-            <m:r>
-              <m:t>o</m:t>
-            </m:r>
-            <m:r>
-              <m:t>r</m:t>
-            </m:r>
-            <m:r>
-              <m:t>i</m:t>
-            </m:r>
-            <m:r>
-              <m:t>k</m:t>
-            </m:r>
-          </m:sub>
-        </m:sSub>
-        <m:r>
-          <m:rPr>
-            <m:sty m:val="p"/>
-          </m:rPr>
-          <m:t>=</m:t>
-        </m:r>
-        <m:r>
-          <m:t>159</m:t>
-        </m:r>
-        <m:r>
-          <m:rPr>
-            <m:sty m:val="p"/>
-          </m:rPr>
-          <m:t>,</m:t>
-        </m:r>
-        <m:r>
-          <m:t>3</m:t>
-        </m:r>
-      </m:oMath>
-      <w:r>
-        <w:t xml:space="preserve"> </w:t>
-      </w:r>
-      <w:r>
-        <w:t xml:space="preserve">W/m²K bulunur; sonuç neredeyse değişmez. Denklem (16) ile teorik ısı akışı:</w:t>
+        <w:t xml:space="preserve">Denklem (16) ile teorik ısı akışı:</w:t>
       </w:r>
     </w:p>
     <w:p>
@@ -16561,7 +16878,7 @@
             <m:t>=</m:t>
           </m:r>
           <m:r>
-            <m:t>159</m:t>
+            <m:t>28</m:t>
           </m:r>
           <m:r>
             <m:rPr>
@@ -16570,7 +16887,7 @@
             <m:t>,</m:t>
           </m:r>
           <m:r>
-            <m:t>9</m:t>
+            <m:t>4</m:t>
           </m:r>
           <m:r>
             <m:rPr>
@@ -16588,7 +16905,7 @@
             <m:t>,</m:t>
           </m:r>
           <m:r>
-            <m:t>05027</m:t>
+            <m:t>2177</m:t>
           </m:r>
           <m:r>
             <m:rPr>
@@ -16615,7 +16932,16 @@
             <m:t>=</m:t>
           </m:r>
           <m:r>
-            <m:t>311</m:t>
+            <m:t>239</m:t>
+          </m:r>
+          <m:r>
+            <m:rPr>
+              <m:sty m:val="p"/>
+            </m:rPr>
+            <m:t>,</m:t>
+          </m:r>
+          <m:r>
+            <m:t>5</m:t>
           </m:r>
           <m:r>
             <m:t> </m:t>
@@ -16633,6 +16959,168 @@
     <w:p>
       <w:pPr>
         <w:pStyle w:val="FirstParagraph"/>
+      </w:pPr>
+      <w:r>
+        <w:t xml:space="preserve">Su tarafı için laminer değer (</w:t>
+      </w:r>
+      <m:oMath>
+        <m:sSub>
+          <m:e>
+            <m:r>
+              <m:t>h</m:t>
+            </m:r>
+          </m:e>
+          <m:sub>
+            <m:r>
+              <m:t>d</m:t>
+            </m:r>
+            <m:r>
+              <m:t>ı</m:t>
+            </m:r>
+            <m:r>
+              <m:t>ş</m:t>
+            </m:r>
+          </m:sub>
+        </m:sSub>
+        <m:r>
+          <m:rPr>
+            <m:sty m:val="p"/>
+          </m:rPr>
+          <m:t>=</m:t>
+        </m:r>
+        <m:r>
+          <m:t>121</m:t>
+        </m:r>
+      </m:oMath>
+      <w:r>
+        <w:t xml:space="preserve"> </w:t>
+      </w:r>
+      <w:r>
+        <w:t xml:space="preserve">W/m²K) kullanılırsa dış direnç</w:t>
+      </w:r>
+      <w:r>
+        <w:t xml:space="preserve"> </w:t>
+      </w:r>
+      <m:oMath>
+        <m:r>
+          <m:t>8</m:t>
+        </m:r>
+        <m:r>
+          <m:rPr>
+            <m:sty m:val="p"/>
+          </m:rPr>
+          <m:t>,</m:t>
+        </m:r>
+        <m:r>
+          <m:t>27</m:t>
+        </m:r>
+        <m:r>
+          <m:rPr>
+            <m:sty m:val="p"/>
+          </m:rPr>
+          <m:t>×</m:t>
+        </m:r>
+        <m:sSup>
+          <m:e>
+            <m:r>
+              <m:t>10</m:t>
+            </m:r>
+          </m:e>
+          <m:sup>
+            <m:r>
+              <m:rPr>
+                <m:sty m:val="p"/>
+              </m:rPr>
+              <m:t>−</m:t>
+            </m:r>
+            <m:r>
+              <m:t>3</m:t>
+            </m:r>
+          </m:sup>
+        </m:sSup>
+      </m:oMath>
+      <w:r>
+        <w:t xml:space="preserve"> </w:t>
+      </w:r>
+      <w:r>
+        <w:t xml:space="preserve">m²K/W olur (toplamın %20’si) ve</w:t>
+      </w:r>
+      <w:r>
+        <w:t xml:space="preserve"> </w:t>
+      </w:r>
+      <m:oMath>
+        <m:sSub>
+          <m:e>
+            <m:r>
+              <m:t>U</m:t>
+            </m:r>
+          </m:e>
+          <m:sub>
+            <m:r>
+              <m:t>t</m:t>
+            </m:r>
+            <m:r>
+              <m:t>e</m:t>
+            </m:r>
+            <m:r>
+              <m:t>o</m:t>
+            </m:r>
+            <m:r>
+              <m:t>r</m:t>
+            </m:r>
+            <m:r>
+              <m:t>i</m:t>
+            </m:r>
+            <m:r>
+              <m:t>k</m:t>
+            </m:r>
+          </m:sub>
+        </m:sSub>
+        <m:r>
+          <m:rPr>
+            <m:sty m:val="p"/>
+          </m:rPr>
+          <m:t>=</m:t>
+        </m:r>
+        <m:r>
+          <m:t>24</m:t>
+        </m:r>
+        <m:r>
+          <m:rPr>
+            <m:sty m:val="p"/>
+          </m:rPr>
+          <m:t>,</m:t>
+        </m:r>
+        <m:r>
+          <m:t>1</m:t>
+        </m:r>
+      </m:oMath>
+      <w:r>
+        <w:t xml:space="preserve"> </w:t>
+      </w:r>
+      <w:r>
+        <w:t xml:space="preserve">W/m²K bulunur. Yani teorik U, su tarafındaki belirsizliğe bağlı olarak</w:t>
+      </w:r>
+      <w:r>
+        <w:t xml:space="preserve"> </w:t>
+      </w:r>
+      <w:r>
+        <w:rPr>
+          <w:bCs/>
+          <w:b/>
+        </w:rPr>
+        <w:t xml:space="preserve">24,1–28,4 W/m²K</w:t>
+      </w:r>
+      <w:r>
+        <w:t xml:space="preserve"> </w:t>
+      </w:r>
+      <w:r>
+        <w:t xml:space="preserve">aralığındadır.</w:t>
+      </w:r>
+    </w:p>
+    <w:p>
+      <w:pPr>
+        <w:pStyle w:val="BodyText"/>
       </w:pPr>
       <w:r>
         <w:rPr>
@@ -16877,13 +17365,13 @@
                 <m:t>=</m:t>
               </m:r>
               <m:r>
-                <m:t>36</m:t>
+                <m:t>14</m:t>
               </m:r>
               <m:r>
                 <m:t> </m:t>
               </m:r>
               <m:r>
-                <m:t>900</m:t>
+                <m:t>280</m:t>
               </m:r>
             </m:oMath>
             <w:r>
@@ -16915,20 +17403,20 @@
                 <m:t>=</m:t>
               </m:r>
               <m:r>
-                <m:t>6</m:t>
+                <m:t>2</m:t>
               </m:r>
               <m:r>
                 <m:t> </m:t>
               </m:r>
               <m:r>
-                <m:t>160</m:t>
+                <m:t>310</m:t>
               </m:r>
             </m:oMath>
             <w:r>
               <w:t xml:space="preserve"> </w:t>
             </w:r>
             <w:r>
-              <w:t xml:space="preserve">✘ (geçiş bölgesi)</w:t>
+              <w:t xml:space="preserve">✘ (laminer–geçiş sınırı)</w:t>
             </w:r>
           </w:p>
         </w:tc>
@@ -17017,6 +17505,15 @@
                 <m:rPr>
                   <m:sty m:val="p"/>
                 </m:rPr>
+                <m:t>,</m:t>
+              </m:r>
+              <m:r>
+                <m:t>65</m:t>
+              </m:r>
+              <m:r>
+                <m:rPr>
+                  <m:sty m:val="p"/>
+                </m:rPr>
                 <m:t>/</m:t>
               </m:r>
               <m:r>
@@ -17029,7 +17526,7 @@
                 <m:t>,</m:t>
               </m:r>
               <m:r>
-                <m:t>014</m:t>
+                <m:t>0362</m:t>
               </m:r>
               <m:r>
                 <m:rPr>
@@ -17038,7 +17535,16 @@
                 <m:t>=</m:t>
               </m:r>
               <m:r>
-                <m:t>71</m:t>
+                <m:t>45</m:t>
+              </m:r>
+              <m:r>
+                <m:rPr>
+                  <m:sty m:val="p"/>
+                </m:rPr>
+                <m:t>,</m:t>
+              </m:r>
+              <m:r>
+                <m:t>6</m:t>
               </m:r>
             </m:oMath>
             <w:r>
@@ -17091,6 +17597,15 @@
                 <m:rPr>
                   <m:sty m:val="p"/>
                 </m:rPr>
+                <m:t>,</m:t>
+              </m:r>
+              <m:r>
+                <m:t>65</m:t>
+              </m:r>
+              <m:r>
+                <m:rPr>
+                  <m:sty m:val="p"/>
+                </m:rPr>
                 <m:t>/</m:t>
               </m:r>
               <m:r>
@@ -17103,7 +17618,7 @@
                 <m:t>,</m:t>
               </m:r>
               <m:r>
-                <m:t>010</m:t>
+                <m:t>028</m:t>
               </m:r>
               <m:r>
                 <m:rPr>
@@ -17112,7 +17627,16 @@
                 <m:t>=</m:t>
               </m:r>
               <m:r>
-                <m:t>100</m:t>
+                <m:t>58</m:t>
+              </m:r>
+              <m:r>
+                <m:rPr>
+                  <m:sty m:val="p"/>
+                </m:rPr>
+                <m:t>,</m:t>
+              </m:r>
+              <m:r>
+                <m:t>9</m:t>
               </m:r>
             </m:oMath>
             <w:r>
@@ -17143,7 +17667,18 @@
         <w:t xml:space="preserve">sağlanmamaktadır</w:t>
       </w:r>
       <w:r>
-        <w:t xml:space="preserve">. Su debisi düşük, halkanın hidrolik çapı küçük ve suyun viskozitesi yüksek olduğu için akış tam türbülanslı değildir. Dittus–Boelter bu bölgede taşınım katsayısını genelde olduğundan büyük tahmin eder. Ancak su tarafının toplam dirence katkısı yalnızca %5 olduğundan, bu hatanın</w:t>
+        <w:t xml:space="preserve">: su debisi halkanın geniş kesitine (2,46×10⁻³ m²) göre küçük olduğundan hız düşük, suyun viskozitesi de yüksektir. Bu yüzden akış türbülanslı değildir ve Dittus–Boelter su tarafında</w:t>
+      </w:r>
+      <w:r>
+        <w:t xml:space="preserve"> </w:t>
+      </w:r>
+      <m:oMath>
+        <m:r>
+          <m:t>h</m:t>
+        </m:r>
+      </m:oMath>
+      <w:r>
+        <w:t xml:space="preserve">’yi olduğundan büyük verir. Ancak toplam direncin büyük kısmı hava tarafında olduğundan, bu hatanın</w:t>
       </w:r>
       <w:r>
         <w:t xml:space="preserve"> </w:t>
@@ -17181,7 +17716,176 @@
         <w:t xml:space="preserve"> </w:t>
       </w:r>
       <w:r>
-        <w:t xml:space="preserve">üzerindeki etkisi küçüktür (Gnielinski ile fark %0,4). Ayrıca Dittus–Boelter dairesel boru için türetilmiştir. Halkasal kesitte hidrolik çap yaklaşımı yaklaşık sonuç verir; özellikle iç çeper ısıtıldığında halkada gerçek Nu değeri farklı olabilir [1, Bölüm 8.6].</w:t>
+        <w:t xml:space="preserve">üzerindeki etkisi sınırlıdır (%15). Ayrıca Dittus–Boelter dairesel boru için türetilmiştir; halkasal kesitte hidrolik çap yaklaşımı yaklaşık sonuç verir [1, Bölüm 8.6]. Laminer bölgede tam gelişmiş akış için gereken giriş uzunluğu da (</w:t>
+      </w:r>
+      <m:oMath>
+        <m:sSub>
+          <m:e>
+            <m:r>
+              <m:t>x</m:t>
+            </m:r>
+          </m:e>
+          <m:sub>
+            <m:r>
+              <m:t>f</m:t>
+            </m:r>
+            <m:r>
+              <m:t>d</m:t>
+            </m:r>
+            <m:r>
+              <m:rPr>
+                <m:sty m:val="p"/>
+              </m:rPr>
+              <m:t>,</m:t>
+            </m:r>
+            <m:r>
+              <m:t>t</m:t>
+            </m:r>
+          </m:sub>
+        </m:sSub>
+        <m:r>
+          <m:rPr>
+            <m:sty m:val="p"/>
+          </m:rPr>
+          <m:t>≈</m:t>
+        </m:r>
+        <m:r>
+          <m:t>0</m:t>
+        </m:r>
+        <m:r>
+          <m:rPr>
+            <m:sty m:val="p"/>
+          </m:rPr>
+          <m:t>,</m:t>
+        </m:r>
+        <m:r>
+          <m:t>05</m:t>
+        </m:r>
+        <m:r>
+          <m:t> </m:t>
+        </m:r>
+        <m:r>
+          <m:t>R</m:t>
+        </m:r>
+        <m:r>
+          <m:t>e</m:t>
+        </m:r>
+        <m:r>
+          <m:t> </m:t>
+        </m:r>
+        <m:r>
+          <m:t>P</m:t>
+        </m:r>
+        <m:r>
+          <m:t>r</m:t>
+        </m:r>
+        <m:r>
+          <m:t> </m:t>
+        </m:r>
+        <m:sSub>
+          <m:e>
+            <m:r>
+              <m:t>D</m:t>
+            </m:r>
+          </m:e>
+          <m:sub>
+            <m:r>
+              <m:t>h</m:t>
+            </m:r>
+          </m:sub>
+        </m:sSub>
+        <m:r>
+          <m:rPr>
+            <m:sty m:val="p"/>
+          </m:rPr>
+          <m:t>≈</m:t>
+        </m:r>
+        <m:r>
+          <m:t>0</m:t>
+        </m:r>
+        <m:r>
+          <m:rPr>
+            <m:sty m:val="p"/>
+          </m:rPr>
+          <m:t>,</m:t>
+        </m:r>
+        <m:r>
+          <m:t>05</m:t>
+        </m:r>
+        <m:r>
+          <m:rPr>
+            <m:sty m:val="p"/>
+          </m:rPr>
+          <m:t>×</m:t>
+        </m:r>
+        <m:r>
+          <m:t>2310</m:t>
+        </m:r>
+        <m:r>
+          <m:rPr>
+            <m:sty m:val="p"/>
+          </m:rPr>
+          <m:t>×</m:t>
+        </m:r>
+        <m:r>
+          <m:t>6</m:t>
+        </m:r>
+        <m:r>
+          <m:rPr>
+            <m:sty m:val="p"/>
+          </m:rPr>
+          <m:t>,</m:t>
+        </m:r>
+        <m:r>
+          <m:t>4</m:t>
+        </m:r>
+        <m:r>
+          <m:rPr>
+            <m:sty m:val="p"/>
+          </m:rPr>
+          <m:t>×</m:t>
+        </m:r>
+        <m:r>
+          <m:t>0</m:t>
+        </m:r>
+        <m:r>
+          <m:rPr>
+            <m:sty m:val="p"/>
+          </m:rPr>
+          <m:t>,</m:t>
+        </m:r>
+        <m:r>
+          <m:t>028</m:t>
+        </m:r>
+        <m:r>
+          <m:rPr>
+            <m:sty m:val="p"/>
+          </m:rPr>
+          <m:t>≈</m:t>
+        </m:r>
+        <m:r>
+          <m:t>20</m:t>
+        </m:r>
+      </m:oMath>
+      <w:r>
+        <w:t xml:space="preserve"> </w:t>
+      </w:r>
+      <w:r>
+        <w:t xml:space="preserve">m) boru boyundan çok büyüktür; yani su tarafında akış ısıl olarak gelişmekte olan bölgededir ve gerçek</w:t>
+      </w:r>
+      <w:r>
+        <w:t xml:space="preserve"> </w:t>
+      </w:r>
+      <m:oMath>
+        <m:r>
+          <m:t>h</m:t>
+        </m:r>
+      </m:oMath>
+      <w:r>
+        <w:t xml:space="preserve"> </w:t>
+      </w:r>
+      <w:r>
+        <w:t xml:space="preserve">tam gelişmiş laminer değerden yüksektir.</w:t>
       </w:r>
     </w:p>
     <w:p>
@@ -17319,7 +18023,7 @@
             </m:fPr>
             <m:num>
               <m:r>
-                <m:t>159</m:t>
+                <m:t>28</m:t>
               </m:r>
               <m:r>
                 <m:rPr>
@@ -17328,7 +18032,7 @@
                 <m:t>,</m:t>
               </m:r>
               <m:r>
-                <m:t>9</m:t>
+                <m:t>4</m:t>
               </m:r>
               <m:r>
                 <m:rPr>
@@ -17337,7 +18041,7 @@
                 <m:t>−</m:t>
               </m:r>
               <m:r>
-                <m:t>111</m:t>
+                <m:t>25</m:t>
               </m:r>
               <m:r>
                 <m:rPr>
@@ -17346,12 +18050,12 @@
                 <m:t>,</m:t>
               </m:r>
               <m:r>
-                <m:t>6</m:t>
+                <m:t>8</m:t>
               </m:r>
             </m:num>
             <m:den>
               <m:r>
-                <m:t>159</m:t>
+                <m:t>28</m:t>
               </m:r>
               <m:r>
                 <m:rPr>
@@ -17360,7 +18064,7 @@
                 <m:t>,</m:t>
               </m:r>
               <m:r>
-                <m:t>9</m:t>
+                <m:t>4</m:t>
               </m:r>
             </m:den>
           </m:f>
@@ -17377,7 +18081,16 @@
             <m:t>%</m:t>
           </m:r>
           <m:r>
-            <m:t>30</m:t>
+            <m:t>9</m:t>
+          </m:r>
+          <m:r>
+            <m:rPr>
+              <m:sty m:val="p"/>
+            </m:rPr>
+            <m:t>,</m:t>
+          </m:r>
+          <m:r>
+            <m:t>3</m:t>
           </m:r>
         </m:oMath>
       </m:oMathPara>
@@ -17387,7 +18100,20 @@
         <w:pStyle w:val="FirstParagraph"/>
       </w:pPr>
       <w:r>
-        <w:t xml:space="preserve">Deneysel değer teorik değerden ~%30 düşüktür. Olası nedenler:</w:t>
+        <w:t xml:space="preserve">Deneysel değer, föydeki Dittus–Boelter ile bulunan teorik değerden yaklaşık %9 düşüktür ve laminer kabulle bulunan alt sınırdan (24,1 W/m²K) biraz yüksektir; yani</w:t>
+      </w:r>
+      <w:r>
+        <w:t xml:space="preserve"> </w:t>
+      </w:r>
+      <w:r>
+        <w:rPr>
+          <w:bCs/>
+          <w:b/>
+        </w:rPr>
+        <w:t xml:space="preserve">deneysel U, teorik aralığın içindedir</w:t>
+      </w:r>
+      <w:r>
+        <w:t xml:space="preserve">. Dittus–Boelter’in kendi belirsizliğinin ±%25 mertebesinde olduğu [1] düşünülürse uyum iyidir. Kalan farkın olası nedenleri:</w:t>
       </w:r>
     </w:p>
     <w:p>
@@ -17403,13 +18129,42 @@
           <w:bCs/>
           <w:b/>
         </w:rPr>
-        <w:t xml:space="preserve">Kirlilik (fouling) direnci:</w:t>
-      </w:r>
-      <w:r>
-        <w:t xml:space="preserve"> </w:t>
-      </w:r>
-      <w:r>
-        <w:t xml:space="preserve">Kullanılmış bir düzenekte çelik borunun su tarafında kireç/pas, hava tarafında is/toz birikir. Bu ek dirençler teorik hesapta yoktur.</w:t>
+        <w:t xml:space="preserve">Su tarafının rejimi:</w:t>
+      </w:r>
+      <w:r>
+        <w:t xml:space="preserve"> </w:t>
+      </w:r>
+      <w:r>
+        <w:t xml:space="preserve">Su tarafı türbülanslı kabul edilerek hesaplanmıştır; gerçekte akış laminer–geçiş bölgesindedir ve</w:t>
+      </w:r>
+      <w:r>
+        <w:t xml:space="preserve"> </w:t>
+      </w:r>
+      <m:oMath>
+        <m:sSub>
+          <m:e>
+            <m:r>
+              <m:t>h</m:t>
+            </m:r>
+          </m:e>
+          <m:sub>
+            <m:r>
+              <m:t>d</m:t>
+            </m:r>
+            <m:r>
+              <m:t>ı</m:t>
+            </m:r>
+            <m:r>
+              <m:t>ş</m:t>
+            </m:r>
+          </m:sub>
+        </m:sSub>
+      </m:oMath>
+      <w:r>
+        <w:t xml:space="preserve"> </w:t>
+      </w:r>
+      <w:r>
+        <w:t xml:space="preserve">daha düşüktür. Bu tek başına farkın büyük kısmını açıklar.</w:t>
       </w:r>
     </w:p>
     <w:p>
@@ -17425,24 +18180,13 @@
           <w:bCs/>
           <w:b/>
         </w:rPr>
-        <w:t xml:space="preserve">Giriş bölgesi ve tam gelişmemiş akış:</w:t>
-      </w:r>
-      <w:r>
-        <w:t xml:space="preserve"> </w:t>
-      </w:r>
-      <w:r>
-        <w:t xml:space="preserve">Bağıntılar tam gelişmiş akış içindir. Bu fark normalde girişte</w:t>
-      </w:r>
-      <w:r>
-        <w:t xml:space="preserve"> </w:t>
-      </w:r>
-      <m:oMath>
-        <m:r>
-          <m:t>h</m:t>
-        </m:r>
-      </m:oMath>
-      <w:r>
-        <w:t xml:space="preserve">’yi artırır, ancak giriş ağzındaki akış düzensizlikleri ve bağlantı parçaları belirsizlik yaratır.</w:t>
+        <w:t xml:space="preserve">Kirlilik (fouling) direnci:</w:t>
+      </w:r>
+      <w:r>
+        <w:t xml:space="preserve"> </w:t>
+      </w:r>
+      <w:r>
+        <w:t xml:space="preserve">Kullanılmış bir düzenekte çelik borunun su tarafında kireç/pas, hava tarafında is/toz birikir. Bu ek dirençler teorik hesapta yoktur.</w:t>
       </w:r>
     </w:p>
     <w:p>
@@ -17464,7 +18208,7 @@
         <w:t xml:space="preserve"> </w:t>
       </w:r>
       <w:r>
-        <w:t xml:space="preserve">Dittus–Boelter’in kendi hata payı ±%25 mertebesindedir [1]. Su tarafında geçiş bölgesi koşulu da sağlanmamaktadır.</w:t>
+        <w:t xml:space="preserve">Dittus–Boelter ±%25 belirsizlik taşır; halkasal kesit için hidrolik çap yaklaşımı da ayrıca hata getirir.</w:t>
       </w:r>
     </w:p>
     <w:p>
@@ -17525,7 +18269,7 @@
         <w:t xml:space="preserve"> </w:t>
       </w:r>
       <w:r>
-        <w:t xml:space="preserve">değişir. Ortalama sıcaklıkta özellik almak bir yaklaşımdır. Ayrıca cidar ile akışkan arasındaki sıcaklık farkı büyük olduğundan, özellik değişimi düzeltmesi (Sieder–Tate gibi) ihmal edilmiştir.</w:t>
+        <w:t xml:space="preserve">değişir. Ortalama sıcaklıkta özellik almak bir yaklaşımdır.</w:t>
       </w:r>
     </w:p>
     <w:p>
@@ -17621,7 +18365,7 @@
         </m:sSub>
       </m:oMath>
       <w:r>
-        <w:t xml:space="preserve">’ya bağlıdır. Hava venturisi boyutları ve</w:t>
+        <w:t xml:space="preserve">’ya bağlıdır. Hava venturisi boyutlarının kabulü,</w:t>
       </w:r>
       <w:r>
         <w:t xml:space="preserve"> </w:t>
@@ -17644,79 +18388,7 @@
         <w:t xml:space="preserve"> </w:t>
       </w:r>
       <w:r>
-        <w:t xml:space="preserve">kabulü, ısıl çift hataları ve</w:t>
-      </w:r>
-      <w:r>
-        <w:t xml:space="preserve"> </w:t>
-      </w:r>
-      <m:oMath>
-        <m:r>
-          <m:t>L</m:t>
-        </m:r>
-      </m:oMath>
-      <w:r>
-        <w:t xml:space="preserve"> </w:t>
-      </w:r>
-      <w:r>
-        <w:t xml:space="preserve">kabulü bu değeri etkiler. Örneğin gerçek</w:t>
-      </w:r>
-      <w:r>
-        <w:t xml:space="preserve"> </w:t>
-      </w:r>
-      <m:oMath>
-        <m:r>
-          <m:t>L</m:t>
-        </m:r>
-      </m:oMath>
-      <w:r>
-        <w:t xml:space="preserve"> </w:t>
-      </w:r>
-      <w:r>
-        <w:t xml:space="preserve">1 m’den kısaysa</w:t>
-      </w:r>
-      <w:r>
-        <w:t xml:space="preserve"> </w:t>
-      </w:r>
-      <m:oMath>
-        <m:sSub>
-          <m:e>
-            <m:r>
-              <m:t>U</m:t>
-            </m:r>
-          </m:e>
-          <m:sub>
-            <m:r>
-              <m:t>d</m:t>
-            </m:r>
-            <m:r>
-              <m:t>e</m:t>
-            </m:r>
-            <m:r>
-              <m:t>n</m:t>
-            </m:r>
-            <m:r>
-              <m:t>e</m:t>
-            </m:r>
-            <m:r>
-              <m:t>y</m:t>
-            </m:r>
-            <m:r>
-              <m:t>s</m:t>
-            </m:r>
-            <m:r>
-              <m:t>e</m:t>
-            </m:r>
-            <m:r>
-              <m:t>l</m:t>
-            </m:r>
-          </m:sub>
-        </m:sSub>
-      </m:oMath>
-      <w:r>
-        <w:t xml:space="preserve"> </w:t>
-      </w:r>
-      <w:r>
-        <w:t xml:space="preserve">artar ve fark kapanır.</w:t>
+        <w:t xml:space="preserve">ve ısıl çift hataları bu değeri etkiler.</w:t>
       </w:r>
     </w:p>
     <w:p>
@@ -17732,35 +18404,13 @@
           <w:bCs/>
           <w:b/>
         </w:rPr>
-        <w:t xml:space="preserve">Isı kayıpları:</w:t>
-      </w:r>
-      <w:r>
-        <w:t xml:space="preserve"> </w:t>
-      </w:r>
-      <w:r>
-        <w:t xml:space="preserve">Havanın venturi/ısıtıcı ile ısı değiştirici arasındaki borularda çevreye ısı vermesi ve uçlardaki eksenel iletim, gerçek ısı geçişini etkiler.</w:t>
-      </w:r>
-    </w:p>
-    <w:p>
-      <w:pPr>
-        <w:numPr>
-          <w:ilvl w:val="0"/>
-          <w:numId w:val="1008"/>
-        </w:numPr>
-        <w:pStyle w:val="Compact"/>
-      </w:pPr>
-      <w:r>
-        <w:rPr>
-          <w:bCs/>
-          <w:b/>
-        </w:rPr>
-        <w:t xml:space="preserve">Yüzey pürüzlülüğü ve geometri:</w:t>
-      </w:r>
-      <w:r>
-        <w:t xml:space="preserve"> </w:t>
-      </w:r>
-      <w:r>
-        <w:t xml:space="preserve">Bağıntılar düzgün, eş merkezli borular içindir. İç borunun kovan içinde tam merkezde olmaması (eksantriklik) halka tarafındaki taşınımı değiştirir.</w:t>
+        <w:t xml:space="preserve">Isı kayıpları ve geometri:</w:t>
+      </w:r>
+      <w:r>
+        <w:t xml:space="preserve"> </w:t>
+      </w:r>
+      <w:r>
+        <w:t xml:space="preserve">Havanın ısıtıcı ile ısı değiştirici arasındaki borularda çevreye ısı vermesi, uçlardaki bağlantı parçaları ve iç borunun kovan içinde tam merkezde olmaması (eksantriklik) gerçek ısı geçişini değiştirir.</w:t>
       </w:r>
     </w:p>
     <w:bookmarkEnd w:id="40"/>
@@ -17792,7 +18442,7 @@
         <w:t xml:space="preserve"> </w:t>
       </w:r>
       <w:r>
-        <w:t xml:space="preserve">Toplam direncin ~%95’i hava tarafındadır (</w:t>
+        <w:t xml:space="preserve">Toplam direncin %80–95’i hava tarafındadır (</w:t>
       </w:r>
       <m:oMath>
         <m:sSub>
@@ -17817,7 +18467,7 @@
           <m:t>≈</m:t>
         </m:r>
         <m:r>
-          <m:t>193</m:t>
+          <m:t>35</m:t>
         </m:r>
         <m:r>
           <m:rPr>
@@ -17850,14 +18500,11 @@
           <m:t>≈</m:t>
         </m:r>
         <m:r>
-          <m:t>3160</m:t>
+          <m:t>121</m:t>
         </m:r>
       </m:oMath>
       <w:r>
-        <w:t xml:space="preserve"> </w:t>
-      </w:r>
-      <w:r>
-        <w:t xml:space="preserve">W/m²K). Bu nedenle</w:t>
+        <w:t xml:space="preserve">–514 W/m²K). Bu nedenle</w:t>
       </w:r>
       <w:r>
         <w:t xml:space="preserve"> </w:t>
@@ -17891,7 +18538,7 @@
         </m:sSub>
       </m:oMath>
       <w:r>
-        <w:t xml:space="preserve">’nin biraz altında kalır. Su debisini artırmak ısı geçişini neredeyse hiç iyileştirmez; yalnızca pompa gücünü artırır. Cidar direnci (%0,3) ihmal edilebilir, yani boru malzemesini (ör. bakıra) değiştirmek de anlamlı bir kazanç sağlamaz.</w:t>
+        <w:t xml:space="preserve">’nin altında kalır. Cidar direnci (%0,15) ihmal edilebilir; boru malzemesini (ör. bakıra) değiştirmek anlamlı bir kazanç sağlamaz.</w:t>
       </w:r>
     </w:p>
     <w:p>
@@ -18271,6 +18918,60 @@
           <m:t>=</m:t>
         </m:r>
         <m:r>
+          <m:t>25</m:t>
+        </m:r>
+        <m:r>
+          <m:rPr>
+            <m:sty m:val="p"/>
+          </m:rPr>
+          <m:t>,</m:t>
+        </m:r>
+        <m:r>
+          <m:t>8</m:t>
+        </m:r>
+        <m:r>
+          <m:rPr>
+            <m:sty m:val="p"/>
+          </m:rPr>
+          <m:t>×</m:t>
+        </m:r>
+        <m:r>
+          <m:t>0</m:t>
+        </m:r>
+        <m:r>
+          <m:rPr>
+            <m:sty m:val="p"/>
+          </m:rPr>
+          <m:t>,</m:t>
+        </m:r>
+        <m:r>
+          <m:t>2177</m:t>
+        </m:r>
+        <m:r>
+          <m:rPr>
+            <m:sty m:val="p"/>
+          </m:rPr>
+          <m:t>/</m:t>
+        </m:r>
+        <m:r>
+          <m:t>8</m:t>
+        </m:r>
+        <m:r>
+          <m:rPr>
+            <m:sty m:val="p"/>
+          </m:rPr>
+          <m:t>,</m:t>
+        </m:r>
+        <m:r>
+          <m:t>26</m:t>
+        </m:r>
+        <m:r>
+          <m:rPr>
+            <m:sty m:val="p"/>
+          </m:rPr>
+          <m:t>=</m:t>
+        </m:r>
+        <m:r>
           <m:t>0</m:t>
         </m:r>
         <m:r>
@@ -18316,11 +19017,11 @@
           <m:t>≈</m:t>
         </m:r>
         <m:r>
-          <m:t>110</m:t>
+          <m:t>24</m:t>
         </m:r>
       </m:oMath>
       <w:r>
-        <w:t xml:space="preserve">–160 W/m²K değerleri, gaz-sıvı ısı değiştiricileri için literatürdeki tipik aralıkla (10–250 W/m²K [1, Tablo 11.2]) uyumludur. Ancak çift borulu yapı birim hacim başına az alan sunar. Örneğin</w:t>
+        <w:t xml:space="preserve">–28 W/m²K değerleri, gaz-sıvı ısı değiştiricileri için literatürdeki tipik aralığın (10–250 W/m²K [1, Tablo 11.2]) alt kısmındadır. Örneğin</w:t>
       </w:r>
       <w:r>
         <w:t xml:space="preserve"> </w:t>
@@ -18371,6 +19072,55 @@
           <m:rPr>
             <m:sty m:val="p"/>
           </m:rPr>
+          <m:t>=</m:t>
+        </m:r>
+        <m:r>
+          <m:rPr>
+            <m:sty m:val="p"/>
+          </m:rPr>
+          <m:t>−</m:t>
+        </m:r>
+        <m:r>
+          <m:rPr>
+            <m:sty m:val="p"/>
+          </m:rPr>
+          <m:t>ln</m:t>
+        </m:r>
+        <m:d>
+          <m:dPr>
+            <m:begChr m:val="("/>
+            <m:endChr m:val=")"/>
+            <m:sepChr m:val=""/>
+            <m:grow/>
+          </m:dPr>
+          <m:e>
+            <m:r>
+              <m:t>1</m:t>
+            </m:r>
+            <m:r>
+              <m:rPr>
+                <m:sty m:val="p"/>
+              </m:rPr>
+              <m:t>−</m:t>
+            </m:r>
+            <m:r>
+              <m:t>0</m:t>
+            </m:r>
+            <m:r>
+              <m:rPr>
+                <m:sty m:val="p"/>
+              </m:rPr>
+              <m:t>,</m:t>
+            </m:r>
+            <m:r>
+              <m:t>9</m:t>
+            </m:r>
+          </m:e>
+        </m:d>
+        <m:r>
+          <m:rPr>
+            <m:sty m:val="p"/>
+          </m:rPr>
           <m:t>≈</m:t>
         </m:r>
         <m:r>
@@ -18390,7 +19140,7 @@
         <w:t xml:space="preserve"> </w:t>
       </w:r>
       <w:r>
-        <w:t xml:space="preserve">gerekir, bu da yaklaşık 3,4 kat daha uzun bir boru demektir.</w:t>
+        <w:t xml:space="preserve">gerekir; bu da mevcut borudan yaklaşık 3,4 kat uzun, yani ≈ 5,6 m’lik bir ısı değiştirici demektir.</w:t>
       </w:r>
     </w:p>
     <w:p>
@@ -18441,7 +19191,7 @@
         </m:sSub>
       </m:oMath>
       <w:r>
-        <w:t xml:space="preserve">’yi ve alanı artırır.</w:t>
+        <w:t xml:space="preserve">’yi ve alanı artırır. En etkili iyileştirme budur.</w:t>
       </w:r>
     </w:p>
     <w:p>
@@ -18453,7 +19203,86 @@
         <w:pStyle w:val="Compact"/>
       </w:pPr>
       <w:r>
-        <w:t xml:space="preserve">Hava hızı artırılabilir; ancak 50 m/s civarındaki mevcut hız zaten yüksektir ve basınç kaybı ile fan gücü hızla artar.</w:t>
+        <w:t xml:space="preserve">Hava hızı (≈ 7,6 m/s) artırılabilir;</w:t>
+      </w:r>
+      <w:r>
+        <w:t xml:space="preserve"> </w:t>
+      </w:r>
+      <m:oMath>
+        <m:sSub>
+          <m:e>
+            <m:r>
+              <m:t>h</m:t>
+            </m:r>
+          </m:e>
+          <m:sub>
+            <m:r>
+              <m:t>i</m:t>
+            </m:r>
+            <m:r>
+              <m:t>ç</m:t>
+            </m:r>
+          </m:sub>
+        </m:sSub>
+        <m:r>
+          <m:rPr>
+            <m:sty m:val="p"/>
+          </m:rPr>
+          <m:t>∝</m:t>
+        </m:r>
+        <m:r>
+          <m:t>R</m:t>
+        </m:r>
+        <m:sSup>
+          <m:e>
+            <m:r>
+              <m:t>e</m:t>
+            </m:r>
+          </m:e>
+          <m:sup>
+            <m:r>
+              <m:t>0</m:t>
+            </m:r>
+            <m:r>
+              <m:rPr>
+                <m:sty m:val="p"/>
+              </m:rPr>
+              <m:t>,</m:t>
+            </m:r>
+            <m:r>
+              <m:t>8</m:t>
+            </m:r>
+          </m:sup>
+        </m:sSup>
+      </m:oMath>
+      <w:r>
+        <w:t xml:space="preserve"> </w:t>
+      </w:r>
+      <w:r>
+        <w:t xml:space="preserve">olduğundan hava debisini iki katına çıkarmak</w:t>
+      </w:r>
+      <w:r>
+        <w:t xml:space="preserve"> </w:t>
+      </w:r>
+      <m:oMath>
+        <m:sSub>
+          <m:e>
+            <m:r>
+              <m:t>h</m:t>
+            </m:r>
+          </m:e>
+          <m:sub>
+            <m:r>
+              <m:t>i</m:t>
+            </m:r>
+            <m:r>
+              <m:t>ç</m:t>
+            </m:r>
+          </m:sub>
+        </m:sSub>
+      </m:oMath>
+      <w:r>
+        <w:t xml:space="preserve">’yi ~%74 artırır. Bunun bedeli basınç kaybı ve fan gücüdür.</w:t>
       </w:r>
     </w:p>
     <w:p>
@@ -18465,21 +19294,7 @@
         <w:pStyle w:val="Compact"/>
       </w:pPr>
       <w:r>
-        <w:t xml:space="preserve">Daha az su debisi kullanılabilir. Su tarafı zaten kontrol etmediği için bu hem pompa gücünü azaltır hem de su</w:t>
-      </w:r>
-      <w:r>
-        <w:t xml:space="preserve"> </w:t>
-      </w:r>
-      <m:oMath>
-        <m:r>
-          <m:t>Δ</m:t>
-        </m:r>
-        <m:r>
-          <m:t>T</m:t>
-        </m:r>
-      </m:oMath>
-      <w:r>
-        <w:t xml:space="preserve">’sini büyütür; su tarafı ölçüm hassasiyeti artar ve enerji dengesi daha güvenilir kontrol edilir.</w:t>
+        <w:t xml:space="preserve">Su tarafında hız çok düşüktür (≈ 7,7 cm/s). Halka aralığını daraltmak veya su debisini artırmak akışı türbülanslı yapar; ancak su tarafı kontrol etmediği için kazanç sınırlıdır.</w:t>
       </w:r>
     </w:p>
     <w:p>
@@ -18491,6 +19306,32 @@
         <w:pStyle w:val="Compact"/>
       </w:pPr>
       <w:r>
+        <w:t xml:space="preserve">Su debisi azaltılırsa su</w:t>
+      </w:r>
+      <w:r>
+        <w:t xml:space="preserve"> </w:t>
+      </w:r>
+      <m:oMath>
+        <m:r>
+          <m:t>Δ</m:t>
+        </m:r>
+        <m:r>
+          <m:t>T</m:t>
+        </m:r>
+      </m:oMath>
+      <w:r>
+        <w:t xml:space="preserve">’si büyür ve su tarafı ölçüm hassasiyeti artar, enerji dengesi daha güvenilir kontrol edilir.</w:t>
+      </w:r>
+    </w:p>
+    <w:p>
+      <w:pPr>
+        <w:numPr>
+          <w:ilvl w:val="1"/>
+          <w:numId w:val="1010"/>
+        </w:numPr>
+        <w:pStyle w:val="Compact"/>
+      </w:pPr>
+      <w:r>
         <w:t xml:space="preserve">Kovanın dışı yalıtılmalı, ölçümler daha uzun bir dengeye ulaşma süresinden sonra yapılmalıdır.</w:t>
       </w:r>
     </w:p>
@@ -18513,7 +19354,7 @@
         <w:t xml:space="preserve"> </w:t>
       </w:r>
       <w:r>
-        <w:t xml:space="preserve">Mevcut sistem, küçük ısıl yüklerde (yüzlerce W) gazdan sıvıya ısı geri kazanımı veya eğitim amaçlı kullanım için uygundur. Yüksek kapasiteli endüstriyel hava-su uygulamaları için ise kanatlı borulu veya plakalı/gövde-borulu ısı değiştiriciler daha uygundur.</w:t>
+        <w:t xml:space="preserve">Mevcut sistem, küçük ısıl yüklerde (yüzlerce W) gazdan sıvıya ısı geri kazanımı veya eğitim amaçlı kullanım için uygundur. Yüksek kapasiteli endüstriyel hava-su uygulamaları için kanatlı borulu ya da gövde-borulu ısı değiştiriciler daha uygundur.</w:t>
       </w:r>
     </w:p>
     <w:bookmarkEnd w:id="41"/>
@@ -18791,6 +19632,43 @@
               <w:jc w:val="left"/>
             </w:pPr>
             <m:oMath>
+              <m:sSub>
+                <m:e>
+                  <m:r>
+                    <m:t>A</m:t>
+                  </m:r>
+                </m:e>
+                <m:sub>
+                  <m:r>
+                    <m:t>2</m:t>
+                  </m:r>
+                </m:sub>
+              </m:sSub>
+            </m:oMath>
+          </w:p>
+        </w:tc>
+        <w:tc>
+          <w:tcPr/>
+          <w:p>
+            <w:pPr>
+              <w:pStyle w:val="Compact"/>
+              <w:jc w:val="left"/>
+            </w:pPr>
+            <w:r>
+              <w:t xml:space="preserve">0,2177 m²</w:t>
+            </w:r>
+          </w:p>
+        </w:tc>
+      </w:tr>
+      <w:tr>
+        <w:tc>
+          <w:tcPr/>
+          <w:p>
+            <w:pPr>
+              <w:pStyle w:val="Compact"/>
+              <w:jc w:val="left"/>
+            </w:pPr>
+            <m:oMath>
               <m:r>
                 <m:t>R</m:t>
               </m:r>
@@ -18855,7 +19733,7 @@
               <w:jc w:val="left"/>
             </w:pPr>
             <w:r>
-              <w:t xml:space="preserve">36 900 / 6 160</w:t>
+              <w:t xml:space="preserve">14 280 / 2 310</w:t>
             </w:r>
           </w:p>
         </w:tc>
@@ -18933,7 +19811,7 @@
               <w:jc w:val="left"/>
             </w:pPr>
             <w:r>
-              <w:t xml:space="preserve">93,2 / 51,9</w:t>
+              <w:t xml:space="preserve">43,6 / 23,7</w:t>
             </w:r>
           </w:p>
         </w:tc>
@@ -19002,7 +19880,7 @@
               <w:jc w:val="left"/>
             </w:pPr>
             <w:r>
-              <w:t xml:space="preserve">193 / 3158 W/m²K</w:t>
+              <w:t xml:space="preserve">34,9 / 514 W/m²K</w:t>
             </w:r>
           </w:p>
         </w:tc>
@@ -19060,7 +19938,7 @@
               <w:jc w:val="left"/>
             </w:pPr>
             <w:r>
-              <w:t xml:space="preserve">111,6 W/m²K</w:t>
+              <w:t xml:space="preserve">25,8 W/m²K</w:t>
             </w:r>
           </w:p>
         </w:tc>
@@ -19102,6 +19980,12 @@
                 </m:sub>
               </m:sSub>
             </m:oMath>
+            <w:r>
+              <w:t xml:space="preserve"> </w:t>
+            </w:r>
+            <w:r>
+              <w:t xml:space="preserve">(Dittus–Boelter)</w:t>
+            </w:r>
           </w:p>
         </w:tc>
         <w:tc>
@@ -19112,7 +19996,65 @@
               <w:jc w:val="left"/>
             </w:pPr>
             <w:r>
-              <w:t xml:space="preserve">159,9 W/m²K</w:t>
+              <w:t xml:space="preserve">28,4 W/m²K</w:t>
+            </w:r>
+          </w:p>
+        </w:tc>
+      </w:tr>
+      <w:tr>
+        <w:tc>
+          <w:tcPr/>
+          <w:p>
+            <w:pPr>
+              <w:pStyle w:val="Compact"/>
+              <w:jc w:val="left"/>
+            </w:pPr>
+            <m:oMath>
+              <m:sSub>
+                <m:e>
+                  <m:r>
+                    <m:t>U</m:t>
+                  </m:r>
+                </m:e>
+                <m:sub>
+                  <m:r>
+                    <m:t>t</m:t>
+                  </m:r>
+                  <m:r>
+                    <m:t>e</m:t>
+                  </m:r>
+                  <m:r>
+                    <m:t>o</m:t>
+                  </m:r>
+                  <m:r>
+                    <m:t>r</m:t>
+                  </m:r>
+                  <m:r>
+                    <m:t>i</m:t>
+                  </m:r>
+                  <m:r>
+                    <m:t>k</m:t>
+                  </m:r>
+                </m:sub>
+              </m:sSub>
+            </m:oMath>
+            <w:r>
+              <w:t xml:space="preserve"> </w:t>
+            </w:r>
+            <w:r>
+              <w:t xml:space="preserve">(su tarafı laminer)</w:t>
+            </w:r>
+          </w:p>
+        </w:tc>
+        <w:tc>
+          <w:tcPr/>
+          <w:p>
+            <w:pPr>
+              <w:pStyle w:val="Compact"/>
+              <w:jc w:val="left"/>
+            </w:pPr>
+            <w:r>
+              <w:t xml:space="preserve">24,1 W/m²K</w:t>
             </w:r>
           </w:p>
         </w:tc>
@@ -19126,7 +20068,7 @@
               <w:jc w:val="left"/>
             </w:pPr>
             <w:r>
-              <w:t xml:space="preserve">Fark</w:t>
+              <w:t xml:space="preserve">Fark (Dittus–Boelter’e göre)</w:t>
             </w:r>
           </w:p>
         </w:tc>
@@ -19138,7 +20080,7 @@
               <w:jc w:val="left"/>
             </w:pPr>
             <w:r>
-              <w:t xml:space="preserve">%30</w:t>
+              <w:t xml:space="preserve">%9,3</w:t>
             </w:r>
           </w:p>
         </w:tc>
@@ -19189,7 +20131,7 @@
         <w:pStyle w:val="BodyText"/>
       </w:pPr>
       <w:r>
-        <w:t xml:space="preserve">Deneyde hava tarafından 217 W ısı suya aktarılmış, deneysel toplam ısı geçiş katsayısı 112 W/m²K bulunmuştur. Ampirik bağıntılarla hesaplanan teorik değer 160 W/m²K’dir. Aradaki ~%30’luk fark kirlilik direnci, bağıntı belirsizlikleri, su tarafının geçiş rejiminde olması ve ölçüm/kabul belirsizlikleriyle açıklanabilir. Su tarafı ısı hesabındaki büyük sapma, yüksek su debisi nedeniyle çok küçük kalan sıcaklık farkının (2,6 K) ısıl çift hassasiyetine yakın olmasından kaynaklanır. Isı değiştiricinin performansını hava tarafı taşınımı belirlemektedir.</w:t>
+        <w:t xml:space="preserve">Deneyde hava tarafından 217 W ısı suya aktarılmış, deneysel toplam ısı geçiş katsayısı 25,8 W/m²K bulunmuştur. Ampirik bağıntılarla hesaplanan teorik değer 28,4 W/m²K’dir (su tarafı laminer kabul edilirse 24,1 W/m²K). Aradaki ~%9’luk fark; su tarafının türbülanslı değil laminer–geçiş rejiminde olması, bağıntı belirsizlikleri, kirlilik direnci ve ölçüm/kabul belirsizlikleriyle açıklanabilir. Su tarafı ısı hesabındaki büyük sapma, yüksek su debisi nedeniyle çok küçük kalan sıcaklık farkının (2,6 K) ısıl çift hassasiyetine yakın olmasından kaynaklanır. Isı değiştiricinin performansını hava tarafı taşınımı belirlemektedir.</w:t>
       </w:r>
     </w:p>
     <w:bookmarkEnd w:id="43"/>
@@ -19223,7 +20165,7 @@
         <w:t xml:space="preserve"> </w:t>
       </w:r>
       <w:r>
-        <w:t xml:space="preserve">(6th ed.). John Wiley &amp; Sons. Tablo A.1 (çelik), A.4 (hava), A.6 (doymuş su), Denk. 8.60 (Dittus–Boelter), Denk. 8.62 (Gnielinski), Tablo 11.2 (tipik U değerleri).</w:t>
+        <w:t xml:space="preserve">(6th ed.). John Wiley &amp; Sons. Tablo A.1 (çelik), A.4 (hava), A.6 (doymuş su), Denk. 8.60 (Dittus–Boelter), Tablo 8.2 (laminer halkasal akış), Tablo 11.2 (tipik U değerleri).</w:t>
       </w:r>
     </w:p>
     <w:p>

</xml_diff>